<commit_message>
problema 1 subestructura optima
</commit_message>
<xml_diff>
--- a/Examen Parcial No 2.docx
+++ b/Examen Parcial No 2.docx
@@ -3,16 +3,38 @@
 <w:document xmlns:wpc="http://schemas.microsoft.com/office/word/2010/wordprocessingCanvas" xmlns:cx="http://schemas.microsoft.com/office/drawing/2014/chartex" xmlns:cx1="http://schemas.microsoft.com/office/drawing/2015/9/8/chartex" xmlns:cx2="http://schemas.microsoft.com/office/drawing/2015/10/21/chartex" xmlns:cx3="http://schemas.microsoft.com/office/drawing/2016/5/9/chartex" xmlns:cx4="http://schemas.microsoft.com/office/drawing/2016/5/10/chartex" xmlns:cx5="http://schemas.microsoft.com/office/drawing/2016/5/11/chartex" xmlns:cx6="http://schemas.microsoft.com/office/drawing/2016/5/12/chartex" xmlns:cx7="http://schemas.microsoft.com/office/drawing/2016/5/13/chartex" xmlns:cx8="http://schemas.microsoft.com/office/drawing/2016/5/14/chartex" xmlns:mc="http://schemas.openxmlformats.org/markup-compatibility/2006" xmlns:aink="http://schemas.microsoft.com/office/drawing/2016/ink" xmlns:am3d="http://schemas.microsoft.com/office/drawing/2017/model3d" xmlns:o="urn:schemas-microsoft-com:office:office" xmlns:oel="http://schemas.microsoft.com/office/2019/extlst" xmlns:r="http://schemas.openxmlformats.org/officeDocument/2006/relationships" xmlns:m="http://schemas.openxmlformats.org/officeDocument/2006/math" xmlns:v="urn:schemas-microsoft-com:vml" xmlns:wp14="http://schemas.microsoft.com/office/word/2010/wordprocessingDrawing" xmlns:wp="http://schemas.openxmlformats.org/drawingml/2006/wordprocessingDrawing" xmlns:w10="urn:schemas-microsoft-com:office:word" xmlns:w="http://schemas.openxmlformats.org/wordprocessingml/2006/main" xmlns:w14="http://schemas.microsoft.com/office/word/2010/wordml" xmlns:w15="http://schemas.microsoft.com/office/word/2012/wordml" xmlns:w16cex="http://schemas.microsoft.com/office/word/2018/wordml/cex" xmlns:w16cid="http://schemas.microsoft.com/office/word/2016/wordml/cid" xmlns:w16="http://schemas.microsoft.com/office/word/2018/wordml" xmlns:w16du="http://schemas.microsoft.com/office/word/2023/wordml/word16du" xmlns:w16sdtdh="http://schemas.microsoft.com/office/word/2020/wordml/sdtdatahash" xmlns:w16sdtfl="http://schemas.microsoft.com/office/word/2024/wordml/sdtformatlock" xmlns:w16se="http://schemas.microsoft.com/office/word/2015/wordml/symex" xmlns:wpg="http://schemas.microsoft.com/office/word/2010/wordprocessingGroup" xmlns:wpi="http://schemas.microsoft.com/office/word/2010/wordprocessingInk" xmlns:wne="http://schemas.microsoft.com/office/word/2006/wordml" xmlns:wps="http://schemas.microsoft.com/office/word/2010/wordprocessingShape" mc:Ignorable="w14 w15 w16se w16cid w16 w16cex w16sdtdh w16sdtfl w16du wp14">
   <w:body>
     <w:p>
-      <w:r>
+      <w:pPr>
+        <w:rPr>
+          <w:rFonts w:ascii="Arial" w:hAnsi="Arial" w:cs="Arial"/>
+        </w:rPr>
+      </w:pPr>
+      <w:r>
+        <w:rPr>
+          <w:rFonts w:ascii="Arial" w:hAnsi="Arial" w:cs="Arial"/>
+        </w:rPr>
         <w:t>[M4] Examen Parcial No. 2</w:t>
       </w:r>
     </w:p>
     <w:p>
-      <w:r>
+      <w:pPr>
+        <w:rPr>
+          <w:rFonts w:ascii="Arial" w:hAnsi="Arial" w:cs="Arial"/>
+        </w:rPr>
+      </w:pPr>
+      <w:r>
+        <w:rPr>
+          <w:rFonts w:ascii="Arial" w:hAnsi="Arial" w:cs="Arial"/>
+        </w:rPr>
         <w:t>Marlon Hernández 15177</w:t>
       </w:r>
     </w:p>
-    <w:p/>
+    <w:p>
+      <w:pPr>
+        <w:rPr>
+          <w:rFonts w:ascii="Arial" w:hAnsi="Arial" w:cs="Arial"/>
+        </w:rPr>
+      </w:pPr>
+    </w:p>
     <w:p>
       <w:pPr>
         <w:pStyle w:val="ListParagraph"/>
@@ -22,11 +44,13 @@
         </w:numPr>
         <w:jc w:val="both"/>
         <w:rPr>
-          <w:lang w:val="es-US"/>
-        </w:rPr>
-      </w:pPr>
-      <w:r>
-        <w:rPr>
+          <w:rFonts w:ascii="Arial" w:hAnsi="Arial" w:cs="Arial"/>
+          <w:lang w:val="es-US"/>
+        </w:rPr>
+      </w:pPr>
+      <w:r>
+        <w:rPr>
+          <w:rFonts w:ascii="Arial" w:hAnsi="Arial" w:cs="Arial"/>
           <w:lang w:val="es-US"/>
         </w:rPr>
         <w:t xml:space="preserve">[30 puntos] Considere el problema de “hacer sencillo”: dado un monto </w:t>
@@ -40,54 +64,1087 @@
       </w:r>
       <w:r>
         <w:rPr>
+          <w:rFonts w:ascii="Arial" w:hAnsi="Arial" w:cs="Arial"/>
           <w:lang w:val="es-US"/>
         </w:rPr>
         <w:t>, buscamos alcanzar dicho</w:t>
       </w:r>
       <w:r>
         <w:rPr>
+          <w:rFonts w:ascii="Arial" w:hAnsi="Arial" w:cs="Arial"/>
           <w:lang w:val="es-US"/>
         </w:rPr>
         <w:t xml:space="preserve"> </w:t>
       </w:r>
       <w:r>
         <w:rPr>
+          <w:rFonts w:ascii="Arial" w:hAnsi="Arial" w:cs="Arial"/>
           <w:lang w:val="es-US"/>
         </w:rPr>
         <w:t>monto con la menor cantidad de monedas posible. Las monedas tienen las siguientes</w:t>
       </w:r>
       <w:r>
         <w:rPr>
+          <w:rFonts w:ascii="Arial" w:hAnsi="Arial" w:cs="Arial"/>
           <w:lang w:val="es-US"/>
         </w:rPr>
         <w:t xml:space="preserve"> </w:t>
       </w:r>
       <w:r>
         <w:rPr>
+          <w:rFonts w:ascii="Arial" w:hAnsi="Arial" w:cs="Arial"/>
           <w:lang w:val="es-US"/>
         </w:rPr>
         <w:t>denominaciones: {1,5,10,25}. Podemos tomar todas las monedas que necesitemos de cada</w:t>
       </w:r>
       <w:r>
         <w:rPr>
+          <w:rFonts w:ascii="Arial" w:hAnsi="Arial" w:cs="Arial"/>
           <w:lang w:val="es-US"/>
         </w:rPr>
         <w:t xml:space="preserve"> </w:t>
       </w:r>
       <w:r>
         <w:rPr>
+          <w:rFonts w:ascii="Arial" w:hAnsi="Arial" w:cs="Arial"/>
           <w:lang w:val="es-US"/>
         </w:rPr>
         <w:t>denominación.</w:t>
       </w:r>
-    </w:p>
-    <w:p>
-      <w:pPr>
-        <w:jc w:val="both"/>
-        <w:rPr>
-          <w:lang w:val="es-US"/>
-        </w:rPr>
-      </w:pPr>
+      <w:r>
+        <w:rPr>
+          <w:rFonts w:ascii="Arial" w:hAnsi="Arial" w:cs="Arial"/>
+          <w:lang w:val="es-US"/>
+        </w:rPr>
+        <w:br/>
+      </w:r>
+      <w:r>
+        <w:rPr>
+          <w:rFonts w:ascii="Arial" w:hAnsi="Arial" w:cs="Arial"/>
+          <w:lang w:val="es-US"/>
+        </w:rPr>
+        <w:br/>
+        <w:t>Propiedades:</w:t>
+      </w:r>
+    </w:p>
+    <w:p>
+      <w:pPr>
+        <w:pStyle w:val="ListParagraph"/>
+        <w:numPr>
+          <w:ilvl w:val="1"/>
+          <w:numId w:val="1"/>
+        </w:numPr>
+        <w:jc w:val="both"/>
+        <w:rPr>
+          <w:rFonts w:ascii="Arial" w:hAnsi="Arial" w:cs="Arial"/>
+          <w:lang w:val="es-US"/>
+        </w:rPr>
+      </w:pPr>
+      <w:r>
+        <w:rPr>
+          <w:rFonts w:ascii="Arial" w:hAnsi="Arial" w:cs="Arial"/>
+          <w:lang w:val="es-US"/>
+        </w:rPr>
+        <w:t>Subestructura óptima</w:t>
+      </w:r>
+    </w:p>
+    <w:p>
+      <w:pPr>
+        <w:pStyle w:val="ListParagraph"/>
+        <w:numPr>
+          <w:ilvl w:val="1"/>
+          <w:numId w:val="1"/>
+        </w:numPr>
+        <w:jc w:val="both"/>
+        <w:rPr>
+          <w:rFonts w:ascii="Arial" w:hAnsi="Arial" w:cs="Arial"/>
+          <w:lang w:val="es-US"/>
+        </w:rPr>
+      </w:pPr>
+      <w:r>
+        <w:rPr>
+          <w:rFonts w:ascii="Arial" w:hAnsi="Arial" w:cs="Arial"/>
+          <w:lang w:val="es-US"/>
+        </w:rPr>
+        <w:t>Subproblemas traslapados</w:t>
+      </w:r>
+    </w:p>
+    <w:p>
+      <w:pPr>
+        <w:pStyle w:val="ListParagraph"/>
+        <w:numPr>
+          <w:ilvl w:val="1"/>
+          <w:numId w:val="1"/>
+        </w:numPr>
+        <w:jc w:val="both"/>
+        <w:rPr>
+          <w:rFonts w:ascii="Arial" w:hAnsi="Arial" w:cs="Arial"/>
+          <w:lang w:val="es-US"/>
+        </w:rPr>
+      </w:pPr>
+      <w:r>
+        <w:rPr>
+          <w:rFonts w:ascii="Arial" w:hAnsi="Arial" w:cs="Arial"/>
+          <w:lang w:val="es-US"/>
+        </w:rPr>
+        <w:t>Greedy-</w:t>
+      </w:r>
+      <w:proofErr w:type="spellStart"/>
+      <w:r>
+        <w:rPr>
+          <w:rFonts w:ascii="Arial" w:hAnsi="Arial" w:cs="Arial"/>
+          <w:lang w:val="es-US"/>
+        </w:rPr>
+        <w:t>choice</w:t>
+      </w:r>
+      <w:proofErr w:type="spellEnd"/>
+      <w:r>
+        <w:rPr>
+          <w:rFonts w:ascii="Arial" w:hAnsi="Arial" w:cs="Arial"/>
+          <w:lang w:val="es-US"/>
+        </w:rPr>
+        <w:t xml:space="preserve"> </w:t>
+      </w:r>
+      <w:proofErr w:type="spellStart"/>
+      <w:r>
+        <w:rPr>
+          <w:rFonts w:ascii="Arial" w:hAnsi="Arial" w:cs="Arial"/>
+          <w:lang w:val="es-US"/>
+        </w:rPr>
+        <w:t>property</w:t>
+      </w:r>
+      <w:proofErr w:type="spellEnd"/>
+    </w:p>
+    <w:p>
+      <w:pPr>
+        <w:pStyle w:val="ListParagraph"/>
+        <w:jc w:val="both"/>
+        <w:rPr>
+          <w:rFonts w:ascii="Arial" w:hAnsi="Arial" w:cs="Arial"/>
+          <w:lang w:val="es-US"/>
+        </w:rPr>
+      </w:pPr>
+    </w:p>
+    <w:p>
+      <w:pPr>
+        <w:pStyle w:val="ListParagraph"/>
+        <w:jc w:val="both"/>
+        <w:rPr>
+          <w:rFonts w:ascii="Arial" w:hAnsi="Arial" w:cs="Arial"/>
+          <w:lang w:val="es-US"/>
+        </w:rPr>
+      </w:pPr>
+      <w:r>
+        <w:rPr>
+          <w:rFonts w:ascii="Arial" w:hAnsi="Arial" w:cs="Arial"/>
+          <w:lang w:val="es-US"/>
+        </w:rPr>
+        <w:t>Subestructura óptima:</w:t>
+      </w:r>
+    </w:p>
+    <w:p>
+      <w:pPr>
+        <w:pStyle w:val="ListParagraph"/>
+        <w:jc w:val="both"/>
+        <w:rPr>
+          <w:rFonts w:ascii="Arial" w:hAnsi="Arial" w:cs="Arial"/>
+        </w:rPr>
+      </w:pPr>
+      <w:r>
+        <w:rPr>
+          <w:rFonts w:ascii="Arial" w:hAnsi="Arial" w:cs="Arial"/>
+          <w:i/>
+        </w:rPr>
+        <w:br/>
+      </w:r>
+      <w:r>
+        <w:rPr>
+          <w:rFonts w:ascii="Arial" w:hAnsi="Arial" w:cs="Arial"/>
+        </w:rPr>
+        <w:t>Sea C(</w:t>
+      </w:r>
+      <w:r>
+        <w:rPr>
+          <w:rFonts w:ascii="Cambria Math" w:hAnsi="Cambria Math" w:cs="Cambria Math"/>
+          <w:lang w:val="es-US"/>
+        </w:rPr>
+        <w:t>𝑚</w:t>
+      </w:r>
+      <w:r>
+        <w:rPr>
+          <w:rFonts w:ascii="Arial" w:hAnsi="Arial" w:cs="Arial"/>
+        </w:rPr>
+        <w:t xml:space="preserve">) la cantidad mínima de monedas necesarias para formar el monto </w:t>
+      </w:r>
+      <w:r>
+        <w:rPr>
+          <w:rFonts w:ascii="Cambria Math" w:hAnsi="Cambria Math" w:cs="Cambria Math"/>
+          <w:lang w:val="es-US"/>
+        </w:rPr>
+        <w:t>𝑚</w:t>
+      </w:r>
+      <w:r>
+        <w:rPr>
+          <w:rFonts w:ascii="Arial" w:hAnsi="Arial" w:cs="Arial"/>
+        </w:rPr>
+        <w:t>.</w:t>
+      </w:r>
+    </w:p>
+    <w:p>
+      <w:pPr>
+        <w:pStyle w:val="ListParagraph"/>
+        <w:jc w:val="both"/>
+        <w:rPr>
+          <w:rFonts w:ascii="Arial" w:hAnsi="Arial" w:cs="Arial"/>
+          <w:lang w:val="es-US"/>
+        </w:rPr>
+      </w:pPr>
+    </w:p>
+    <w:p>
+      <w:pPr>
+        <w:pStyle w:val="ListParagraph"/>
+        <w:jc w:val="both"/>
+        <w:rPr>
+          <w:rFonts w:ascii="Arial" w:hAnsi="Arial" w:cs="Arial"/>
+        </w:rPr>
+      </w:pPr>
+      <w:r>
+        <w:rPr>
+          <w:rFonts w:ascii="Arial" w:hAnsi="Arial" w:cs="Arial"/>
+        </w:rPr>
+        <w:t>Decisión</w:t>
+      </w:r>
+      <w:r>
+        <w:rPr>
+          <w:rFonts w:ascii="Arial" w:hAnsi="Arial" w:cs="Arial"/>
+        </w:rPr>
+        <w:t>:</w:t>
+      </w:r>
+      <w:r>
+        <w:rPr>
+          <w:rFonts w:ascii="Arial" w:hAnsi="Arial" w:cs="Arial"/>
+        </w:rPr>
+        <w:br/>
+        <w:t xml:space="preserve">En cada paso decidimos qué moneda usar primero. Si el monto actual es </w:t>
+      </w:r>
+      <w:r>
+        <w:rPr>
+          <w:rFonts w:ascii="Cambria Math" w:hAnsi="Cambria Math" w:cs="Cambria Math"/>
+          <w:lang w:val="es-US"/>
+        </w:rPr>
+        <w:t>𝑚</w:t>
+      </w:r>
+      <w:r>
+        <w:rPr>
+          <w:rFonts w:ascii="Arial" w:hAnsi="Arial" w:cs="Arial"/>
+        </w:rPr>
+        <w:t xml:space="preserve">, las decisiones posibles son tomar una moneda </w:t>
+      </w:r>
+      <m:oMath>
+        <m:r>
+          <w:rPr>
+            <w:rFonts w:ascii="Cambria Math" w:hAnsi="Cambria Math" w:cs="Arial"/>
+          </w:rPr>
+          <m:t>d</m:t>
+        </m:r>
+      </m:oMath>
+      <w:r>
+        <w:rPr>
+          <w:rFonts w:ascii="Arial" w:hAnsi="Arial" w:cs="Arial"/>
+        </w:rPr>
+        <w:t>, donde:</w:t>
+      </w:r>
+    </w:p>
+    <w:p>
+      <w:pPr>
+        <w:pStyle w:val="ListParagraph"/>
+        <w:jc w:val="both"/>
+        <w:rPr>
+          <w:rFonts w:ascii="Arial" w:eastAsiaTheme="minorEastAsia" w:hAnsi="Arial" w:cs="Arial"/>
+        </w:rPr>
+      </w:pPr>
+    </w:p>
+    <w:p>
+      <w:pPr>
+        <w:pStyle w:val="ListParagraph"/>
+        <w:jc w:val="both"/>
+        <w:rPr>
+          <w:rFonts w:ascii="Arial" w:hAnsi="Arial" w:cs="Arial"/>
+        </w:rPr>
+      </w:pPr>
+      <m:oMathPara>
+        <m:oMath>
+          <m:r>
+            <w:rPr>
+              <w:rFonts w:ascii="Cambria Math" w:hAnsi="Cambria Math" w:cs="Arial"/>
+            </w:rPr>
+            <m:t>d∈{1,5,10,25}</m:t>
+          </m:r>
+          <m:r>
+            <w:rPr>
+              <w:rFonts w:ascii="Arial" w:hAnsi="Arial" w:cs="Arial"/>
+              <w:i/>
+            </w:rPr>
+            <w:br/>
+          </m:r>
+        </m:oMath>
+      </m:oMathPara>
+    </w:p>
+    <w:p>
+      <w:pPr>
+        <w:pStyle w:val="ListParagraph"/>
+        <w:jc w:val="both"/>
+        <w:rPr>
+          <w:rFonts w:ascii="Arial" w:hAnsi="Arial" w:cs="Arial"/>
+        </w:rPr>
+      </w:pPr>
+      <w:r>
+        <w:rPr>
+          <w:rFonts w:ascii="Arial" w:hAnsi="Arial" w:cs="Arial"/>
+        </w:rPr>
+        <w:t xml:space="preserve">y además </w:t>
+      </w:r>
+      <m:oMath>
+        <m:r>
+          <w:rPr>
+            <w:rFonts w:ascii="Cambria Math" w:hAnsi="Cambria Math" w:cs="Arial"/>
+          </w:rPr>
+          <m:t>d</m:t>
+        </m:r>
+      </m:oMath>
+      <w:r>
+        <w:rPr>
+          <w:rFonts w:ascii="Arial" w:hAnsi="Arial" w:cs="Arial"/>
+        </w:rPr>
+        <w:t xml:space="preserve"> ≤ </w:t>
+      </w:r>
+      <w:r>
+        <w:rPr>
+          <w:rFonts w:ascii="Cambria Math" w:hAnsi="Cambria Math" w:cs="Cambria Math"/>
+          <w:lang w:val="es-US"/>
+        </w:rPr>
+        <w:t>𝑚</w:t>
+      </w:r>
+      <w:r>
+        <w:rPr>
+          <w:rFonts w:ascii="Arial" w:hAnsi="Arial" w:cs="Arial"/>
+        </w:rPr>
+        <w:t>.</w:t>
+      </w:r>
+    </w:p>
+    <w:p>
+      <w:pPr>
+        <w:pStyle w:val="ListParagraph"/>
+        <w:jc w:val="both"/>
+        <w:rPr>
+          <w:rFonts w:ascii="Arial" w:hAnsi="Arial" w:cs="Arial"/>
+        </w:rPr>
+      </w:pPr>
+    </w:p>
+    <w:p>
+      <w:pPr>
+        <w:pStyle w:val="ListParagraph"/>
+        <w:jc w:val="both"/>
+        <w:rPr>
+          <w:rFonts w:ascii="Arial" w:hAnsi="Arial" w:cs="Arial"/>
+        </w:rPr>
+      </w:pPr>
+      <w:r>
+        <w:rPr>
+          <w:rFonts w:ascii="Arial" w:hAnsi="Arial" w:cs="Arial"/>
+        </w:rPr>
+        <w:t>Subproblema generado</w:t>
+      </w:r>
+      <w:r>
+        <w:rPr>
+          <w:rFonts w:ascii="Arial" w:hAnsi="Arial" w:cs="Arial"/>
+        </w:rPr>
+        <w:t>:</w:t>
+      </w:r>
+      <w:r>
+        <w:rPr>
+          <w:rFonts w:ascii="Arial" w:hAnsi="Arial" w:cs="Arial"/>
+        </w:rPr>
+        <w:tab/>
+      </w:r>
+      <w:r>
+        <w:rPr>
+          <w:rFonts w:ascii="Arial" w:hAnsi="Arial" w:cs="Arial"/>
+        </w:rPr>
+        <w:br/>
+        <w:t xml:space="preserve">Después de tomar una moneda de valor </w:t>
+      </w:r>
+      <m:oMath>
+        <m:r>
+          <w:rPr>
+            <w:rFonts w:ascii="Cambria Math" w:hAnsi="Cambria Math" w:cs="Arial"/>
+          </w:rPr>
+          <m:t>d</m:t>
+        </m:r>
+      </m:oMath>
+      <w:r>
+        <w:rPr>
+          <w:rFonts w:ascii="Arial" w:hAnsi="Arial" w:cs="Arial"/>
+        </w:rPr>
+        <w:t xml:space="preserve">, </w:t>
+      </w:r>
+      <w:r>
+        <w:rPr>
+          <w:rFonts w:ascii="Arial" w:hAnsi="Arial" w:cs="Arial"/>
+        </w:rPr>
+        <w:t>hay que completar el monto restante</w:t>
+      </w:r>
+      <w:r>
+        <w:rPr>
+          <w:rFonts w:ascii="Arial" w:hAnsi="Arial" w:cs="Arial"/>
+        </w:rPr>
+        <w:t>:</w:t>
+      </w:r>
+    </w:p>
+    <w:p>
+      <w:pPr>
+        <w:pStyle w:val="ListParagraph"/>
+        <w:jc w:val="both"/>
+        <w:rPr>
+          <w:rFonts w:ascii="Arial" w:hAnsi="Arial" w:cs="Arial"/>
+        </w:rPr>
+      </w:pPr>
+      <m:oMathPara>
+        <m:oMath>
+          <m:r>
+            <w:rPr>
+              <w:rFonts w:ascii="Cambria Math" w:hAnsi="Cambria Math" w:cs="Arial"/>
+            </w:rPr>
+            <m:t>m-d</m:t>
+          </m:r>
+          <m:r>
+            <w:rPr>
+              <w:rFonts w:ascii="Arial" w:hAnsi="Arial" w:cs="Arial"/>
+              <w:i/>
+            </w:rPr>
+            <w:br/>
+          </m:r>
+        </m:oMath>
+      </m:oMathPara>
+    </w:p>
+    <w:p>
+      <w:pPr>
+        <w:pStyle w:val="ListParagraph"/>
+        <w:jc w:val="both"/>
+        <w:rPr>
+          <w:rFonts w:ascii="Arial" w:hAnsi="Arial" w:cs="Arial"/>
+        </w:rPr>
+      </w:pPr>
+      <w:r>
+        <w:rPr>
+          <w:rFonts w:ascii="Arial" w:hAnsi="Arial" w:cs="Arial"/>
+        </w:rPr>
+        <w:t>Por tanto, el problema se reduce a encontrar la menor cantidad de monedas para el monto restante.</w:t>
+      </w:r>
+    </w:p>
+    <w:p>
+      <w:pPr>
+        <w:pStyle w:val="ListParagraph"/>
+        <w:jc w:val="both"/>
+        <w:rPr>
+          <w:rFonts w:ascii="Arial" w:hAnsi="Arial" w:cs="Arial"/>
+        </w:rPr>
+      </w:pPr>
+    </w:p>
+    <w:p>
+      <w:pPr>
+        <w:pStyle w:val="ListParagraph"/>
+        <w:jc w:val="both"/>
+        <w:rPr>
+          <w:rFonts w:ascii="Arial" w:hAnsi="Arial" w:cs="Arial"/>
+        </w:rPr>
+      </w:pPr>
+      <w:r>
+        <w:rPr>
+          <w:rFonts w:ascii="Arial" w:hAnsi="Arial" w:cs="Arial"/>
+        </w:rPr>
+        <w:t>Necesaria optimalidad</w:t>
+      </w:r>
+      <w:r>
+        <w:rPr>
+          <w:rFonts w:ascii="Arial" w:hAnsi="Arial" w:cs="Arial"/>
+        </w:rPr>
+        <w:t>:</w:t>
+      </w:r>
+      <w:r>
+        <w:rPr>
+          <w:rFonts w:ascii="Arial" w:hAnsi="Arial" w:cs="Arial"/>
+        </w:rPr>
+        <w:tab/>
+      </w:r>
+      <w:r>
+        <w:rPr>
+          <w:rFonts w:ascii="Arial" w:hAnsi="Arial" w:cs="Arial"/>
+        </w:rPr>
+        <w:br/>
+      </w:r>
+      <w:r>
+        <w:rPr>
+          <w:rFonts w:ascii="Arial" w:hAnsi="Arial" w:cs="Arial"/>
+        </w:rPr>
+        <w:t>U</w:t>
+      </w:r>
+      <w:r>
+        <w:rPr>
+          <w:rFonts w:ascii="Arial" w:hAnsi="Arial" w:cs="Arial"/>
+        </w:rPr>
+        <w:t xml:space="preserve">na solución óptima para </w:t>
+      </w:r>
+      <m:oMath>
+        <m:r>
+          <w:rPr>
+            <w:rFonts w:ascii="Cambria Math" w:hAnsi="Cambria Math" w:cs="Arial"/>
+          </w:rPr>
+          <m:t>m</m:t>
+        </m:r>
+      </m:oMath>
+      <w:r>
+        <w:rPr>
+          <w:rFonts w:ascii="Arial" w:hAnsi="Arial" w:cs="Arial"/>
+        </w:rPr>
+        <w:t xml:space="preserve"> usa primero una moneda </w:t>
+      </w:r>
+      <m:oMath>
+        <m:r>
+          <w:rPr>
+            <w:rFonts w:ascii="Cambria Math" w:hAnsi="Cambria Math" w:cs="Arial"/>
+          </w:rPr>
+          <m:t>d</m:t>
+        </m:r>
+      </m:oMath>
+      <w:r>
+        <w:rPr>
+          <w:rFonts w:ascii="Arial" w:hAnsi="Arial" w:cs="Arial"/>
+        </w:rPr>
+        <w:t xml:space="preserve">. Entonces el resto de la solución debe formar </w:t>
+      </w:r>
+      <m:oMath>
+        <m:r>
+          <w:rPr>
+            <w:rFonts w:ascii="Cambria Math" w:hAnsi="Cambria Math" w:cs="Arial"/>
+          </w:rPr>
+          <m:t>m-d</m:t>
+        </m:r>
+      </m:oMath>
+      <w:r>
+        <w:rPr>
+          <w:rFonts w:ascii="Arial" w:eastAsiaTheme="minorEastAsia" w:hAnsi="Arial" w:cs="Arial"/>
+        </w:rPr>
+        <w:t>.</w:t>
+      </w:r>
+      <w:r>
+        <w:rPr>
+          <w:rFonts w:ascii="Arial" w:eastAsiaTheme="minorEastAsia" w:hAnsi="Arial" w:cs="Arial"/>
+        </w:rPr>
+        <w:tab/>
+      </w:r>
+      <w:r>
+        <w:rPr>
+          <w:rFonts w:ascii="Arial" w:hAnsi="Arial" w:cs="Arial"/>
+          <w:i/>
+        </w:rPr>
+        <w:br/>
+      </w:r>
+    </w:p>
+    <w:p>
+      <w:pPr>
+        <w:pStyle w:val="ListParagraph"/>
+        <w:jc w:val="both"/>
+        <w:rPr>
+          <w:rFonts w:ascii="Arial" w:hAnsi="Arial" w:cs="Arial"/>
+        </w:rPr>
+      </w:pPr>
+      <w:r>
+        <w:rPr>
+          <w:rFonts w:ascii="Arial" w:hAnsi="Arial" w:cs="Arial"/>
+        </w:rPr>
+        <w:lastRenderedPageBreak/>
+        <w:t>P</w:t>
+      </w:r>
+      <w:r>
+        <w:rPr>
+          <w:rFonts w:ascii="Arial" w:hAnsi="Arial" w:cs="Arial"/>
+        </w:rPr>
+        <w:t xml:space="preserve">ara buscar contradicción, que el conjunto de monedas usado para formar </w:t>
+      </w:r>
+      <m:oMath>
+        <m:r>
+          <w:rPr>
+            <w:rFonts w:ascii="Cambria Math" w:hAnsi="Cambria Math" w:cs="Arial"/>
+          </w:rPr>
+          <m:t>m-d</m:t>
+        </m:r>
+      </m:oMath>
+      <w:r>
+        <w:rPr>
+          <w:rFonts w:ascii="Arial" w:eastAsiaTheme="minorEastAsia" w:hAnsi="Arial" w:cs="Arial"/>
+        </w:rPr>
+        <w:t xml:space="preserve"> </w:t>
+      </w:r>
+      <w:r>
+        <w:rPr>
+          <w:rFonts w:ascii="Arial" w:hAnsi="Arial" w:cs="Arial"/>
+        </w:rPr>
+        <w:t>no es óptimo</w:t>
+      </w:r>
+      <w:r>
+        <w:rPr>
+          <w:rFonts w:ascii="Arial" w:hAnsi="Arial" w:cs="Arial"/>
+        </w:rPr>
+        <w:t>,</w:t>
+      </w:r>
+      <w:r>
+        <w:rPr>
+          <w:rFonts w:ascii="Arial" w:hAnsi="Arial" w:cs="Arial"/>
+        </w:rPr>
+        <w:t xml:space="preserve"> </w:t>
+      </w:r>
+      <w:r>
+        <w:rPr>
+          <w:rFonts w:ascii="Arial" w:hAnsi="Arial" w:cs="Arial"/>
+        </w:rPr>
+        <w:t xml:space="preserve">debe de existir </w:t>
+      </w:r>
+      <w:r>
+        <w:rPr>
+          <w:rFonts w:ascii="Arial" w:hAnsi="Arial" w:cs="Arial"/>
+        </w:rPr>
+        <w:t xml:space="preserve">otra forma de formar </w:t>
+      </w:r>
+      <m:oMath>
+        <m:r>
+          <w:rPr>
+            <w:rFonts w:ascii="Cambria Math" w:hAnsi="Cambria Math" w:cs="Arial"/>
+          </w:rPr>
+          <m:t>m-d</m:t>
+        </m:r>
+      </m:oMath>
+      <w:r>
+        <w:rPr>
+          <w:rFonts w:ascii="Arial" w:hAnsi="Arial" w:cs="Arial"/>
+        </w:rPr>
+        <w:t xml:space="preserve"> usando menos monedas.</w:t>
+      </w:r>
+    </w:p>
+    <w:p>
+      <w:pPr>
+        <w:pStyle w:val="ListParagraph"/>
+        <w:jc w:val="both"/>
+        <w:rPr>
+          <w:rFonts w:ascii="Arial" w:hAnsi="Arial" w:cs="Arial"/>
+        </w:rPr>
+      </w:pPr>
+    </w:p>
+    <w:p>
+      <w:pPr>
+        <w:pStyle w:val="ListParagraph"/>
+        <w:jc w:val="both"/>
+        <w:rPr>
+          <w:rFonts w:ascii="Arial" w:hAnsi="Arial" w:cs="Arial"/>
+        </w:rPr>
+      </w:pPr>
+      <w:r>
+        <w:rPr>
+          <w:rFonts w:ascii="Arial" w:hAnsi="Arial" w:cs="Arial"/>
+        </w:rPr>
+        <w:t xml:space="preserve">Al probar la </w:t>
+      </w:r>
+      <w:r>
+        <w:rPr>
+          <w:rFonts w:ascii="Arial" w:hAnsi="Arial" w:cs="Arial"/>
+        </w:rPr>
+        <w:t xml:space="preserve">misma moneda inicial </w:t>
+      </w:r>
+      <m:oMath>
+        <m:r>
+          <w:rPr>
+            <w:rFonts w:ascii="Cambria Math" w:hAnsi="Cambria Math" w:cs="Arial"/>
+          </w:rPr>
+          <m:t>d</m:t>
+        </m:r>
+      </m:oMath>
+      <w:r>
+        <w:rPr>
+          <w:rFonts w:ascii="Arial" w:hAnsi="Arial" w:cs="Arial"/>
+        </w:rPr>
+        <w:t xml:space="preserve">, pero </w:t>
+      </w:r>
+      <w:r>
+        <w:rPr>
+          <w:rFonts w:ascii="Arial" w:hAnsi="Arial" w:cs="Arial"/>
+        </w:rPr>
+        <w:t xml:space="preserve">reemplazando </w:t>
+      </w:r>
+      <w:r>
+        <w:rPr>
+          <w:rFonts w:ascii="Arial" w:hAnsi="Arial" w:cs="Arial"/>
+        </w:rPr>
+        <w:t xml:space="preserve">la solución subóptima de </w:t>
+      </w:r>
+      <m:oMath>
+        <m:r>
+          <w:rPr>
+            <w:rFonts w:ascii="Cambria Math" w:hAnsi="Cambria Math" w:cs="Arial"/>
+          </w:rPr>
+          <m:t>m-d</m:t>
+        </m:r>
+      </m:oMath>
+      <w:r>
+        <w:rPr>
+          <w:rFonts w:ascii="Arial" w:hAnsi="Arial" w:cs="Arial"/>
+        </w:rPr>
+        <w:t xml:space="preserve"> por la mejor solución de </w:t>
+      </w:r>
+      <m:oMath>
+        <m:r>
+          <w:rPr>
+            <w:rFonts w:ascii="Cambria Math" w:hAnsi="Cambria Math" w:cs="Arial"/>
+          </w:rPr>
+          <m:t>m-d</m:t>
+        </m:r>
+      </m:oMath>
+      <w:r>
+        <w:rPr>
+          <w:rFonts w:ascii="Arial" w:hAnsi="Arial" w:cs="Arial"/>
+        </w:rPr>
+        <w:t xml:space="preserve">. </w:t>
+      </w:r>
+    </w:p>
+    <w:p>
+      <w:pPr>
+        <w:pStyle w:val="ListParagraph"/>
+        <w:jc w:val="both"/>
+        <w:rPr>
+          <w:rFonts w:ascii="Arial" w:hAnsi="Arial" w:cs="Arial"/>
+        </w:rPr>
+      </w:pPr>
+    </w:p>
+    <w:p>
+      <w:pPr>
+        <w:pStyle w:val="ListParagraph"/>
+        <w:jc w:val="both"/>
+        <w:rPr>
+          <w:rFonts w:ascii="Arial" w:hAnsi="Arial" w:cs="Arial"/>
+        </w:rPr>
+      </w:pPr>
+      <w:r>
+        <w:rPr>
+          <w:rFonts w:ascii="Arial" w:hAnsi="Arial" w:cs="Arial"/>
+        </w:rPr>
+        <w:t xml:space="preserve">El resultado sería una solución para </w:t>
+      </w:r>
+      <m:oMath>
+        <m:r>
+          <w:rPr>
+            <w:rFonts w:ascii="Cambria Math" w:hAnsi="Cambria Math" w:cs="Arial"/>
+          </w:rPr>
+          <m:t>m</m:t>
+        </m:r>
+      </m:oMath>
+      <w:r>
+        <w:rPr>
+          <w:rFonts w:ascii="Arial" w:hAnsi="Arial" w:cs="Arial"/>
+        </w:rPr>
+        <w:t xml:space="preserve"> con menos monedas que la supuesta solución óptima.</w:t>
+      </w:r>
+    </w:p>
+    <w:p>
+      <w:pPr>
+        <w:pStyle w:val="ListParagraph"/>
+        <w:jc w:val="both"/>
+        <w:rPr>
+          <w:rFonts w:ascii="Arial" w:hAnsi="Arial" w:cs="Arial"/>
+        </w:rPr>
+      </w:pPr>
+    </w:p>
+    <w:p>
+      <w:pPr>
+        <w:pStyle w:val="ListParagraph"/>
+        <w:jc w:val="both"/>
+        <w:rPr>
+          <w:rFonts w:ascii="Arial" w:hAnsi="Arial" w:cs="Arial"/>
+        </w:rPr>
+      </w:pPr>
+      <w:r>
+        <w:rPr>
+          <w:rFonts w:ascii="Arial" w:hAnsi="Arial" w:cs="Arial"/>
+        </w:rPr>
+        <w:t>Es</w:t>
+      </w:r>
+      <w:r>
+        <w:rPr>
+          <w:rFonts w:ascii="Arial" w:hAnsi="Arial" w:cs="Arial"/>
+        </w:rPr>
+        <w:t>t</w:t>
+      </w:r>
+      <w:r>
+        <w:rPr>
+          <w:rFonts w:ascii="Arial" w:hAnsi="Arial" w:cs="Arial"/>
+        </w:rPr>
+        <w:t xml:space="preserve">o contradice que la solución original era óptima. Por tanto, si una solución óptima para </w:t>
+      </w:r>
+      <m:oMath>
+        <m:r>
+          <w:rPr>
+            <w:rFonts w:ascii="Cambria Math" w:hAnsi="Cambria Math" w:cs="Arial"/>
+          </w:rPr>
+          <m:t>m</m:t>
+        </m:r>
+      </m:oMath>
+      <w:r>
+        <w:rPr>
+          <w:rFonts w:ascii="Arial" w:hAnsi="Arial" w:cs="Arial"/>
+        </w:rPr>
+        <w:t xml:space="preserve"> </w:t>
+      </w:r>
+      <w:r>
+        <w:rPr>
+          <w:rFonts w:ascii="Arial" w:hAnsi="Arial" w:cs="Arial"/>
+        </w:rPr>
+        <w:t xml:space="preserve">empieza tomando una moneda </w:t>
+      </w:r>
+      <m:oMath>
+        <m:r>
+          <w:rPr>
+            <w:rFonts w:ascii="Cambria Math" w:hAnsi="Cambria Math" w:cs="Arial"/>
+          </w:rPr>
+          <m:t>d</m:t>
+        </m:r>
+      </m:oMath>
+      <w:r>
+        <w:rPr>
+          <w:rFonts w:ascii="Arial" w:hAnsi="Arial" w:cs="Arial"/>
+        </w:rPr>
+        <w:t xml:space="preserve">, debe ser una solución óptima para </w:t>
+      </w:r>
+      <m:oMath>
+        <m:r>
+          <w:rPr>
+            <w:rFonts w:ascii="Cambria Math" w:hAnsi="Cambria Math" w:cs="Arial"/>
+          </w:rPr>
+          <m:t>m-d</m:t>
+        </m:r>
+      </m:oMath>
+      <w:r>
+        <w:rPr>
+          <w:rFonts w:ascii="Arial" w:hAnsi="Arial" w:cs="Arial"/>
+        </w:rPr>
+        <w:t>.</w:t>
+      </w:r>
+    </w:p>
+    <w:p>
+      <w:pPr>
+        <w:pStyle w:val="ListParagraph"/>
+        <w:jc w:val="both"/>
+        <w:rPr>
+          <w:rFonts w:ascii="Arial" w:hAnsi="Arial" w:cs="Arial"/>
+        </w:rPr>
+      </w:pPr>
+    </w:p>
+    <w:p>
+      <w:pPr>
+        <w:pStyle w:val="ListParagraph"/>
+        <w:jc w:val="both"/>
+        <w:rPr>
+          <w:rFonts w:ascii="Arial" w:hAnsi="Arial" w:cs="Arial"/>
+        </w:rPr>
+      </w:pPr>
+      <w:r>
+        <w:rPr>
+          <w:rFonts w:ascii="Arial" w:hAnsi="Arial" w:cs="Arial"/>
+        </w:rPr>
+        <w:t xml:space="preserve">La </w:t>
+      </w:r>
+      <w:r>
+        <w:rPr>
+          <w:rFonts w:ascii="Arial" w:hAnsi="Arial" w:cs="Arial"/>
+        </w:rPr>
+        <w:t xml:space="preserve">función de </w:t>
+      </w:r>
+      <w:r>
+        <w:rPr>
+          <w:rFonts w:ascii="Arial" w:hAnsi="Arial" w:cs="Arial"/>
+        </w:rPr>
+        <w:t>recurrencia</w:t>
+      </w:r>
+      <w:r>
+        <w:rPr>
+          <w:rFonts w:ascii="Arial" w:hAnsi="Arial" w:cs="Arial"/>
+        </w:rPr>
+        <w:t xml:space="preserve"> sería la siguiente</w:t>
+      </w:r>
+      <w:r>
+        <w:rPr>
+          <w:rFonts w:ascii="Arial" w:hAnsi="Arial" w:cs="Arial"/>
+        </w:rPr>
+        <w:t>:</w:t>
+      </w:r>
+    </w:p>
+    <w:p>
+      <w:pPr>
+        <w:pStyle w:val="ListParagraph"/>
+        <w:jc w:val="both"/>
+        <w:rPr>
+          <w:rFonts w:ascii="Arial" w:hAnsi="Arial" w:cs="Arial"/>
+        </w:rPr>
+      </w:pPr>
+      <m:oMathPara>
+        <m:oMath>
+          <m:r>
+            <w:rPr>
+              <w:rFonts w:ascii="Cambria Math" w:hAnsi="Cambria Math" w:cs="Arial"/>
+            </w:rPr>
+            <m:t>C(m)=1+</m:t>
+          </m:r>
+          <m:limLow>
+            <m:limLowPr>
+              <m:ctrlPr>
+                <w:rPr>
+                  <w:rFonts w:ascii="Cambria Math" w:hAnsi="Cambria Math" w:cs="Arial"/>
+                </w:rPr>
+              </m:ctrlPr>
+            </m:limLowPr>
+            <m:e>
+              <m:r>
+                <m:rPr>
+                  <m:sty m:val="p"/>
+                </m:rPr>
+                <w:rPr>
+                  <w:rFonts w:ascii="Cambria Math" w:hAnsi="Cambria Math" w:cs="Arial"/>
+                </w:rPr>
+                <m:t>min</m:t>
+              </m:r>
+              <m:r>
+                <w:rPr>
+                  <w:rFonts w:ascii="Cambria Math" w:hAnsi="Cambria Math" w:cs="Arial"/>
+                </w:rPr>
+                <m:t>⁡</m:t>
+              </m:r>
+            </m:e>
+            <m:lim>
+              <m:r>
+                <w:rPr>
+                  <w:rFonts w:ascii="Cambria Math" w:hAnsi="Cambria Math" w:cs="Arial"/>
+                </w:rPr>
+                <m:t>d∈{1,5,10,25},</m:t>
+              </m:r>
+              <m:r>
+                <m:rPr>
+                  <m:nor/>
+                </m:rPr>
+                <w:rPr>
+                  <w:rFonts w:ascii="Arial" w:hAnsi="Arial" w:cs="Arial"/>
+                </w:rPr>
+                <m:t> </m:t>
+              </m:r>
+              <m:r>
+                <w:rPr>
+                  <w:rFonts w:ascii="Cambria Math" w:hAnsi="Cambria Math" w:cs="Arial"/>
+                </w:rPr>
+                <m:t>d≤m</m:t>
+              </m:r>
+            </m:lim>
+          </m:limLow>
+          <m:r>
+            <w:rPr>
+              <w:rFonts w:ascii="Cambria Math" w:hAnsi="Cambria Math" w:cs="Arial"/>
+            </w:rPr>
+            <m:t>C(m-d)</m:t>
+          </m:r>
+          <m:r>
+            <w:rPr>
+              <w:rFonts w:ascii="Arial" w:hAnsi="Arial" w:cs="Arial"/>
+              <w:i/>
+            </w:rPr>
+            <w:br/>
+          </m:r>
+        </m:oMath>
+      </m:oMathPara>
+    </w:p>
+    <w:p>
+      <w:pPr>
+        <w:pStyle w:val="ListParagraph"/>
+        <w:jc w:val="both"/>
+        <w:rPr>
+          <w:rFonts w:ascii="Arial" w:hAnsi="Arial" w:cs="Arial"/>
+        </w:rPr>
+      </w:pPr>
+      <w:r>
+        <w:rPr>
+          <w:rFonts w:ascii="Arial" w:hAnsi="Arial" w:cs="Arial"/>
+        </w:rPr>
+        <w:t>con caso base:</w:t>
+      </w:r>
+    </w:p>
+    <w:p>
+      <w:pPr>
+        <w:pStyle w:val="ListParagraph"/>
+        <w:jc w:val="both"/>
+        <w:rPr>
+          <w:rFonts w:ascii="Arial" w:hAnsi="Arial" w:cs="Arial"/>
+        </w:rPr>
+      </w:pPr>
+      <m:oMathPara>
+        <m:oMath>
+          <m:r>
+            <w:rPr>
+              <w:rFonts w:ascii="Cambria Math" w:hAnsi="Cambria Math" w:cs="Arial"/>
+            </w:rPr>
+            <m:t>C(0)=0</m:t>
+          </m:r>
+          <m:r>
+            <w:rPr>
+              <w:rFonts w:ascii="Arial" w:hAnsi="Arial" w:cs="Arial"/>
+              <w:i/>
+            </w:rPr>
+            <w:br/>
+          </m:r>
+        </m:oMath>
+      </m:oMathPara>
+    </w:p>
+    <w:p>
+      <w:pPr>
+        <w:pStyle w:val="ListParagraph"/>
+        <w:jc w:val="both"/>
+        <w:rPr>
+          <w:rFonts w:ascii="Arial" w:hAnsi="Arial" w:cs="Arial"/>
+        </w:rPr>
+      </w:pPr>
+      <w:r>
+        <w:rPr>
+          <w:rFonts w:ascii="Arial" w:hAnsi="Arial" w:cs="Arial"/>
+        </w:rPr>
+        <w:t>Esto demuestra que el problema tiene subestructura óptima.</w:t>
+      </w:r>
+    </w:p>
+    <w:p>
+      <w:pPr>
+        <w:pStyle w:val="ListParagraph"/>
+        <w:jc w:val="both"/>
+        <w:rPr>
+          <w:rFonts w:ascii="Arial" w:hAnsi="Arial" w:cs="Arial"/>
+          <w:lang w:val="es-US"/>
+        </w:rPr>
+      </w:pPr>
+      <w:r>
+        <w:rPr>
+          <w:rFonts w:ascii="Arial" w:hAnsi="Arial" w:cs="Arial"/>
+          <w:lang w:val="es-US"/>
+        </w:rPr>
+        <w:tab/>
+      </w:r>
+      <w:r>
+        <w:rPr>
+          <w:rFonts w:ascii="Arial" w:hAnsi="Arial" w:cs="Arial"/>
+          <w:lang w:val="es-US"/>
+        </w:rPr>
+        <w:br/>
+      </w:r>
     </w:p>
     <w:sectPr>
       <w:pgSz w:w="12240" w:h="15840"/>
@@ -104,7 +1161,7 @@
   <w:abstractNum w:abstractNumId="0" w15:restartNumberingAfterBreak="0">
     <w:nsid w:val="385F5912"/>
     <w:multiLevelType w:val="hybridMultilevel"/>
-    <w:tmpl w:val="D4A8C50C"/>
+    <w:tmpl w:val="9BBADB50"/>
     <w:lvl w:ilvl="0" w:tplc="100A000F">
       <w:start w:val="1"/>
       <w:numFmt w:val="decimal"/>
@@ -117,14 +1174,17 @@
         <w:rFonts w:hint="default"/>
       </w:rPr>
     </w:lvl>
-    <w:lvl w:ilvl="1" w:tplc="100A0019" w:tentative="1">
+    <w:lvl w:ilvl="1" w:tplc="100A0001">
       <w:start w:val="1"/>
-      <w:numFmt w:val="lowerLetter"/>
-      <w:lvlText w:val="%2."/>
+      <w:numFmt w:val="bullet"/>
+      <w:lvlText w:val=""/>
       <w:lvlJc w:val="left"/>
       <w:pPr>
         <w:ind w:left="1440" w:hanging="360"/>
       </w:pPr>
+      <w:rPr>
+        <w:rFonts w:ascii="Symbol" w:hAnsi="Symbol" w:hint="default"/>
+      </w:rPr>
     </w:lvl>
     <w:lvl w:ilvl="2" w:tplc="100A001B" w:tentative="1">
       <w:start w:val="1"/>
@@ -1112,6 +2172,17 @@
       <w:spacing w:val="5"/>
     </w:rPr>
   </w:style>
+  <w:style w:type="paragraph" w:styleId="NormalWeb">
+    <w:name w:val="Normal (Web)"/>
+    <w:basedOn w:val="Normal"/>
+    <w:uiPriority w:val="99"/>
+    <w:semiHidden/>
+    <w:unhideWhenUsed/>
+    <w:rsid w:val="002E6562"/>
+    <w:rPr>
+      <w:rFonts w:ascii="Times New Roman" w:hAnsi="Times New Roman" w:cs="Times New Roman"/>
+    </w:rPr>
+  </w:style>
 </w:styles>
 </file>
 

</xml_diff>

<commit_message>
feat: problema de hacer sencillo resuelto
</commit_message>
<xml_diff>
--- a/Examen Parcial No 2.docx
+++ b/Examen Parcial No 2.docx
@@ -1138,13 +1138,1559 @@
         </w:rPr>
         <w:tab/>
       </w:r>
-      <w:r>
+    </w:p>
+    <w:p>
+      <w:pPr>
+        <w:pStyle w:val="ListParagraph"/>
+        <w:jc w:val="both"/>
         <w:rPr>
           <w:rFonts w:ascii="Arial" w:hAnsi="Arial" w:cs="Arial"/>
           <w:lang w:val="es-US"/>
         </w:rPr>
-        <w:br/>
-      </w:r>
+      </w:pPr>
+    </w:p>
+    <w:p>
+      <w:pPr>
+        <w:ind w:firstLine="708"/>
+        <w:jc w:val="both"/>
+        <w:rPr>
+          <w:rFonts w:ascii="Arial" w:hAnsi="Arial" w:cs="Arial"/>
+          <w:lang w:val="es-US"/>
+        </w:rPr>
+      </w:pPr>
+      <w:r>
+        <w:rPr>
+          <w:rFonts w:ascii="Arial" w:hAnsi="Arial" w:cs="Arial"/>
+          <w:lang w:val="es-US"/>
+        </w:rPr>
+        <w:t>Subproblemas traslapados</w:t>
+      </w:r>
+      <w:r>
+        <w:rPr>
+          <w:rFonts w:ascii="Arial" w:hAnsi="Arial" w:cs="Arial"/>
+          <w:lang w:val="es-US"/>
+        </w:rPr>
+        <w:t>:</w:t>
+      </w:r>
+    </w:p>
+    <w:p>
+      <w:pPr>
+        <w:pStyle w:val="ListParagraph"/>
+        <w:ind w:left="708"/>
+        <w:jc w:val="both"/>
+        <w:rPr>
+          <w:rFonts w:ascii="Arial" w:hAnsi="Arial" w:cs="Arial"/>
+        </w:rPr>
+      </w:pPr>
+      <w:r>
+        <w:rPr>
+          <w:rFonts w:ascii="Arial" w:hAnsi="Arial" w:cs="Arial"/>
+        </w:rPr>
+        <w:t xml:space="preserve">Si resolvemos el problema recursivamente usando la recurrencia anterior, aparecen montos repetidos </w:t>
+      </w:r>
+      <w:r>
+        <w:rPr>
+          <w:rFonts w:ascii="Arial" w:hAnsi="Arial" w:cs="Arial"/>
+        </w:rPr>
+        <w:t>varias</w:t>
+      </w:r>
+      <w:r>
+        <w:rPr>
+          <w:rFonts w:ascii="Arial" w:hAnsi="Arial" w:cs="Arial"/>
+        </w:rPr>
+        <w:t xml:space="preserve"> veces.</w:t>
+      </w:r>
+    </w:p>
+    <w:p>
+      <w:pPr>
+        <w:pStyle w:val="ListParagraph"/>
+        <w:ind w:left="708"/>
+        <w:jc w:val="both"/>
+        <w:rPr>
+          <w:rFonts w:ascii="Arial" w:hAnsi="Arial" w:cs="Arial"/>
+        </w:rPr>
+      </w:pPr>
+    </w:p>
+    <w:p>
+      <w:pPr>
+        <w:pStyle w:val="ListParagraph"/>
+        <w:ind w:left="708"/>
+        <w:jc w:val="both"/>
+        <w:rPr>
+          <w:rFonts w:ascii="Arial" w:hAnsi="Arial" w:cs="Arial"/>
+        </w:rPr>
+      </w:pPr>
+      <w:r>
+        <w:rPr>
+          <w:rFonts w:ascii="Arial" w:hAnsi="Arial" w:cs="Arial"/>
+        </w:rPr>
+        <w:t xml:space="preserve">Por ejemplo, para calcular </w:t>
+      </w:r>
+      <w:proofErr w:type="gramStart"/>
+      <w:r>
+        <w:rPr>
+          <w:rFonts w:ascii="Arial" w:hAnsi="Arial" w:cs="Arial"/>
+        </w:rPr>
+        <w:t>C(</w:t>
+      </w:r>
+      <w:proofErr w:type="gramEnd"/>
+      <w:r>
+        <w:rPr>
+          <w:rFonts w:ascii="Arial" w:hAnsi="Arial" w:cs="Arial"/>
+        </w:rPr>
+        <w:t>30), se consideran:</w:t>
+      </w:r>
+    </w:p>
+    <w:p>
+      <w:pPr>
+        <w:pStyle w:val="ListParagraph"/>
+        <w:ind w:left="708"/>
+        <w:jc w:val="both"/>
+        <w:rPr>
+          <w:rFonts w:ascii="Arial" w:hAnsi="Arial" w:cs="Arial"/>
+        </w:rPr>
+      </w:pPr>
+    </w:p>
+    <w:p>
+      <w:pPr>
+        <w:pStyle w:val="ListParagraph"/>
+        <w:ind w:left="708"/>
+        <w:jc w:val="both"/>
+        <w:rPr>
+          <w:rFonts w:ascii="Arial" w:hAnsi="Arial" w:cs="Arial"/>
+        </w:rPr>
+      </w:pPr>
+      <m:oMathPara>
+        <m:oMath>
+          <m:r>
+            <w:rPr>
+              <w:rFonts w:ascii="Cambria Math" w:hAnsi="Cambria Math" w:cs="Arial"/>
+            </w:rPr>
+            <m:t>C(29),C(25),C(20),C(5)</m:t>
+          </m:r>
+          <m:r>
+            <w:rPr>
+              <w:rFonts w:ascii="Arial" w:hAnsi="Arial" w:cs="Arial"/>
+              <w:i/>
+            </w:rPr>
+            <w:br/>
+          </m:r>
+        </m:oMath>
+      </m:oMathPara>
+    </w:p>
+    <w:p>
+      <w:pPr>
+        <w:pStyle w:val="ListParagraph"/>
+        <w:ind w:left="708"/>
+        <w:jc w:val="both"/>
+        <w:rPr>
+          <w:rFonts w:ascii="Arial" w:hAnsi="Arial" w:cs="Arial"/>
+        </w:rPr>
+      </w:pPr>
+      <w:r>
+        <w:rPr>
+          <w:rFonts w:ascii="Arial" w:hAnsi="Arial" w:cs="Arial"/>
+        </w:rPr>
+        <w:t xml:space="preserve">Pero luego, al calcular </w:t>
+      </w:r>
+      <w:proofErr w:type="gramStart"/>
+      <w:r>
+        <w:rPr>
+          <w:rFonts w:ascii="Arial" w:hAnsi="Arial" w:cs="Arial"/>
+        </w:rPr>
+        <w:t>C(</w:t>
+      </w:r>
+      <w:proofErr w:type="gramEnd"/>
+      <w:r>
+        <w:rPr>
+          <w:rFonts w:ascii="Arial" w:hAnsi="Arial" w:cs="Arial"/>
+        </w:rPr>
+        <w:t xml:space="preserve">29), también se puede llegar a </w:t>
+      </w:r>
+      <w:proofErr w:type="gramStart"/>
+      <w:r>
+        <w:rPr>
+          <w:rFonts w:ascii="Arial" w:hAnsi="Arial" w:cs="Arial"/>
+        </w:rPr>
+        <w:t>C(</w:t>
+      </w:r>
+      <w:proofErr w:type="gramEnd"/>
+      <w:r>
+        <w:rPr>
+          <w:rFonts w:ascii="Arial" w:hAnsi="Arial" w:cs="Arial"/>
+        </w:rPr>
+        <w:t xml:space="preserve">24), </w:t>
+      </w:r>
+      <w:proofErr w:type="gramStart"/>
+      <w:r>
+        <w:rPr>
+          <w:rFonts w:ascii="Arial" w:hAnsi="Arial" w:cs="Arial"/>
+        </w:rPr>
+        <w:t>C(</w:t>
+      </w:r>
+      <w:proofErr w:type="gramEnd"/>
+      <w:r>
+        <w:rPr>
+          <w:rFonts w:ascii="Arial" w:hAnsi="Arial" w:cs="Arial"/>
+        </w:rPr>
+        <w:t xml:space="preserve">19), </w:t>
+      </w:r>
+      <w:proofErr w:type="gramStart"/>
+      <w:r>
+        <w:rPr>
+          <w:rFonts w:ascii="Arial" w:hAnsi="Arial" w:cs="Arial"/>
+        </w:rPr>
+        <w:t>C(</w:t>
+      </w:r>
+      <w:proofErr w:type="gramEnd"/>
+      <w:r>
+        <w:rPr>
+          <w:rFonts w:ascii="Arial" w:hAnsi="Arial" w:cs="Arial"/>
+        </w:rPr>
+        <w:t xml:space="preserve">4), etc. Al calcular otros caminos, vuelven a aparecer montos como </w:t>
+      </w:r>
+      <w:proofErr w:type="gramStart"/>
+      <w:r>
+        <w:rPr>
+          <w:rFonts w:ascii="Arial" w:hAnsi="Arial" w:cs="Arial"/>
+        </w:rPr>
+        <w:t>C(</w:t>
+      </w:r>
+      <w:proofErr w:type="gramEnd"/>
+      <w:r>
+        <w:rPr>
+          <w:rFonts w:ascii="Arial" w:hAnsi="Arial" w:cs="Arial"/>
+        </w:rPr>
+        <w:t xml:space="preserve">20), </w:t>
+      </w:r>
+      <w:proofErr w:type="gramStart"/>
+      <w:r>
+        <w:rPr>
+          <w:rFonts w:ascii="Arial" w:hAnsi="Arial" w:cs="Arial"/>
+        </w:rPr>
+        <w:t>C(</w:t>
+      </w:r>
+      <w:proofErr w:type="gramEnd"/>
+      <w:r>
+        <w:rPr>
+          <w:rFonts w:ascii="Arial" w:hAnsi="Arial" w:cs="Arial"/>
+        </w:rPr>
+        <w:t xml:space="preserve">15), </w:t>
+      </w:r>
+      <w:proofErr w:type="gramStart"/>
+      <w:r>
+        <w:rPr>
+          <w:rFonts w:ascii="Arial" w:hAnsi="Arial" w:cs="Arial"/>
+        </w:rPr>
+        <w:t>C(</w:t>
+      </w:r>
+      <w:proofErr w:type="gramEnd"/>
+      <w:r>
+        <w:rPr>
+          <w:rFonts w:ascii="Arial" w:hAnsi="Arial" w:cs="Arial"/>
+        </w:rPr>
+        <w:t xml:space="preserve">10), </w:t>
+      </w:r>
+      <w:proofErr w:type="gramStart"/>
+      <w:r>
+        <w:rPr>
+          <w:rFonts w:ascii="Arial" w:hAnsi="Arial" w:cs="Arial"/>
+        </w:rPr>
+        <w:t>C(</w:t>
+      </w:r>
+      <w:proofErr w:type="gramEnd"/>
+      <w:r>
+        <w:rPr>
+          <w:rFonts w:ascii="Arial" w:hAnsi="Arial" w:cs="Arial"/>
+        </w:rPr>
+        <w:t>5).</w:t>
+      </w:r>
+    </w:p>
+    <w:p>
+      <w:pPr>
+        <w:pStyle w:val="ListParagraph"/>
+        <w:ind w:left="708"/>
+        <w:jc w:val="both"/>
+        <w:rPr>
+          <w:rFonts w:ascii="Arial" w:hAnsi="Arial" w:cs="Arial"/>
+        </w:rPr>
+      </w:pPr>
+    </w:p>
+    <w:p>
+      <w:pPr>
+        <w:pStyle w:val="ListParagraph"/>
+        <w:ind w:left="708"/>
+        <w:jc w:val="both"/>
+        <w:rPr>
+          <w:rFonts w:ascii="Arial" w:hAnsi="Arial" w:cs="Arial"/>
+        </w:rPr>
+      </w:pPr>
+      <w:r>
+        <w:rPr>
+          <w:rFonts w:ascii="Arial" w:hAnsi="Arial" w:cs="Arial"/>
+        </w:rPr>
+        <w:t>El mismo subproblema C(k) puede ser generado desde varios problemas mayores:</w:t>
+      </w:r>
+    </w:p>
+    <w:p>
+      <w:pPr>
+        <w:pStyle w:val="ListParagraph"/>
+        <w:ind w:left="708"/>
+        <w:jc w:val="both"/>
+        <w:rPr>
+          <w:rFonts w:ascii="Arial" w:hAnsi="Arial" w:cs="Arial"/>
+        </w:rPr>
+      </w:pPr>
+      <m:oMathPara>
+        <m:oMath>
+          <m:r>
+            <w:rPr>
+              <w:rFonts w:ascii="Cambria Math" w:hAnsi="Cambria Math" w:cs="Arial"/>
+            </w:rPr>
+            <m:t>C(k+1),C(k+5),C(k+10),C(k+25)</m:t>
+          </m:r>
+          <m:r>
+            <w:rPr>
+              <w:rFonts w:ascii="Arial" w:hAnsi="Arial" w:cs="Arial"/>
+              <w:i/>
+            </w:rPr>
+            <w:br/>
+          </m:r>
+        </m:oMath>
+      </m:oMathPara>
+    </w:p>
+    <w:p>
+      <w:pPr>
+        <w:pStyle w:val="ListParagraph"/>
+        <w:ind w:left="708"/>
+        <w:jc w:val="both"/>
+        <w:rPr>
+          <w:rFonts w:ascii="Arial" w:hAnsi="Arial" w:cs="Arial"/>
+        </w:rPr>
+      </w:pPr>
+      <w:r>
+        <w:rPr>
+          <w:rFonts w:ascii="Arial" w:hAnsi="Arial" w:cs="Arial"/>
+        </w:rPr>
+        <w:lastRenderedPageBreak/>
+        <w:t xml:space="preserve">Por ejemplo, </w:t>
+      </w:r>
+      <w:proofErr w:type="gramStart"/>
+      <w:r>
+        <w:rPr>
+          <w:rFonts w:ascii="Arial" w:hAnsi="Arial" w:cs="Arial"/>
+        </w:rPr>
+        <w:t>C(</w:t>
+      </w:r>
+      <w:proofErr w:type="gramEnd"/>
+      <w:r>
+        <w:rPr>
+          <w:rFonts w:ascii="Arial" w:hAnsi="Arial" w:cs="Arial"/>
+        </w:rPr>
+        <w:t xml:space="preserve">20) puede aparecer al resolver </w:t>
+      </w:r>
+      <w:proofErr w:type="gramStart"/>
+      <w:r>
+        <w:rPr>
+          <w:rFonts w:ascii="Arial" w:hAnsi="Arial" w:cs="Arial"/>
+        </w:rPr>
+        <w:t>C(</w:t>
+      </w:r>
+      <w:proofErr w:type="gramEnd"/>
+      <w:r>
+        <w:rPr>
+          <w:rFonts w:ascii="Arial" w:hAnsi="Arial" w:cs="Arial"/>
+        </w:rPr>
+        <w:t xml:space="preserve">21) usando una moneda de 1, al resolver </w:t>
+      </w:r>
+      <w:proofErr w:type="gramStart"/>
+      <w:r>
+        <w:rPr>
+          <w:rFonts w:ascii="Arial" w:hAnsi="Arial" w:cs="Arial"/>
+        </w:rPr>
+        <w:t>C(</w:t>
+      </w:r>
+      <w:proofErr w:type="gramEnd"/>
+      <w:r>
+        <w:rPr>
+          <w:rFonts w:ascii="Arial" w:hAnsi="Arial" w:cs="Arial"/>
+        </w:rPr>
+        <w:t xml:space="preserve">25) usando una moneda de 5, al resolver </w:t>
+      </w:r>
+      <w:proofErr w:type="gramStart"/>
+      <w:r>
+        <w:rPr>
+          <w:rFonts w:ascii="Arial" w:hAnsi="Arial" w:cs="Arial"/>
+        </w:rPr>
+        <w:t>C(</w:t>
+      </w:r>
+      <w:proofErr w:type="gramEnd"/>
+      <w:r>
+        <w:rPr>
+          <w:rFonts w:ascii="Arial" w:hAnsi="Arial" w:cs="Arial"/>
+        </w:rPr>
+        <w:t xml:space="preserve">30) usando una moneda de 10, o al resolver </w:t>
+      </w:r>
+      <w:proofErr w:type="gramStart"/>
+      <w:r>
+        <w:rPr>
+          <w:rFonts w:ascii="Arial" w:hAnsi="Arial" w:cs="Arial"/>
+        </w:rPr>
+        <w:t>C(</w:t>
+      </w:r>
+      <w:proofErr w:type="gramEnd"/>
+      <w:r>
+        <w:rPr>
+          <w:rFonts w:ascii="Arial" w:hAnsi="Arial" w:cs="Arial"/>
+        </w:rPr>
+        <w:t>45) usando una moneda de 25.</w:t>
+      </w:r>
+    </w:p>
+    <w:p>
+      <w:pPr>
+        <w:pStyle w:val="ListParagraph"/>
+        <w:ind w:left="708"/>
+        <w:jc w:val="both"/>
+        <w:rPr>
+          <w:rFonts w:ascii="Arial" w:hAnsi="Arial" w:cs="Arial"/>
+        </w:rPr>
+      </w:pPr>
+    </w:p>
+    <w:p>
+      <w:pPr>
+        <w:pStyle w:val="ListParagraph"/>
+        <w:ind w:left="708"/>
+        <w:jc w:val="both"/>
+        <w:rPr>
+          <w:rFonts w:ascii="Arial" w:hAnsi="Arial" w:cs="Arial"/>
+        </w:rPr>
+      </w:pPr>
+      <w:r>
+        <w:rPr>
+          <w:rFonts w:ascii="Arial" w:hAnsi="Arial" w:cs="Arial"/>
+        </w:rPr>
+        <w:t xml:space="preserve">Entonces una solución recursiva sin memoria resolvería varias veces los mismos montos. Esto demuestra que existen subproblemas traslapados. Por eso una solución de programación dinámica con tabla </w:t>
+      </w:r>
+      <w:proofErr w:type="spellStart"/>
+      <w:proofErr w:type="gramStart"/>
+      <w:r>
+        <w:rPr>
+          <w:rFonts w:ascii="Arial" w:hAnsi="Arial" w:cs="Arial"/>
+        </w:rPr>
+        <w:t>dp</w:t>
+      </w:r>
+      <w:proofErr w:type="spellEnd"/>
+      <w:r>
+        <w:rPr>
+          <w:rFonts w:ascii="Arial" w:hAnsi="Arial" w:cs="Arial"/>
+        </w:rPr>
+        <w:t>[</w:t>
+      </w:r>
+      <w:proofErr w:type="gramEnd"/>
+      <m:oMath>
+        <m:r>
+          <w:rPr>
+            <w:rFonts w:ascii="Cambria Math" w:hAnsi="Cambria Math" w:cs="Arial"/>
+          </w:rPr>
+          <m:t>m</m:t>
+        </m:r>
+      </m:oMath>
+      <w:r>
+        <w:rPr>
+          <w:rFonts w:ascii="Arial" w:hAnsi="Arial" w:cs="Arial"/>
+        </w:rPr>
+        <w:t>] es válida.</w:t>
+      </w:r>
+    </w:p>
+    <w:p>
+      <w:pPr>
+        <w:pStyle w:val="ListParagraph"/>
+        <w:ind w:left="708"/>
+        <w:jc w:val="both"/>
+        <w:rPr>
+          <w:rFonts w:ascii="Arial" w:hAnsi="Arial" w:cs="Arial"/>
+        </w:rPr>
+      </w:pPr>
+    </w:p>
+    <w:p>
+      <w:pPr>
+        <w:ind w:firstLine="708"/>
+        <w:jc w:val="both"/>
+        <w:rPr>
+          <w:rFonts w:ascii="Arial" w:hAnsi="Arial" w:cs="Arial"/>
+          <w:lang w:val="es-US"/>
+        </w:rPr>
+      </w:pPr>
+      <w:r>
+        <w:rPr>
+          <w:rFonts w:ascii="Arial" w:hAnsi="Arial" w:cs="Arial"/>
+          <w:lang w:val="es-US"/>
+        </w:rPr>
+        <w:t>Subproblemas traslapados</w:t>
+      </w:r>
+      <w:r>
+        <w:rPr>
+          <w:rFonts w:ascii="Arial" w:hAnsi="Arial" w:cs="Arial"/>
+          <w:lang w:val="es-US"/>
+        </w:rPr>
+        <w:t>:</w:t>
+      </w:r>
+    </w:p>
+    <w:p>
+      <w:pPr>
+        <w:pStyle w:val="ListParagraph"/>
+        <w:ind w:left="708"/>
+        <w:jc w:val="both"/>
+        <w:rPr>
+          <w:rFonts w:ascii="Arial" w:hAnsi="Arial" w:cs="Arial"/>
+        </w:rPr>
+      </w:pPr>
+      <w:r>
+        <w:rPr>
+          <w:rFonts w:ascii="Arial" w:hAnsi="Arial" w:cs="Arial"/>
+        </w:rPr>
+        <w:t xml:space="preserve">El algoritmo </w:t>
+      </w:r>
+      <w:proofErr w:type="spellStart"/>
+      <w:r>
+        <w:rPr>
+          <w:rFonts w:ascii="Arial" w:hAnsi="Arial" w:cs="Arial"/>
+        </w:rPr>
+        <w:t>greedy</w:t>
+      </w:r>
+      <w:proofErr w:type="spellEnd"/>
+      <w:r>
+        <w:rPr>
+          <w:rFonts w:ascii="Arial" w:hAnsi="Arial" w:cs="Arial"/>
+        </w:rPr>
+        <w:t xml:space="preserve"> tomaría siempre la moneda de mayor denominación que no exceda el monto restante.</w:t>
+      </w:r>
+      <w:r>
+        <w:rPr>
+          <w:rFonts w:ascii="Arial" w:hAnsi="Arial" w:cs="Arial"/>
+        </w:rPr>
+        <w:t xml:space="preserve"> Se busca</w:t>
+      </w:r>
+      <w:r>
+        <w:rPr>
+          <w:rFonts w:ascii="Arial" w:hAnsi="Arial" w:cs="Arial"/>
+        </w:rPr>
+        <w:t xml:space="preserve"> demostrar que esa decisión local pertenece a alguna solución óptima.</w:t>
+      </w:r>
+      <w:r>
+        <w:rPr>
+          <w:rFonts w:ascii="Arial" w:hAnsi="Arial" w:cs="Arial"/>
+        </w:rPr>
+        <w:t xml:space="preserve"> </w:t>
+      </w:r>
+      <w:r>
+        <w:rPr>
+          <w:rFonts w:ascii="Arial" w:hAnsi="Arial" w:cs="Arial"/>
+        </w:rPr>
+        <w:t>Para estas monedas, analizamos por rangos</w:t>
+      </w:r>
+      <w:r>
+        <w:rPr>
+          <w:rFonts w:ascii="Arial" w:hAnsi="Arial" w:cs="Arial"/>
+        </w:rPr>
+        <w:t>, p</w:t>
+      </w:r>
+      <w:r>
+        <w:rPr>
+          <w:rFonts w:ascii="Arial" w:hAnsi="Arial" w:cs="Arial"/>
+        </w:rPr>
+        <w:t>rimer</w:t>
+      </w:r>
+      <w:r>
+        <w:rPr>
+          <w:rFonts w:ascii="Arial" w:hAnsi="Arial" w:cs="Arial"/>
+        </w:rPr>
+        <w:t>o</w:t>
+      </w:r>
+      <w:r>
+        <w:rPr>
+          <w:rFonts w:ascii="Arial" w:hAnsi="Arial" w:cs="Arial"/>
+        </w:rPr>
+        <w:t xml:space="preserve"> en una solución óptima:</w:t>
+      </w:r>
+    </w:p>
+    <w:p>
+      <w:pPr>
+        <w:pStyle w:val="ListParagraph"/>
+        <w:ind w:left="708"/>
+        <w:jc w:val="both"/>
+        <w:rPr>
+          <w:rFonts w:ascii="Arial" w:hAnsi="Arial" w:cs="Arial"/>
+        </w:rPr>
+      </w:pPr>
+    </w:p>
+    <w:p>
+      <w:pPr>
+        <w:pStyle w:val="ListParagraph"/>
+        <w:numPr>
+          <w:ilvl w:val="0"/>
+          <w:numId w:val="2"/>
+        </w:numPr>
+        <w:jc w:val="both"/>
+        <w:rPr>
+          <w:rFonts w:ascii="Arial" w:hAnsi="Arial" w:cs="Arial"/>
+        </w:rPr>
+      </w:pPr>
+      <w:r>
+        <w:rPr>
+          <w:rFonts w:ascii="Arial" w:hAnsi="Arial" w:cs="Arial"/>
+        </w:rPr>
+        <w:t xml:space="preserve">No puede haber 5 monedas de 1, porque se reemplazan por 1 moneda de 5. </w:t>
+      </w:r>
+    </w:p>
+    <w:p>
+      <w:pPr>
+        <w:pStyle w:val="ListParagraph"/>
+        <w:numPr>
+          <w:ilvl w:val="0"/>
+          <w:numId w:val="2"/>
+        </w:numPr>
+        <w:jc w:val="both"/>
+        <w:rPr>
+          <w:rFonts w:ascii="Arial" w:hAnsi="Arial" w:cs="Arial"/>
+        </w:rPr>
+      </w:pPr>
+      <w:r>
+        <w:rPr>
+          <w:rFonts w:ascii="Arial" w:hAnsi="Arial" w:cs="Arial"/>
+        </w:rPr>
+        <w:t xml:space="preserve">No puede haber 2 monedas de 5, porque se reemplazan por 1 moneda de 10. </w:t>
+      </w:r>
+    </w:p>
+    <w:p>
+      <w:pPr>
+        <w:pStyle w:val="ListParagraph"/>
+        <w:numPr>
+          <w:ilvl w:val="0"/>
+          <w:numId w:val="2"/>
+        </w:numPr>
+        <w:jc w:val="both"/>
+        <w:rPr>
+          <w:rFonts w:ascii="Arial" w:hAnsi="Arial" w:cs="Arial"/>
+        </w:rPr>
+      </w:pPr>
+      <w:r>
+        <w:rPr>
+          <w:rFonts w:ascii="Arial" w:hAnsi="Arial" w:cs="Arial"/>
+        </w:rPr>
+        <w:t xml:space="preserve">No puede haber 3 monedas de 10, porque se reemplazan por 25 + 5, es decir, 2 monedas en lugar de 3. </w:t>
+      </w:r>
+    </w:p>
+    <w:p>
+      <w:pPr>
+        <w:pStyle w:val="ListParagraph"/>
+        <w:numPr>
+          <w:ilvl w:val="0"/>
+          <w:numId w:val="2"/>
+        </w:numPr>
+        <w:jc w:val="both"/>
+        <w:rPr>
+          <w:rFonts w:ascii="Arial" w:hAnsi="Arial" w:cs="Arial"/>
+        </w:rPr>
+      </w:pPr>
+      <w:r>
+        <w:rPr>
+          <w:rFonts w:ascii="Arial" w:hAnsi="Arial" w:cs="Arial"/>
+        </w:rPr>
+        <w:t xml:space="preserve">No puede haber 2 monedas de 10 y 1 de 5, porque se reemplazan por 1 moneda de 25. </w:t>
+      </w:r>
+    </w:p>
+    <w:p>
+      <w:pPr>
+        <w:pStyle w:val="ListParagraph"/>
+        <w:ind w:left="1068"/>
+        <w:jc w:val="both"/>
+        <w:rPr>
+          <w:rFonts w:ascii="Arial" w:hAnsi="Arial" w:cs="Arial"/>
+        </w:rPr>
+      </w:pPr>
+    </w:p>
+    <w:p>
+      <w:pPr>
+        <w:pStyle w:val="ListParagraph"/>
+        <w:ind w:left="708"/>
+        <w:jc w:val="both"/>
+        <w:rPr>
+          <w:rFonts w:ascii="Arial" w:hAnsi="Arial" w:cs="Arial"/>
+        </w:rPr>
+      </w:pPr>
+      <w:r>
+        <w:rPr>
+          <w:rFonts w:ascii="Arial" w:hAnsi="Arial" w:cs="Arial"/>
+        </w:rPr>
+        <w:t>Consideramos</w:t>
+      </w:r>
+      <w:r>
+        <w:rPr>
+          <w:rFonts w:ascii="Arial" w:hAnsi="Arial" w:cs="Arial"/>
+        </w:rPr>
+        <w:t xml:space="preserve"> un monto </w:t>
+      </w:r>
+      <m:oMath>
+        <m:r>
+          <w:rPr>
+            <w:rFonts w:ascii="Cambria Math" w:hAnsi="Cambria Math" w:cs="Arial"/>
+          </w:rPr>
+          <m:t>m</m:t>
+        </m:r>
+      </m:oMath>
+      <w:r>
+        <w:rPr>
+          <w:rFonts w:ascii="Arial" w:hAnsi="Arial" w:cs="Arial"/>
+        </w:rPr>
+        <w:t xml:space="preserve"> ≥ 25</w:t>
+      </w:r>
+      <w:r>
+        <w:rPr>
+          <w:rFonts w:ascii="Arial" w:hAnsi="Arial" w:cs="Arial"/>
+        </w:rPr>
+        <w:t xml:space="preserve">, suponiendo </w:t>
+      </w:r>
+      <w:r>
+        <w:rPr>
+          <w:rFonts w:ascii="Arial" w:hAnsi="Arial" w:cs="Arial"/>
+        </w:rPr>
+        <w:t>que una solución óptima para m no usa ninguna moneda de 25. Entonces solo usa monedas de 1, 5 y 10.</w:t>
+      </w:r>
+    </w:p>
+    <w:p>
+      <w:pPr>
+        <w:pStyle w:val="ListParagraph"/>
+        <w:ind w:left="708"/>
+        <w:jc w:val="both"/>
+        <w:rPr>
+          <w:rFonts w:ascii="Arial" w:hAnsi="Arial" w:cs="Arial"/>
+        </w:rPr>
+      </w:pPr>
+      <w:r>
+        <w:rPr>
+          <w:rFonts w:ascii="Arial" w:hAnsi="Arial" w:cs="Arial"/>
+        </w:rPr>
+        <w:t>Pero, por las reglas anteriores, una solución óptima sin monedas de 25 no puede acumular 25 o más centavos sin contener un patrón reemplazable. Por ejemplo:</w:t>
+      </w:r>
+    </w:p>
+    <w:p>
+      <w:pPr>
+        <w:pStyle w:val="ListParagraph"/>
+        <w:ind w:left="708"/>
+        <w:jc w:val="both"/>
+        <w:rPr>
+          <w:rFonts w:ascii="Arial" w:hAnsi="Arial" w:cs="Arial"/>
+        </w:rPr>
+      </w:pPr>
+    </w:p>
+    <w:p>
+      <w:pPr>
+        <w:pStyle w:val="ListParagraph"/>
+        <w:numPr>
+          <w:ilvl w:val="0"/>
+          <w:numId w:val="3"/>
+        </w:numPr>
+        <w:jc w:val="both"/>
+        <w:rPr>
+          <w:rFonts w:ascii="Arial" w:hAnsi="Arial" w:cs="Arial"/>
+        </w:rPr>
+      </w:pPr>
+      <w:r>
+        <w:rPr>
+          <w:rFonts w:ascii="Arial" w:hAnsi="Arial" w:cs="Arial"/>
+        </w:rPr>
+        <w:t xml:space="preserve">Si </w:t>
+      </w:r>
+      <w:r>
+        <w:rPr>
+          <w:rFonts w:ascii="Arial" w:hAnsi="Arial" w:cs="Arial"/>
+        </w:rPr>
+        <w:t xml:space="preserve">se </w:t>
+      </w:r>
+      <w:r>
+        <w:rPr>
+          <w:rFonts w:ascii="Arial" w:hAnsi="Arial" w:cs="Arial"/>
+        </w:rPr>
+        <w:t xml:space="preserve">tiene 3 monedas de 10, se mejora usando 25 + 5. </w:t>
+      </w:r>
+    </w:p>
+    <w:p>
+      <w:pPr>
+        <w:pStyle w:val="ListParagraph"/>
+        <w:numPr>
+          <w:ilvl w:val="0"/>
+          <w:numId w:val="3"/>
+        </w:numPr>
+        <w:jc w:val="both"/>
+        <w:rPr>
+          <w:rFonts w:ascii="Arial" w:hAnsi="Arial" w:cs="Arial"/>
+        </w:rPr>
+      </w:pPr>
+      <w:r>
+        <w:rPr>
+          <w:rFonts w:ascii="Arial" w:hAnsi="Arial" w:cs="Arial"/>
+        </w:rPr>
+        <w:t xml:space="preserve">Si </w:t>
+      </w:r>
+      <w:r>
+        <w:rPr>
+          <w:rFonts w:ascii="Arial" w:hAnsi="Arial" w:cs="Arial"/>
+        </w:rPr>
+        <w:t xml:space="preserve">se </w:t>
+      </w:r>
+      <w:r>
+        <w:rPr>
+          <w:rFonts w:ascii="Arial" w:hAnsi="Arial" w:cs="Arial"/>
+        </w:rPr>
+        <w:t xml:space="preserve">tiene 2 monedas de 10 y una de 5, se mejora usando 25. </w:t>
+      </w:r>
+    </w:p>
+    <w:p>
+      <w:pPr>
+        <w:pStyle w:val="ListParagraph"/>
+        <w:numPr>
+          <w:ilvl w:val="0"/>
+          <w:numId w:val="3"/>
+        </w:numPr>
+        <w:jc w:val="both"/>
+        <w:rPr>
+          <w:rFonts w:ascii="Arial" w:hAnsi="Arial" w:cs="Arial"/>
+        </w:rPr>
+      </w:pPr>
+      <w:r>
+        <w:rPr>
+          <w:rFonts w:ascii="Arial" w:hAnsi="Arial" w:cs="Arial"/>
+        </w:rPr>
+        <w:t xml:space="preserve">Si </w:t>
+      </w:r>
+      <w:r>
+        <w:rPr>
+          <w:rFonts w:ascii="Arial" w:hAnsi="Arial" w:cs="Arial"/>
+        </w:rPr>
+        <w:t xml:space="preserve">se </w:t>
+      </w:r>
+      <w:r>
+        <w:rPr>
+          <w:rFonts w:ascii="Arial" w:hAnsi="Arial" w:cs="Arial"/>
+        </w:rPr>
+        <w:t xml:space="preserve">tiene muchas monedas de 1 o de 5, también se puede reemplazar por monedas más grandes. </w:t>
+      </w:r>
+    </w:p>
+    <w:p>
+      <w:pPr>
+        <w:pStyle w:val="ListParagraph"/>
+        <w:numPr>
+          <w:ilvl w:val="0"/>
+          <w:numId w:val="3"/>
+        </w:numPr>
+        <w:jc w:val="both"/>
+        <w:rPr>
+          <w:rFonts w:ascii="Arial" w:hAnsi="Arial" w:cs="Arial"/>
+        </w:rPr>
+      </w:pPr>
+    </w:p>
+    <w:p>
+      <w:pPr>
+        <w:pStyle w:val="ListParagraph"/>
+        <w:ind w:left="708"/>
+        <w:jc w:val="both"/>
+        <w:rPr>
+          <w:rFonts w:ascii="Arial" w:hAnsi="Arial" w:cs="Arial"/>
+        </w:rPr>
+      </w:pPr>
+      <w:r>
+        <w:rPr>
+          <w:rFonts w:ascii="Arial" w:hAnsi="Arial" w:cs="Arial"/>
+        </w:rPr>
+        <w:t xml:space="preserve">Por tanto, para cualquier </w:t>
+      </w:r>
+      <m:oMath>
+        <m:r>
+          <w:rPr>
+            <w:rFonts w:ascii="Cambria Math" w:hAnsi="Cambria Math" w:cs="Arial"/>
+          </w:rPr>
+          <m:t>m</m:t>
+        </m:r>
+      </m:oMath>
+      <w:r>
+        <w:rPr>
+          <w:rFonts w:ascii="Arial" w:hAnsi="Arial" w:cs="Arial"/>
+        </w:rPr>
+        <w:t xml:space="preserve"> ≥ 25, existe una solución óptima que usa una moneda de 25. Entonces la decisión greedy de tomar 25 es segura.</w:t>
+      </w:r>
+    </w:p>
+    <w:p>
+      <w:pPr>
+        <w:pStyle w:val="ListParagraph"/>
+        <w:ind w:left="708"/>
+        <w:jc w:val="both"/>
+        <w:rPr>
+          <w:rFonts w:ascii="Arial" w:hAnsi="Arial" w:cs="Arial"/>
+        </w:rPr>
+      </w:pPr>
+      <w:r>
+        <w:rPr>
+          <w:rFonts w:ascii="Arial" w:hAnsi="Arial" w:cs="Arial"/>
+        </w:rPr>
+        <w:t xml:space="preserve">Luego queda el subproblema </w:t>
+      </w:r>
+      <m:oMath>
+        <m:r>
+          <w:rPr>
+            <w:rFonts w:ascii="Cambria Math" w:hAnsi="Cambria Math" w:cs="Arial"/>
+          </w:rPr>
+          <m:t>m</m:t>
+        </m:r>
+      </m:oMath>
+      <w:r>
+        <w:rPr>
+          <w:rFonts w:ascii="Arial" w:hAnsi="Arial" w:cs="Arial"/>
+        </w:rPr>
+        <w:t xml:space="preserve"> - 25. Por subestructura óptima, el resto también debe resolverse óptimamente.</w:t>
+      </w:r>
+      <w:r>
+        <w:rPr>
+          <w:rFonts w:ascii="Arial" w:hAnsi="Arial" w:cs="Arial"/>
+        </w:rPr>
+        <w:t xml:space="preserve"> </w:t>
+      </w:r>
+      <w:r>
+        <w:rPr>
+          <w:rFonts w:ascii="Arial" w:hAnsi="Arial" w:cs="Arial"/>
+        </w:rPr>
+        <w:t>El mismo razonamiento se aplica a los montos menores:</w:t>
+      </w:r>
+    </w:p>
+    <w:p>
+      <w:pPr>
+        <w:pStyle w:val="ListParagraph"/>
+        <w:numPr>
+          <w:ilvl w:val="0"/>
+          <w:numId w:val="4"/>
+        </w:numPr>
+        <w:jc w:val="both"/>
+        <w:rPr>
+          <w:rFonts w:ascii="Arial" w:hAnsi="Arial" w:cs="Arial"/>
+        </w:rPr>
+      </w:pPr>
+      <w:r>
+        <w:rPr>
+          <w:rFonts w:ascii="Arial" w:hAnsi="Arial" w:cs="Arial"/>
+        </w:rPr>
+        <w:lastRenderedPageBreak/>
+        <w:t>Si 10 ≤</w:t>
+      </w:r>
+      <w:r>
+        <w:rPr>
+          <w:rFonts w:ascii="Arial" w:hAnsi="Arial" w:cs="Arial"/>
+        </w:rPr>
+        <w:t xml:space="preserve"> </w:t>
+      </w:r>
+      <m:oMath>
+        <m:r>
+          <w:rPr>
+            <w:rFonts w:ascii="Cambria Math" w:hAnsi="Cambria Math" w:cs="Arial"/>
+          </w:rPr>
+          <m:t>m</m:t>
+        </m:r>
+      </m:oMath>
+      <w:r>
+        <w:rPr>
+          <w:rFonts w:ascii="Arial" w:hAnsi="Arial" w:cs="Arial"/>
+        </w:rPr>
+        <w:t xml:space="preserve"> &lt; 25, una solución óptima debe usar una moneda de 10</w:t>
+      </w:r>
+      <w:r>
+        <w:rPr>
+          <w:rFonts w:ascii="Arial" w:hAnsi="Arial" w:cs="Arial"/>
+        </w:rPr>
+        <w:t>,</w:t>
+      </w:r>
+      <w:r>
+        <w:rPr>
+          <w:rFonts w:ascii="Arial" w:hAnsi="Arial" w:cs="Arial"/>
+        </w:rPr>
+        <w:t xml:space="preserve"> si no, </w:t>
+      </w:r>
+      <w:r>
+        <w:rPr>
+          <w:rFonts w:ascii="Arial" w:hAnsi="Arial" w:cs="Arial"/>
+        </w:rPr>
+        <w:t xml:space="preserve">se </w:t>
+      </w:r>
+      <w:r>
+        <w:rPr>
+          <w:rFonts w:ascii="Arial" w:hAnsi="Arial" w:cs="Arial"/>
+        </w:rPr>
+        <w:t xml:space="preserve">usaría monedas de 5 y 1, pero dos monedas de 5 se reemplazan por una de 10. </w:t>
+      </w:r>
+    </w:p>
+    <w:p>
+      <w:pPr>
+        <w:pStyle w:val="ListParagraph"/>
+        <w:numPr>
+          <w:ilvl w:val="0"/>
+          <w:numId w:val="4"/>
+        </w:numPr>
+        <w:jc w:val="both"/>
+        <w:rPr>
+          <w:rFonts w:ascii="Arial" w:hAnsi="Arial" w:cs="Arial"/>
+        </w:rPr>
+      </w:pPr>
+      <w:r>
+        <w:rPr>
+          <w:rFonts w:ascii="Arial" w:hAnsi="Arial" w:cs="Arial"/>
+        </w:rPr>
+        <w:t xml:space="preserve">Si 5 ≤ </w:t>
+      </w:r>
+      <m:oMath>
+        <m:r>
+          <w:rPr>
+            <w:rFonts w:ascii="Cambria Math" w:hAnsi="Cambria Math" w:cs="Arial"/>
+          </w:rPr>
+          <m:t>m</m:t>
+        </m:r>
+      </m:oMath>
+      <w:r>
+        <w:rPr>
+          <w:rFonts w:ascii="Arial" w:hAnsi="Arial" w:cs="Arial"/>
+        </w:rPr>
+        <w:t xml:space="preserve"> </w:t>
+      </w:r>
+      <w:r>
+        <w:rPr>
+          <w:rFonts w:ascii="Arial" w:hAnsi="Arial" w:cs="Arial"/>
+        </w:rPr>
+        <w:t>&lt; 10, una solución óptima debe usar una moneda de 5</w:t>
+      </w:r>
+      <w:r>
+        <w:rPr>
+          <w:rFonts w:ascii="Arial" w:hAnsi="Arial" w:cs="Arial"/>
+        </w:rPr>
+        <w:t>,</w:t>
+      </w:r>
+      <w:r>
+        <w:rPr>
+          <w:rFonts w:ascii="Arial" w:hAnsi="Arial" w:cs="Arial"/>
+        </w:rPr>
+        <w:t xml:space="preserve"> si no</w:t>
+      </w:r>
+      <w:r>
+        <w:rPr>
+          <w:rFonts w:ascii="Arial" w:hAnsi="Arial" w:cs="Arial"/>
+        </w:rPr>
+        <w:t xml:space="preserve"> se</w:t>
+      </w:r>
+      <w:r>
+        <w:rPr>
+          <w:rFonts w:ascii="Arial" w:hAnsi="Arial" w:cs="Arial"/>
+        </w:rPr>
+        <w:t xml:space="preserve"> usaría al menos cinco monedas de 1, reemplazables por una de 5. </w:t>
+      </w:r>
+    </w:p>
+    <w:p>
+      <w:pPr>
+        <w:pStyle w:val="ListParagraph"/>
+        <w:numPr>
+          <w:ilvl w:val="0"/>
+          <w:numId w:val="4"/>
+        </w:numPr>
+        <w:jc w:val="both"/>
+        <w:rPr>
+          <w:rFonts w:ascii="Arial" w:hAnsi="Arial" w:cs="Arial"/>
+        </w:rPr>
+      </w:pPr>
+      <w:r>
+        <w:rPr>
+          <w:rFonts w:ascii="Arial" w:hAnsi="Arial" w:cs="Arial"/>
+        </w:rPr>
+        <w:t xml:space="preserve">Si </w:t>
+      </w:r>
+      <w:r>
+        <w:rPr>
+          <w:rFonts w:ascii="Arial" w:eastAsiaTheme="minorEastAsia" w:hAnsi="Arial" w:cs="Arial"/>
+        </w:rPr>
+        <w:t xml:space="preserve"> </w:t>
+      </w:r>
+      <m:oMath>
+        <m:r>
+          <w:rPr>
+            <w:rFonts w:ascii="Cambria Math" w:hAnsi="Cambria Math" w:cs="Arial"/>
+          </w:rPr>
+          <m:t>m</m:t>
+        </m:r>
+      </m:oMath>
+      <w:r>
+        <w:rPr>
+          <w:rFonts w:ascii="Arial" w:hAnsi="Arial" w:cs="Arial"/>
+        </w:rPr>
+        <w:t xml:space="preserve"> </w:t>
+      </w:r>
+      <w:r>
+        <w:rPr>
+          <w:rFonts w:ascii="Arial" w:hAnsi="Arial" w:cs="Arial"/>
+        </w:rPr>
+        <w:t xml:space="preserve">&lt; 5, solo queda usar monedas de 1. </w:t>
+      </w:r>
+    </w:p>
+    <w:p>
+      <w:pPr>
+        <w:pStyle w:val="ListParagraph"/>
+        <w:ind w:left="708"/>
+        <w:jc w:val="both"/>
+        <w:rPr>
+          <w:rFonts w:ascii="Arial" w:hAnsi="Arial" w:cs="Arial"/>
+        </w:rPr>
+      </w:pPr>
+    </w:p>
+    <w:p>
+      <w:pPr>
+        <w:pStyle w:val="ListParagraph"/>
+        <w:ind w:left="708"/>
+        <w:jc w:val="both"/>
+        <w:rPr>
+          <w:rFonts w:ascii="Arial" w:hAnsi="Arial" w:cs="Arial"/>
+        </w:rPr>
+      </w:pPr>
+      <w:r>
+        <w:rPr>
+          <w:rFonts w:ascii="Arial" w:hAnsi="Arial" w:cs="Arial"/>
+        </w:rPr>
+        <w:t>Así</w:t>
+      </w:r>
+      <w:r>
+        <w:rPr>
+          <w:rFonts w:ascii="Arial" w:hAnsi="Arial" w:cs="Arial"/>
+        </w:rPr>
+        <w:t xml:space="preserve"> </w:t>
+      </w:r>
+      <w:r>
+        <w:rPr>
+          <w:rFonts w:ascii="Arial" w:hAnsi="Arial" w:cs="Arial"/>
+        </w:rPr>
+        <w:t xml:space="preserve">en cada paso, la moneda más grande posible pertenece a alguna solución óptima. Por eso el problema tiene </w:t>
+      </w:r>
+      <w:proofErr w:type="spellStart"/>
+      <w:r>
+        <w:rPr>
+          <w:rFonts w:ascii="Arial" w:hAnsi="Arial" w:cs="Arial"/>
+        </w:rPr>
+        <w:t>greedy-choice</w:t>
+      </w:r>
+      <w:proofErr w:type="spellEnd"/>
+      <w:r>
+        <w:rPr>
+          <w:rFonts w:ascii="Arial" w:hAnsi="Arial" w:cs="Arial"/>
+        </w:rPr>
+        <w:t xml:space="preserve"> </w:t>
+      </w:r>
+      <w:proofErr w:type="spellStart"/>
+      <w:r>
+        <w:rPr>
+          <w:rFonts w:ascii="Arial" w:hAnsi="Arial" w:cs="Arial"/>
+        </w:rPr>
+        <w:t>property</w:t>
+      </w:r>
+      <w:proofErr w:type="spellEnd"/>
+      <w:r>
+        <w:rPr>
+          <w:rFonts w:ascii="Arial" w:hAnsi="Arial" w:cs="Arial"/>
+        </w:rPr>
+        <w:t>.</w:t>
+      </w:r>
+    </w:p>
+    <w:p>
+      <w:pPr>
+        <w:pStyle w:val="ListParagraph"/>
+        <w:ind w:left="708"/>
+        <w:jc w:val="both"/>
+        <w:rPr>
+          <w:rFonts w:ascii="Arial" w:hAnsi="Arial" w:cs="Arial"/>
+        </w:rPr>
+      </w:pPr>
+    </w:p>
+    <w:p>
+      <w:pPr>
+        <w:pStyle w:val="ListParagraph"/>
+        <w:ind w:left="708"/>
+        <w:jc w:val="both"/>
+        <w:rPr>
+          <w:rFonts w:ascii="Arial" w:hAnsi="Arial" w:cs="Arial"/>
+        </w:rPr>
+      </w:pPr>
+      <w:r>
+        <w:rPr>
+          <w:rFonts w:ascii="Arial" w:hAnsi="Arial" w:cs="Arial"/>
+        </w:rPr>
+        <w:t>Pseudocódigo:</w:t>
+      </w:r>
+    </w:p>
+    <w:p>
+      <w:pPr>
+        <w:pStyle w:val="ListParagraph"/>
+        <w:ind w:left="708"/>
+        <w:jc w:val="both"/>
+        <w:rPr>
+          <w:rFonts w:ascii="Arial" w:hAnsi="Arial" w:cs="Arial"/>
+        </w:rPr>
+      </w:pPr>
+    </w:p>
+    <w:p>
+      <w:pPr>
+        <w:pStyle w:val="ListParagraph"/>
+        <w:ind w:left="708"/>
+        <w:jc w:val="both"/>
+        <w:rPr>
+          <w:rFonts w:ascii="Arial" w:hAnsi="Arial" w:cs="Arial"/>
+        </w:rPr>
+      </w:pPr>
+      <w:proofErr w:type="spellStart"/>
+      <w:r>
+        <w:rPr>
+          <w:rFonts w:ascii="Arial" w:hAnsi="Arial" w:cs="Arial"/>
+        </w:rPr>
+        <w:t>hacer_sencillo</w:t>
+      </w:r>
+      <w:proofErr w:type="spellEnd"/>
+      <w:r>
+        <w:rPr>
+          <w:rFonts w:ascii="Arial" w:hAnsi="Arial" w:cs="Arial"/>
+        </w:rPr>
+        <w:t>(m</w:t>
+      </w:r>
+      <w:r>
+        <w:rPr>
+          <w:rFonts w:ascii="Arial" w:hAnsi="Arial" w:cs="Arial"/>
+        </w:rPr>
+        <w:t>onto</w:t>
+      </w:r>
+      <w:r>
+        <w:rPr>
+          <w:rFonts w:ascii="Arial" w:hAnsi="Arial" w:cs="Arial"/>
+        </w:rPr>
+        <w:t>)</w:t>
+      </w:r>
+    </w:p>
+    <w:p>
+      <w:pPr>
+        <w:pStyle w:val="ListParagraph"/>
+        <w:ind w:left="708"/>
+        <w:jc w:val="both"/>
+        <w:rPr>
+          <w:rFonts w:ascii="Arial" w:hAnsi="Arial" w:cs="Arial"/>
+        </w:rPr>
+      </w:pPr>
+      <w:r>
+        <w:rPr>
+          <w:rFonts w:ascii="Arial" w:hAnsi="Arial" w:cs="Arial"/>
+        </w:rPr>
+        <w:t xml:space="preserve">    monedas = [25, 10, 5, 1]</w:t>
+      </w:r>
+    </w:p>
+    <w:p>
+      <w:pPr>
+        <w:pStyle w:val="ListParagraph"/>
+        <w:ind w:left="708"/>
+        <w:jc w:val="both"/>
+        <w:rPr>
+          <w:rFonts w:ascii="Arial" w:hAnsi="Arial" w:cs="Arial"/>
+        </w:rPr>
+      </w:pPr>
+      <w:r>
+        <w:rPr>
+          <w:rFonts w:ascii="Arial" w:hAnsi="Arial" w:cs="Arial"/>
+        </w:rPr>
+        <w:t xml:space="preserve">    </w:t>
+      </w:r>
+      <w:r>
+        <w:rPr>
+          <w:rFonts w:ascii="Arial" w:hAnsi="Arial" w:cs="Arial"/>
+        </w:rPr>
+        <w:t>resultado</w:t>
+      </w:r>
+      <w:r>
+        <w:rPr>
+          <w:rFonts w:ascii="Arial" w:hAnsi="Arial" w:cs="Arial"/>
+        </w:rPr>
+        <w:t xml:space="preserve"> = {}</w:t>
+      </w:r>
+    </w:p>
+    <w:p>
+      <w:pPr>
+        <w:pStyle w:val="ListParagraph"/>
+        <w:ind w:left="708"/>
+        <w:jc w:val="both"/>
+        <w:rPr>
+          <w:rFonts w:ascii="Arial" w:hAnsi="Arial" w:cs="Arial"/>
+        </w:rPr>
+      </w:pPr>
+    </w:p>
+    <w:p>
+      <w:pPr>
+        <w:pStyle w:val="ListParagraph"/>
+        <w:ind w:left="708"/>
+        <w:jc w:val="both"/>
+        <w:rPr>
+          <w:rFonts w:ascii="Arial" w:hAnsi="Arial" w:cs="Arial"/>
+        </w:rPr>
+      </w:pPr>
+      <w:r>
+        <w:rPr>
+          <w:rFonts w:ascii="Arial" w:hAnsi="Arial" w:cs="Arial"/>
+        </w:rPr>
+        <w:t xml:space="preserve">    para cada </w:t>
+      </w:r>
+      <w:r>
+        <w:rPr>
+          <w:rFonts w:ascii="Arial" w:hAnsi="Arial" w:cs="Arial"/>
+        </w:rPr>
+        <w:t>moneda en</w:t>
+      </w:r>
+      <w:r>
+        <w:rPr>
+          <w:rFonts w:ascii="Arial" w:hAnsi="Arial" w:cs="Arial"/>
+        </w:rPr>
+        <w:t xml:space="preserve"> monedas:</w:t>
+      </w:r>
+    </w:p>
+    <w:p>
+      <w:pPr>
+        <w:pStyle w:val="ListParagraph"/>
+        <w:ind w:left="708"/>
+        <w:jc w:val="both"/>
+        <w:rPr>
+          <w:rFonts w:ascii="Arial" w:hAnsi="Arial" w:cs="Arial"/>
+        </w:rPr>
+      </w:pPr>
+      <w:r>
+        <w:rPr>
+          <w:rFonts w:ascii="Arial" w:hAnsi="Arial" w:cs="Arial"/>
+        </w:rPr>
+        <w:t xml:space="preserve">        cantidad = m</w:t>
+      </w:r>
+      <w:r>
+        <w:rPr>
+          <w:rFonts w:ascii="Arial" w:hAnsi="Arial" w:cs="Arial"/>
+        </w:rPr>
+        <w:t>onto</w:t>
+      </w:r>
+      <w:r>
+        <w:rPr>
+          <w:rFonts w:ascii="Arial" w:hAnsi="Arial" w:cs="Arial"/>
+        </w:rPr>
+        <w:t xml:space="preserve"> // </w:t>
+      </w:r>
+      <w:r>
+        <w:rPr>
+          <w:rFonts w:ascii="Arial" w:hAnsi="Arial" w:cs="Arial"/>
+        </w:rPr>
+        <w:t>moneda</w:t>
+      </w:r>
+    </w:p>
+    <w:p>
+      <w:pPr>
+        <w:pStyle w:val="ListParagraph"/>
+        <w:ind w:left="708"/>
+        <w:jc w:val="both"/>
+        <w:rPr>
+          <w:rFonts w:ascii="Arial" w:hAnsi="Arial" w:cs="Arial"/>
+        </w:rPr>
+      </w:pPr>
+      <w:r>
+        <w:rPr>
+          <w:rFonts w:ascii="Arial" w:hAnsi="Arial" w:cs="Arial"/>
+        </w:rPr>
+        <w:t xml:space="preserve">        </w:t>
+      </w:r>
+      <w:r>
+        <w:rPr>
+          <w:rFonts w:ascii="Arial" w:hAnsi="Arial" w:cs="Arial"/>
+        </w:rPr>
+        <w:t>resultado</w:t>
+      </w:r>
+      <w:r>
+        <w:rPr>
+          <w:rFonts w:ascii="Arial" w:hAnsi="Arial" w:cs="Arial"/>
+        </w:rPr>
+        <w:t>[</w:t>
+      </w:r>
+      <w:r>
+        <w:rPr>
+          <w:rFonts w:ascii="Arial" w:hAnsi="Arial" w:cs="Arial"/>
+        </w:rPr>
+        <w:t>moneda</w:t>
+      </w:r>
+      <w:r>
+        <w:rPr>
+          <w:rFonts w:ascii="Arial" w:hAnsi="Arial" w:cs="Arial"/>
+        </w:rPr>
+        <w:t>] = cantidad</w:t>
+      </w:r>
+    </w:p>
+    <w:p>
+      <w:pPr>
+        <w:pStyle w:val="ListParagraph"/>
+        <w:ind w:left="708"/>
+        <w:jc w:val="both"/>
+        <w:rPr>
+          <w:rFonts w:ascii="Arial" w:hAnsi="Arial" w:cs="Arial"/>
+        </w:rPr>
+      </w:pPr>
+      <w:r>
+        <w:rPr>
+          <w:rFonts w:ascii="Arial" w:hAnsi="Arial" w:cs="Arial"/>
+        </w:rPr>
+        <w:t xml:space="preserve">        m</w:t>
+      </w:r>
+      <w:r>
+        <w:rPr>
+          <w:rFonts w:ascii="Arial" w:hAnsi="Arial" w:cs="Arial"/>
+        </w:rPr>
+        <w:t>onto</w:t>
+      </w:r>
+      <w:r>
+        <w:rPr>
+          <w:rFonts w:ascii="Arial" w:hAnsi="Arial" w:cs="Arial"/>
+        </w:rPr>
+        <w:t xml:space="preserve"> = m</w:t>
+      </w:r>
+      <w:r>
+        <w:rPr>
+          <w:rFonts w:ascii="Arial" w:hAnsi="Arial" w:cs="Arial"/>
+        </w:rPr>
+        <w:t>onto</w:t>
+      </w:r>
+      <w:r>
+        <w:rPr>
+          <w:rFonts w:ascii="Arial" w:hAnsi="Arial" w:cs="Arial"/>
+        </w:rPr>
+        <w:t xml:space="preserve"> % </w:t>
+      </w:r>
+      <w:r>
+        <w:rPr>
+          <w:rFonts w:ascii="Arial" w:hAnsi="Arial" w:cs="Arial"/>
+        </w:rPr>
+        <w:t>moneda</w:t>
+      </w:r>
+    </w:p>
+    <w:p>
+      <w:pPr>
+        <w:pStyle w:val="ListParagraph"/>
+        <w:ind w:left="708"/>
+        <w:jc w:val="both"/>
+        <w:rPr>
+          <w:rFonts w:ascii="Arial" w:hAnsi="Arial" w:cs="Arial"/>
+        </w:rPr>
+      </w:pPr>
+    </w:p>
+    <w:p>
+      <w:pPr>
+        <w:pStyle w:val="ListParagraph"/>
+        <w:ind w:left="708"/>
+        <w:jc w:val="both"/>
+        <w:rPr>
+          <w:rFonts w:ascii="Arial" w:hAnsi="Arial" w:cs="Arial"/>
+        </w:rPr>
+      </w:pPr>
+      <w:r>
+        <w:rPr>
+          <w:rFonts w:ascii="Arial" w:hAnsi="Arial" w:cs="Arial"/>
+        </w:rPr>
+        <w:t xml:space="preserve">    retornar </w:t>
+      </w:r>
+      <w:r>
+        <w:rPr>
+          <w:rFonts w:ascii="Arial" w:hAnsi="Arial" w:cs="Arial"/>
+        </w:rPr>
+        <w:t>resultado</w:t>
+      </w:r>
+    </w:p>
+    <w:p>
+      <w:pPr>
+        <w:pStyle w:val="ListParagraph"/>
+        <w:ind w:left="708"/>
+        <w:jc w:val="both"/>
+        <w:rPr>
+          <w:rFonts w:ascii="Arial" w:hAnsi="Arial" w:cs="Arial"/>
+        </w:rPr>
+      </w:pPr>
+    </w:p>
+    <w:p>
+      <w:pPr>
+        <w:pStyle w:val="ListParagraph"/>
+        <w:ind w:left="708"/>
+        <w:jc w:val="both"/>
+        <w:rPr>
+          <w:rFonts w:ascii="Arial" w:hAnsi="Arial" w:cs="Arial"/>
+        </w:rPr>
+      </w:pPr>
+      <w:r>
+        <w:rPr>
+          <w:rFonts w:ascii="Arial" w:hAnsi="Arial" w:cs="Arial"/>
+        </w:rPr>
+        <w:t>Código y resultados:</w:t>
+      </w:r>
+    </w:p>
+    <w:p>
+      <w:pPr>
+        <w:pStyle w:val="ListParagraph"/>
+        <w:ind w:left="708"/>
+        <w:jc w:val="both"/>
+        <w:rPr>
+          <w:rFonts w:ascii="Arial" w:hAnsi="Arial" w:cs="Arial"/>
+        </w:rPr>
+      </w:pPr>
+      <w:r>
+        <w:rPr>
+          <w:rFonts w:ascii="Arial" w:hAnsi="Arial" w:cs="Arial"/>
+        </w:rPr>
+        <w:drawing>
+          <wp:inline distT="0" distB="0" distL="0" distR="0" wp14:anchorId="21A556CF" wp14:editId="5F1436DB">
+            <wp:extent cx="5067448" cy="3328416"/>
+            <wp:effectExtent l="0" t="0" r="0" b="5715"/>
+            <wp:docPr id="747170419" name="Picture 1"/>
+            <wp:cNvGraphicFramePr>
+              <a:graphicFrameLocks xmlns:a="http://schemas.openxmlformats.org/drawingml/2006/main" noChangeAspect="1"/>
+            </wp:cNvGraphicFramePr>
+            <a:graphic xmlns:a="http://schemas.openxmlformats.org/drawingml/2006/main">
+              <a:graphicData uri="http://schemas.openxmlformats.org/drawingml/2006/picture">
+                <pic:pic xmlns:pic="http://schemas.openxmlformats.org/drawingml/2006/picture">
+                  <pic:nvPicPr>
+                    <pic:cNvPr id="747170419" name=""/>
+                    <pic:cNvPicPr/>
+                  </pic:nvPicPr>
+                  <pic:blipFill>
+                    <a:blip r:embed="rId5"/>
+                    <a:stretch>
+                      <a:fillRect/>
+                    </a:stretch>
+                  </pic:blipFill>
+                  <pic:spPr>
+                    <a:xfrm>
+                      <a:off x="0" y="0"/>
+                      <a:ext cx="5087399" cy="3341521"/>
+                    </a:xfrm>
+                    <a:prstGeom prst="rect">
+                      <a:avLst/>
+                    </a:prstGeom>
+                  </pic:spPr>
+                </pic:pic>
+              </a:graphicData>
+            </a:graphic>
+          </wp:inline>
+        </w:drawing>
+      </w:r>
+    </w:p>
+    <w:p>
+      <w:pPr>
+        <w:pStyle w:val="ListParagraph"/>
+        <w:ind w:left="708"/>
+        <w:jc w:val="both"/>
+        <w:rPr>
+          <w:rFonts w:ascii="Arial" w:hAnsi="Arial" w:cs="Arial"/>
+        </w:rPr>
+      </w:pPr>
     </w:p>
     <w:sectPr>
       <w:pgSz w:w="12240" w:h="15840"/>
@@ -1159,6 +2705,155 @@
 <file path=word/numbering.xml><?xml version="1.0" encoding="utf-8"?>
 <w:numbering xmlns:wpc="http://schemas.microsoft.com/office/word/2010/wordprocessingCanvas" xmlns:cx="http://schemas.microsoft.com/office/drawing/2014/chartex" xmlns:cx1="http://schemas.microsoft.com/office/drawing/2015/9/8/chartex" xmlns:cx2="http://schemas.microsoft.com/office/drawing/2015/10/21/chartex" xmlns:cx3="http://schemas.microsoft.com/office/drawing/2016/5/9/chartex" xmlns:cx4="http://schemas.microsoft.com/office/drawing/2016/5/10/chartex" xmlns:cx5="http://schemas.microsoft.com/office/drawing/2016/5/11/chartex" xmlns:cx6="http://schemas.microsoft.com/office/drawing/2016/5/12/chartex" xmlns:cx7="http://schemas.microsoft.com/office/drawing/2016/5/13/chartex" xmlns:cx8="http://schemas.microsoft.com/office/drawing/2016/5/14/chartex" xmlns:mc="http://schemas.openxmlformats.org/markup-compatibility/2006" xmlns:aink="http://schemas.microsoft.com/office/drawing/2016/ink" xmlns:am3d="http://schemas.microsoft.com/office/drawing/2017/model3d" xmlns:o="urn:schemas-microsoft-com:office:office" xmlns:oel="http://schemas.microsoft.com/office/2019/extlst" xmlns:r="http://schemas.openxmlformats.org/officeDocument/2006/relationships" xmlns:m="http://schemas.openxmlformats.org/officeDocument/2006/math" xmlns:v="urn:schemas-microsoft-com:vml" xmlns:wp14="http://schemas.microsoft.com/office/word/2010/wordprocessingDrawing" xmlns:wp="http://schemas.openxmlformats.org/drawingml/2006/wordprocessingDrawing" xmlns:w10="urn:schemas-microsoft-com:office:word" xmlns:w="http://schemas.openxmlformats.org/wordprocessingml/2006/main" xmlns:w14="http://schemas.microsoft.com/office/word/2010/wordml" xmlns:w15="http://schemas.microsoft.com/office/word/2012/wordml" xmlns:w16cex="http://schemas.microsoft.com/office/word/2018/wordml/cex" xmlns:w16cid="http://schemas.microsoft.com/office/word/2016/wordml/cid" xmlns:w16="http://schemas.microsoft.com/office/word/2018/wordml" xmlns:w16du="http://schemas.microsoft.com/office/word/2023/wordml/word16du" xmlns:w16sdtdh="http://schemas.microsoft.com/office/word/2020/wordml/sdtdatahash" xmlns:w16sdtfl="http://schemas.microsoft.com/office/word/2024/wordml/sdtformatlock" xmlns:w16se="http://schemas.microsoft.com/office/word/2015/wordml/symex" xmlns:wpg="http://schemas.microsoft.com/office/word/2010/wordprocessingGroup" xmlns:wpi="http://schemas.microsoft.com/office/word/2010/wordprocessingInk" xmlns:wne="http://schemas.microsoft.com/office/word/2006/wordml" xmlns:wps="http://schemas.microsoft.com/office/word/2010/wordprocessingShape" mc:Ignorable="w14 w15 w16se w16cid w16 w16cex w16sdtdh w16sdtfl w16du wp14">
   <w:abstractNum w:abstractNumId="0" w15:restartNumberingAfterBreak="0">
+    <w:nsid w:val="09467FAD"/>
+    <w:multiLevelType w:val="multilevel"/>
+    <w:tmpl w:val="BFEC68F2"/>
+    <w:lvl w:ilvl="0">
+      <w:start w:val="1"/>
+      <w:numFmt w:val="bullet"/>
+      <w:lvlText w:val=""/>
+      <w:lvlJc w:val="left"/>
+      <w:pPr>
+        <w:tabs>
+          <w:tab w:val="num" w:pos="1068"/>
+        </w:tabs>
+        <w:ind w:left="1068" w:hanging="360"/>
+      </w:pPr>
+      <w:rPr>
+        <w:rFonts w:ascii="Symbol" w:hAnsi="Symbol" w:hint="default"/>
+        <w:sz w:val="20"/>
+      </w:rPr>
+    </w:lvl>
+    <w:lvl w:ilvl="1" w:tentative="1">
+      <w:start w:val="1"/>
+      <w:numFmt w:val="bullet"/>
+      <w:lvlText w:val="o"/>
+      <w:lvlJc w:val="left"/>
+      <w:pPr>
+        <w:tabs>
+          <w:tab w:val="num" w:pos="1788"/>
+        </w:tabs>
+        <w:ind w:left="1788" w:hanging="360"/>
+      </w:pPr>
+      <w:rPr>
+        <w:rFonts w:ascii="Courier New" w:hAnsi="Courier New" w:hint="default"/>
+        <w:sz w:val="20"/>
+      </w:rPr>
+    </w:lvl>
+    <w:lvl w:ilvl="2" w:tentative="1">
+      <w:start w:val="1"/>
+      <w:numFmt w:val="bullet"/>
+      <w:lvlText w:val=""/>
+      <w:lvlJc w:val="left"/>
+      <w:pPr>
+        <w:tabs>
+          <w:tab w:val="num" w:pos="2508"/>
+        </w:tabs>
+        <w:ind w:left="2508" w:hanging="360"/>
+      </w:pPr>
+      <w:rPr>
+        <w:rFonts w:ascii="Wingdings" w:hAnsi="Wingdings" w:hint="default"/>
+        <w:sz w:val="20"/>
+      </w:rPr>
+    </w:lvl>
+    <w:lvl w:ilvl="3" w:tentative="1">
+      <w:start w:val="1"/>
+      <w:numFmt w:val="bullet"/>
+      <w:lvlText w:val=""/>
+      <w:lvlJc w:val="left"/>
+      <w:pPr>
+        <w:tabs>
+          <w:tab w:val="num" w:pos="3228"/>
+        </w:tabs>
+        <w:ind w:left="3228" w:hanging="360"/>
+      </w:pPr>
+      <w:rPr>
+        <w:rFonts w:ascii="Wingdings" w:hAnsi="Wingdings" w:hint="default"/>
+        <w:sz w:val="20"/>
+      </w:rPr>
+    </w:lvl>
+    <w:lvl w:ilvl="4" w:tentative="1">
+      <w:start w:val="1"/>
+      <w:numFmt w:val="bullet"/>
+      <w:lvlText w:val=""/>
+      <w:lvlJc w:val="left"/>
+      <w:pPr>
+        <w:tabs>
+          <w:tab w:val="num" w:pos="3948"/>
+        </w:tabs>
+        <w:ind w:left="3948" w:hanging="360"/>
+      </w:pPr>
+      <w:rPr>
+        <w:rFonts w:ascii="Wingdings" w:hAnsi="Wingdings" w:hint="default"/>
+        <w:sz w:val="20"/>
+      </w:rPr>
+    </w:lvl>
+    <w:lvl w:ilvl="5" w:tentative="1">
+      <w:start w:val="1"/>
+      <w:numFmt w:val="bullet"/>
+      <w:lvlText w:val=""/>
+      <w:lvlJc w:val="left"/>
+      <w:pPr>
+        <w:tabs>
+          <w:tab w:val="num" w:pos="4668"/>
+        </w:tabs>
+        <w:ind w:left="4668" w:hanging="360"/>
+      </w:pPr>
+      <w:rPr>
+        <w:rFonts w:ascii="Wingdings" w:hAnsi="Wingdings" w:hint="default"/>
+        <w:sz w:val="20"/>
+      </w:rPr>
+    </w:lvl>
+    <w:lvl w:ilvl="6" w:tentative="1">
+      <w:start w:val="1"/>
+      <w:numFmt w:val="bullet"/>
+      <w:lvlText w:val=""/>
+      <w:lvlJc w:val="left"/>
+      <w:pPr>
+        <w:tabs>
+          <w:tab w:val="num" w:pos="5388"/>
+        </w:tabs>
+        <w:ind w:left="5388" w:hanging="360"/>
+      </w:pPr>
+      <w:rPr>
+        <w:rFonts w:ascii="Wingdings" w:hAnsi="Wingdings" w:hint="default"/>
+        <w:sz w:val="20"/>
+      </w:rPr>
+    </w:lvl>
+    <w:lvl w:ilvl="7" w:tentative="1">
+      <w:start w:val="1"/>
+      <w:numFmt w:val="bullet"/>
+      <w:lvlText w:val=""/>
+      <w:lvlJc w:val="left"/>
+      <w:pPr>
+        <w:tabs>
+          <w:tab w:val="num" w:pos="6108"/>
+        </w:tabs>
+        <w:ind w:left="6108" w:hanging="360"/>
+      </w:pPr>
+      <w:rPr>
+        <w:rFonts w:ascii="Wingdings" w:hAnsi="Wingdings" w:hint="default"/>
+        <w:sz w:val="20"/>
+      </w:rPr>
+    </w:lvl>
+    <w:lvl w:ilvl="8" w:tentative="1">
+      <w:start w:val="1"/>
+      <w:numFmt w:val="bullet"/>
+      <w:lvlText w:val=""/>
+      <w:lvlJc w:val="left"/>
+      <w:pPr>
+        <w:tabs>
+          <w:tab w:val="num" w:pos="6828"/>
+        </w:tabs>
+        <w:ind w:left="6828" w:hanging="360"/>
+      </w:pPr>
+      <w:rPr>
+        <w:rFonts w:ascii="Wingdings" w:hAnsi="Wingdings" w:hint="default"/>
+        <w:sz w:val="20"/>
+      </w:rPr>
+    </w:lvl>
+  </w:abstractNum>
+  <w:abstractNum w:abstractNumId="1" w15:restartNumberingAfterBreak="0">
     <w:nsid w:val="385F5912"/>
     <w:multiLevelType w:val="hybridMultilevel"/>
     <w:tmpl w:val="9BBADB50"/>
@@ -1250,8 +2945,315 @@
       </w:pPr>
     </w:lvl>
   </w:abstractNum>
+  <w:abstractNum w:abstractNumId="2" w15:restartNumberingAfterBreak="0">
+    <w:nsid w:val="458842FC"/>
+    <w:multiLevelType w:val="multilevel"/>
+    <w:tmpl w:val="04C8AFB2"/>
+    <w:lvl w:ilvl="0">
+      <w:start w:val="1"/>
+      <w:numFmt w:val="bullet"/>
+      <w:lvlText w:val=""/>
+      <w:lvlJc w:val="left"/>
+      <w:pPr>
+        <w:tabs>
+          <w:tab w:val="num" w:pos="1068"/>
+        </w:tabs>
+        <w:ind w:left="1068" w:hanging="360"/>
+      </w:pPr>
+      <w:rPr>
+        <w:rFonts w:ascii="Symbol" w:hAnsi="Symbol" w:hint="default"/>
+        <w:sz w:val="20"/>
+      </w:rPr>
+    </w:lvl>
+    <w:lvl w:ilvl="1" w:tentative="1">
+      <w:start w:val="1"/>
+      <w:numFmt w:val="bullet"/>
+      <w:lvlText w:val="o"/>
+      <w:lvlJc w:val="left"/>
+      <w:pPr>
+        <w:tabs>
+          <w:tab w:val="num" w:pos="1788"/>
+        </w:tabs>
+        <w:ind w:left="1788" w:hanging="360"/>
+      </w:pPr>
+      <w:rPr>
+        <w:rFonts w:ascii="Courier New" w:hAnsi="Courier New" w:hint="default"/>
+        <w:sz w:val="20"/>
+      </w:rPr>
+    </w:lvl>
+    <w:lvl w:ilvl="2" w:tentative="1">
+      <w:start w:val="1"/>
+      <w:numFmt w:val="bullet"/>
+      <w:lvlText w:val=""/>
+      <w:lvlJc w:val="left"/>
+      <w:pPr>
+        <w:tabs>
+          <w:tab w:val="num" w:pos="2508"/>
+        </w:tabs>
+        <w:ind w:left="2508" w:hanging="360"/>
+      </w:pPr>
+      <w:rPr>
+        <w:rFonts w:ascii="Wingdings" w:hAnsi="Wingdings" w:hint="default"/>
+        <w:sz w:val="20"/>
+      </w:rPr>
+    </w:lvl>
+    <w:lvl w:ilvl="3" w:tentative="1">
+      <w:start w:val="1"/>
+      <w:numFmt w:val="bullet"/>
+      <w:lvlText w:val=""/>
+      <w:lvlJc w:val="left"/>
+      <w:pPr>
+        <w:tabs>
+          <w:tab w:val="num" w:pos="3228"/>
+        </w:tabs>
+        <w:ind w:left="3228" w:hanging="360"/>
+      </w:pPr>
+      <w:rPr>
+        <w:rFonts w:ascii="Wingdings" w:hAnsi="Wingdings" w:hint="default"/>
+        <w:sz w:val="20"/>
+      </w:rPr>
+    </w:lvl>
+    <w:lvl w:ilvl="4" w:tentative="1">
+      <w:start w:val="1"/>
+      <w:numFmt w:val="bullet"/>
+      <w:lvlText w:val=""/>
+      <w:lvlJc w:val="left"/>
+      <w:pPr>
+        <w:tabs>
+          <w:tab w:val="num" w:pos="3948"/>
+        </w:tabs>
+        <w:ind w:left="3948" w:hanging="360"/>
+      </w:pPr>
+      <w:rPr>
+        <w:rFonts w:ascii="Wingdings" w:hAnsi="Wingdings" w:hint="default"/>
+        <w:sz w:val="20"/>
+      </w:rPr>
+    </w:lvl>
+    <w:lvl w:ilvl="5" w:tentative="1">
+      <w:start w:val="1"/>
+      <w:numFmt w:val="bullet"/>
+      <w:lvlText w:val=""/>
+      <w:lvlJc w:val="left"/>
+      <w:pPr>
+        <w:tabs>
+          <w:tab w:val="num" w:pos="4668"/>
+        </w:tabs>
+        <w:ind w:left="4668" w:hanging="360"/>
+      </w:pPr>
+      <w:rPr>
+        <w:rFonts w:ascii="Wingdings" w:hAnsi="Wingdings" w:hint="default"/>
+        <w:sz w:val="20"/>
+      </w:rPr>
+    </w:lvl>
+    <w:lvl w:ilvl="6" w:tentative="1">
+      <w:start w:val="1"/>
+      <w:numFmt w:val="bullet"/>
+      <w:lvlText w:val=""/>
+      <w:lvlJc w:val="left"/>
+      <w:pPr>
+        <w:tabs>
+          <w:tab w:val="num" w:pos="5388"/>
+        </w:tabs>
+        <w:ind w:left="5388" w:hanging="360"/>
+      </w:pPr>
+      <w:rPr>
+        <w:rFonts w:ascii="Wingdings" w:hAnsi="Wingdings" w:hint="default"/>
+        <w:sz w:val="20"/>
+      </w:rPr>
+    </w:lvl>
+    <w:lvl w:ilvl="7" w:tentative="1">
+      <w:start w:val="1"/>
+      <w:numFmt w:val="bullet"/>
+      <w:lvlText w:val=""/>
+      <w:lvlJc w:val="left"/>
+      <w:pPr>
+        <w:tabs>
+          <w:tab w:val="num" w:pos="6108"/>
+        </w:tabs>
+        <w:ind w:left="6108" w:hanging="360"/>
+      </w:pPr>
+      <w:rPr>
+        <w:rFonts w:ascii="Wingdings" w:hAnsi="Wingdings" w:hint="default"/>
+        <w:sz w:val="20"/>
+      </w:rPr>
+    </w:lvl>
+    <w:lvl w:ilvl="8" w:tentative="1">
+      <w:start w:val="1"/>
+      <w:numFmt w:val="bullet"/>
+      <w:lvlText w:val=""/>
+      <w:lvlJc w:val="left"/>
+      <w:pPr>
+        <w:tabs>
+          <w:tab w:val="num" w:pos="6828"/>
+        </w:tabs>
+        <w:ind w:left="6828" w:hanging="360"/>
+      </w:pPr>
+      <w:rPr>
+        <w:rFonts w:ascii="Wingdings" w:hAnsi="Wingdings" w:hint="default"/>
+        <w:sz w:val="20"/>
+      </w:rPr>
+    </w:lvl>
+  </w:abstractNum>
+  <w:abstractNum w:abstractNumId="3" w15:restartNumberingAfterBreak="0">
+    <w:nsid w:val="77537F20"/>
+    <w:multiLevelType w:val="multilevel"/>
+    <w:tmpl w:val="981E46F6"/>
+    <w:lvl w:ilvl="0">
+      <w:start w:val="1"/>
+      <w:numFmt w:val="bullet"/>
+      <w:lvlText w:val=""/>
+      <w:lvlJc w:val="left"/>
+      <w:pPr>
+        <w:tabs>
+          <w:tab w:val="num" w:pos="720"/>
+        </w:tabs>
+        <w:ind w:left="720" w:hanging="360"/>
+      </w:pPr>
+      <w:rPr>
+        <w:rFonts w:ascii="Symbol" w:hAnsi="Symbol" w:hint="default"/>
+        <w:sz w:val="20"/>
+      </w:rPr>
+    </w:lvl>
+    <w:lvl w:ilvl="1" w:tentative="1">
+      <w:start w:val="1"/>
+      <w:numFmt w:val="bullet"/>
+      <w:lvlText w:val="o"/>
+      <w:lvlJc w:val="left"/>
+      <w:pPr>
+        <w:tabs>
+          <w:tab w:val="num" w:pos="1440"/>
+        </w:tabs>
+        <w:ind w:left="1440" w:hanging="360"/>
+      </w:pPr>
+      <w:rPr>
+        <w:rFonts w:ascii="Courier New" w:hAnsi="Courier New" w:hint="default"/>
+        <w:sz w:val="20"/>
+      </w:rPr>
+    </w:lvl>
+    <w:lvl w:ilvl="2" w:tentative="1">
+      <w:start w:val="1"/>
+      <w:numFmt w:val="bullet"/>
+      <w:lvlText w:val=""/>
+      <w:lvlJc w:val="left"/>
+      <w:pPr>
+        <w:tabs>
+          <w:tab w:val="num" w:pos="2160"/>
+        </w:tabs>
+        <w:ind w:left="2160" w:hanging="360"/>
+      </w:pPr>
+      <w:rPr>
+        <w:rFonts w:ascii="Wingdings" w:hAnsi="Wingdings" w:hint="default"/>
+        <w:sz w:val="20"/>
+      </w:rPr>
+    </w:lvl>
+    <w:lvl w:ilvl="3" w:tentative="1">
+      <w:start w:val="1"/>
+      <w:numFmt w:val="bullet"/>
+      <w:lvlText w:val=""/>
+      <w:lvlJc w:val="left"/>
+      <w:pPr>
+        <w:tabs>
+          <w:tab w:val="num" w:pos="2880"/>
+        </w:tabs>
+        <w:ind w:left="2880" w:hanging="360"/>
+      </w:pPr>
+      <w:rPr>
+        <w:rFonts w:ascii="Wingdings" w:hAnsi="Wingdings" w:hint="default"/>
+        <w:sz w:val="20"/>
+      </w:rPr>
+    </w:lvl>
+    <w:lvl w:ilvl="4" w:tentative="1">
+      <w:start w:val="1"/>
+      <w:numFmt w:val="bullet"/>
+      <w:lvlText w:val=""/>
+      <w:lvlJc w:val="left"/>
+      <w:pPr>
+        <w:tabs>
+          <w:tab w:val="num" w:pos="3600"/>
+        </w:tabs>
+        <w:ind w:left="3600" w:hanging="360"/>
+      </w:pPr>
+      <w:rPr>
+        <w:rFonts w:ascii="Wingdings" w:hAnsi="Wingdings" w:hint="default"/>
+        <w:sz w:val="20"/>
+      </w:rPr>
+    </w:lvl>
+    <w:lvl w:ilvl="5" w:tentative="1">
+      <w:start w:val="1"/>
+      <w:numFmt w:val="bullet"/>
+      <w:lvlText w:val=""/>
+      <w:lvlJc w:val="left"/>
+      <w:pPr>
+        <w:tabs>
+          <w:tab w:val="num" w:pos="4320"/>
+        </w:tabs>
+        <w:ind w:left="4320" w:hanging="360"/>
+      </w:pPr>
+      <w:rPr>
+        <w:rFonts w:ascii="Wingdings" w:hAnsi="Wingdings" w:hint="default"/>
+        <w:sz w:val="20"/>
+      </w:rPr>
+    </w:lvl>
+    <w:lvl w:ilvl="6" w:tentative="1">
+      <w:start w:val="1"/>
+      <w:numFmt w:val="bullet"/>
+      <w:lvlText w:val=""/>
+      <w:lvlJc w:val="left"/>
+      <w:pPr>
+        <w:tabs>
+          <w:tab w:val="num" w:pos="5040"/>
+        </w:tabs>
+        <w:ind w:left="5040" w:hanging="360"/>
+      </w:pPr>
+      <w:rPr>
+        <w:rFonts w:ascii="Wingdings" w:hAnsi="Wingdings" w:hint="default"/>
+        <w:sz w:val="20"/>
+      </w:rPr>
+    </w:lvl>
+    <w:lvl w:ilvl="7" w:tentative="1">
+      <w:start w:val="1"/>
+      <w:numFmt w:val="bullet"/>
+      <w:lvlText w:val=""/>
+      <w:lvlJc w:val="left"/>
+      <w:pPr>
+        <w:tabs>
+          <w:tab w:val="num" w:pos="5760"/>
+        </w:tabs>
+        <w:ind w:left="5760" w:hanging="360"/>
+      </w:pPr>
+      <w:rPr>
+        <w:rFonts w:ascii="Wingdings" w:hAnsi="Wingdings" w:hint="default"/>
+        <w:sz w:val="20"/>
+      </w:rPr>
+    </w:lvl>
+    <w:lvl w:ilvl="8" w:tentative="1">
+      <w:start w:val="1"/>
+      <w:numFmt w:val="bullet"/>
+      <w:lvlText w:val=""/>
+      <w:lvlJc w:val="left"/>
+      <w:pPr>
+        <w:tabs>
+          <w:tab w:val="num" w:pos="6480"/>
+        </w:tabs>
+        <w:ind w:left="6480" w:hanging="360"/>
+      </w:pPr>
+      <w:rPr>
+        <w:rFonts w:ascii="Wingdings" w:hAnsi="Wingdings" w:hint="default"/>
+        <w:sz w:val="20"/>
+      </w:rPr>
+    </w:lvl>
+  </w:abstractNum>
   <w:num w:numId="1" w16cid:durableId="955133610">
+    <w:abstractNumId w:val="1"/>
+  </w:num>
+  <w:num w:numId="2" w16cid:durableId="1806971757">
+    <w:abstractNumId w:val="2"/>
+  </w:num>
+  <w:num w:numId="3" w16cid:durableId="1117338313">
     <w:abstractNumId w:val="0"/>
+  </w:num>
+  <w:num w:numId="4" w16cid:durableId="1906526246">
+    <w:abstractNumId w:val="3"/>
   </w:num>
 </w:numbering>
 </file>

</xml_diff>

<commit_message>
problema 2 subestructura optima y greedy choice property
</commit_message>
<xml_diff>
--- a/Examen Parcial No 2.docx
+++ b/Examen Parcial No 2.docx
@@ -53,7 +53,7 @@
           <w:rFonts w:ascii="Arial" w:hAnsi="Arial" w:cs="Arial"/>
           <w:lang w:val="es-US"/>
         </w:rPr>
-        <w:t xml:space="preserve">[30 puntos] Considere el problema de “hacer sencillo”: dado un monto </w:t>
+        <w:t xml:space="preserve">Considere el problema de “hacer sencillo”: dado un monto </w:t>
       </w:r>
       <w:r>
         <w:rPr>
@@ -1626,14 +1626,7 @@
           <w:rFonts w:ascii="Arial" w:hAnsi="Arial" w:cs="Arial"/>
           <w:lang w:val="es-US"/>
         </w:rPr>
-        <w:t>Subproblemas traslapados</w:t>
-      </w:r>
-      <w:r>
-        <w:rPr>
-          <w:rFonts w:ascii="Arial" w:hAnsi="Arial" w:cs="Arial"/>
-          <w:lang w:val="es-US"/>
-        </w:rPr>
-        <w:t>:</w:t>
+        <w:t>Subproblemas traslapados:</w:t>
       </w:r>
     </w:p>
     <w:p>
@@ -2685,7 +2678,2493 @@
     <w:p>
       <w:pPr>
         <w:pStyle w:val="ListParagraph"/>
-        <w:ind w:left="708"/>
+        <w:numPr>
+          <w:ilvl w:val="0"/>
+          <w:numId w:val="1"/>
+        </w:numPr>
+        <w:jc w:val="both"/>
+        <w:rPr>
+          <w:rFonts w:ascii="Arial" w:hAnsi="Arial" w:cs="Arial"/>
+          <w:lang w:val="es-US"/>
+        </w:rPr>
+      </w:pPr>
+      <w:proofErr w:type="spellStart"/>
+      <w:r>
+        <w:rPr>
+          <w:rFonts w:ascii="Arial" w:hAnsi="Arial" w:cs="Arial"/>
+        </w:rPr>
+        <w:lastRenderedPageBreak/>
+        <w:t>Knapsack</w:t>
+      </w:r>
+      <w:proofErr w:type="spellEnd"/>
+      <w:r>
+        <w:rPr>
+          <w:rFonts w:ascii="Arial" w:hAnsi="Arial" w:cs="Arial"/>
+        </w:rPr>
+        <w:t xml:space="preserve"> </w:t>
+      </w:r>
+      <w:proofErr w:type="spellStart"/>
+      <w:r>
+        <w:rPr>
+          <w:rFonts w:ascii="Arial" w:hAnsi="Arial" w:cs="Arial"/>
+        </w:rPr>
+        <w:t>problem</w:t>
+      </w:r>
+      <w:proofErr w:type="spellEnd"/>
+      <w:r>
+        <w:rPr>
+          <w:rFonts w:ascii="Arial" w:hAnsi="Arial" w:cs="Arial"/>
+        </w:rPr>
+        <w:t xml:space="preserve"> fraccionado: el problema visto en clase de un ladrón con una bolsa que aguanta </w:t>
+      </w:r>
+      <w:r>
+        <w:rPr>
+          <w:rFonts w:ascii="Cambria Math" w:hAnsi="Cambria Math" w:cs="Cambria Math"/>
+        </w:rPr>
+        <w:t>𝑊</w:t>
+      </w:r>
+      <w:r>
+        <w:rPr>
+          <w:rFonts w:ascii="Arial" w:hAnsi="Arial" w:cs="Arial"/>
+        </w:rPr>
+        <w:t xml:space="preserve"> unidades </w:t>
+      </w:r>
+      <w:r>
+        <w:rPr>
+          <w:rFonts w:ascii="Cambria Math" w:hAnsi="Cambria Math" w:cs="Cambria Math"/>
+        </w:rPr>
+        <w:t>𝑢</w:t>
+      </w:r>
+      <w:r>
+        <w:rPr>
+          <w:rFonts w:ascii="Arial" w:hAnsi="Arial" w:cs="Arial"/>
+        </w:rPr>
+        <w:t xml:space="preserve"> de peso, y busca robar el máximo valor que pueda de una selección de </w:t>
+      </w:r>
+      <w:r>
+        <w:rPr>
+          <w:rFonts w:ascii="Cambria Math" w:hAnsi="Cambria Math" w:cs="Cambria Math"/>
+        </w:rPr>
+        <w:t>𝑛</w:t>
+      </w:r>
+      <w:r>
+        <w:rPr>
+          <w:rFonts w:ascii="Arial" w:hAnsi="Arial" w:cs="Arial"/>
+        </w:rPr>
+        <w:t xml:space="preserve"> artículos, donde el artículo </w:t>
+      </w:r>
+      <w:r>
+        <w:rPr>
+          <w:rFonts w:ascii="Cambria Math" w:hAnsi="Cambria Math" w:cs="Cambria Math"/>
+        </w:rPr>
+        <w:t>𝑖</w:t>
+      </w:r>
+      <w:r>
+        <w:rPr>
+          <w:rFonts w:ascii="Arial" w:hAnsi="Arial" w:cs="Arial"/>
+        </w:rPr>
+        <w:t xml:space="preserve"> tiene precio </w:t>
+      </w:r>
+      <w:r>
+        <w:rPr>
+          <w:rFonts w:ascii="Cambria Math" w:hAnsi="Cambria Math" w:cs="Cambria Math"/>
+        </w:rPr>
+        <w:t>𝑝𝑖</w:t>
+      </w:r>
+      <w:r>
+        <w:rPr>
+          <w:rFonts w:ascii="Arial" w:hAnsi="Arial" w:cs="Arial"/>
+        </w:rPr>
+        <w:t xml:space="preserve"> y hay </w:t>
+      </w:r>
+      <w:r>
+        <w:rPr>
+          <w:rFonts w:ascii="Cambria Math" w:hAnsi="Cambria Math" w:cs="Cambria Math"/>
+        </w:rPr>
+        <w:t>𝑤𝑖</w:t>
+      </w:r>
+      <w:r>
+        <w:rPr>
+          <w:rFonts w:ascii="Arial" w:hAnsi="Arial" w:cs="Arial"/>
+        </w:rPr>
+        <w:t xml:space="preserve"> </w:t>
+      </w:r>
+      <w:r>
+        <w:rPr>
+          <w:rFonts w:ascii="Cambria Math" w:hAnsi="Cambria Math" w:cs="Cambria Math"/>
+        </w:rPr>
+        <w:t>𝑢</w:t>
+      </w:r>
+      <w:r>
+        <w:rPr>
+          <w:rFonts w:ascii="Arial" w:hAnsi="Arial" w:cs="Arial"/>
+        </w:rPr>
+        <w:t xml:space="preserve">’s disponibles del mismo. No es necesario robar el artículo completo; es posible tomar porciones </w:t>
+      </w:r>
+      <w:proofErr w:type="gramStart"/>
+      <w:r>
+        <w:rPr>
+          <w:rFonts w:ascii="Arial" w:hAnsi="Arial" w:cs="Arial"/>
+        </w:rPr>
+        <w:t>del mismo</w:t>
+      </w:r>
+      <w:proofErr w:type="gramEnd"/>
+      <w:r>
+        <w:rPr>
+          <w:rFonts w:ascii="Arial" w:hAnsi="Arial" w:cs="Arial"/>
+        </w:rPr>
+        <w:t xml:space="preserve"> (a nivel de </w:t>
+      </w:r>
+      <w:r>
+        <w:rPr>
+          <w:rFonts w:ascii="Cambria Math" w:hAnsi="Cambria Math" w:cs="Cambria Math"/>
+        </w:rPr>
+        <w:t>𝑢</w:t>
+      </w:r>
+      <w:r>
+        <w:rPr>
+          <w:rFonts w:ascii="Arial" w:hAnsi="Arial" w:cs="Arial"/>
+        </w:rPr>
+        <w:t>’s)</w:t>
+      </w:r>
+      <w:r>
+        <w:rPr>
+          <w:rFonts w:ascii="Arial" w:hAnsi="Arial" w:cs="Arial"/>
+        </w:rPr>
+        <w:t>.</w:t>
+      </w:r>
+      <w:r>
+        <w:rPr>
+          <w:rFonts w:ascii="Arial" w:hAnsi="Arial" w:cs="Arial"/>
+        </w:rPr>
+        <w:br/>
+      </w:r>
+      <w:r>
+        <w:rPr>
+          <w:rFonts w:ascii="Arial" w:hAnsi="Arial" w:cs="Arial"/>
+        </w:rPr>
+        <w:br/>
+      </w:r>
+      <w:r>
+        <w:rPr>
+          <w:rFonts w:ascii="Arial" w:hAnsi="Arial" w:cs="Arial"/>
+          <w:lang w:val="es-US"/>
+        </w:rPr>
+        <w:t>Propiedades:</w:t>
+      </w:r>
+    </w:p>
+    <w:p>
+      <w:pPr>
+        <w:pStyle w:val="ListParagraph"/>
+        <w:numPr>
+          <w:ilvl w:val="1"/>
+          <w:numId w:val="1"/>
+        </w:numPr>
+        <w:jc w:val="both"/>
+        <w:rPr>
+          <w:rFonts w:ascii="Arial" w:hAnsi="Arial" w:cs="Arial"/>
+          <w:lang w:val="es-US"/>
+        </w:rPr>
+      </w:pPr>
+      <w:r>
+        <w:rPr>
+          <w:rFonts w:ascii="Arial" w:hAnsi="Arial" w:cs="Arial"/>
+          <w:lang w:val="es-US"/>
+        </w:rPr>
+        <w:t>Subestructura óptima</w:t>
+      </w:r>
+    </w:p>
+    <w:p>
+      <w:pPr>
+        <w:pStyle w:val="ListParagraph"/>
+        <w:numPr>
+          <w:ilvl w:val="1"/>
+          <w:numId w:val="1"/>
+        </w:numPr>
+        <w:jc w:val="both"/>
+        <w:rPr>
+          <w:rFonts w:ascii="Arial" w:hAnsi="Arial" w:cs="Arial"/>
+          <w:lang w:val="es-US"/>
+        </w:rPr>
+      </w:pPr>
+      <w:r>
+        <w:rPr>
+          <w:rFonts w:ascii="Arial" w:hAnsi="Arial" w:cs="Arial"/>
+          <w:lang w:val="es-US"/>
+        </w:rPr>
+        <w:t>Greedy-</w:t>
+      </w:r>
+      <w:proofErr w:type="spellStart"/>
+      <w:r>
+        <w:rPr>
+          <w:rFonts w:ascii="Arial" w:hAnsi="Arial" w:cs="Arial"/>
+          <w:lang w:val="es-US"/>
+        </w:rPr>
+        <w:t>choice</w:t>
+      </w:r>
+      <w:proofErr w:type="spellEnd"/>
+      <w:r>
+        <w:rPr>
+          <w:rFonts w:ascii="Arial" w:hAnsi="Arial" w:cs="Arial"/>
+          <w:lang w:val="es-US"/>
+        </w:rPr>
+        <w:t xml:space="preserve"> </w:t>
+      </w:r>
+      <w:proofErr w:type="spellStart"/>
+      <w:r>
+        <w:rPr>
+          <w:rFonts w:ascii="Arial" w:hAnsi="Arial" w:cs="Arial"/>
+          <w:lang w:val="es-US"/>
+        </w:rPr>
+        <w:t>property</w:t>
+      </w:r>
+      <w:proofErr w:type="spellEnd"/>
+    </w:p>
+    <w:p>
+      <w:pPr>
+        <w:pStyle w:val="ListParagraph"/>
+        <w:numPr>
+          <w:ilvl w:val="1"/>
+          <w:numId w:val="1"/>
+        </w:numPr>
+        <w:jc w:val="both"/>
+        <w:rPr>
+          <w:rFonts w:ascii="Arial" w:hAnsi="Arial" w:cs="Arial"/>
+          <w:lang w:val="es-US"/>
+        </w:rPr>
+      </w:pPr>
+      <w:r>
+        <w:rPr>
+          <w:rFonts w:ascii="Arial" w:hAnsi="Arial" w:cs="Arial"/>
+        </w:rPr>
+        <w:t xml:space="preserve">Se puede modelar como una </w:t>
+      </w:r>
+      <w:proofErr w:type="spellStart"/>
+      <w:r>
+        <w:rPr>
+          <w:rFonts w:ascii="Arial" w:hAnsi="Arial" w:cs="Arial"/>
+        </w:rPr>
+        <w:t>matroide</w:t>
+      </w:r>
+      <w:proofErr w:type="spellEnd"/>
+      <w:r>
+        <w:rPr>
+          <w:rFonts w:ascii="Arial" w:hAnsi="Arial" w:cs="Arial"/>
+        </w:rPr>
+        <w:t xml:space="preserve"> ponderada</w:t>
+      </w:r>
+    </w:p>
+    <w:p>
+      <w:pPr>
+        <w:ind w:left="708"/>
+        <w:jc w:val="both"/>
+        <w:rPr>
+          <w:rFonts w:ascii="Arial" w:hAnsi="Arial" w:cs="Arial"/>
+          <w:lang w:val="es-US"/>
+        </w:rPr>
+      </w:pPr>
+    </w:p>
+    <w:p>
+      <w:pPr>
+        <w:ind w:left="708"/>
+        <w:jc w:val="both"/>
+        <w:rPr>
+          <w:rFonts w:ascii="Arial" w:hAnsi="Arial" w:cs="Arial"/>
+          <w:lang w:val="es-US"/>
+        </w:rPr>
+      </w:pPr>
+      <w:proofErr w:type="spellStart"/>
+      <w:r>
+        <w:rPr>
+          <w:rFonts w:ascii="Arial" w:hAnsi="Arial" w:cs="Arial"/>
+          <w:lang w:val="es-US"/>
+        </w:rPr>
+        <w:t>Subestrucura</w:t>
+      </w:r>
+      <w:proofErr w:type="spellEnd"/>
+      <w:r>
+        <w:rPr>
+          <w:rFonts w:ascii="Arial" w:hAnsi="Arial" w:cs="Arial"/>
+          <w:lang w:val="es-US"/>
+        </w:rPr>
+        <w:t xml:space="preserve"> óptima:</w:t>
+      </w:r>
+    </w:p>
+    <w:p>
+      <w:pPr>
+        <w:ind w:left="708"/>
+        <w:jc w:val="both"/>
+        <w:rPr>
+          <w:rFonts w:ascii="Arial" w:hAnsi="Arial" w:cs="Arial"/>
+        </w:rPr>
+      </w:pPr>
+      <w:r>
+        <w:rPr>
+          <w:rFonts w:ascii="Arial" w:hAnsi="Arial" w:cs="Arial"/>
+        </w:rPr>
+        <w:t xml:space="preserve">Cada artículo </w:t>
+      </w:r>
+      <w:r>
+        <w:rPr>
+          <w:rFonts w:ascii="Cambria Math" w:hAnsi="Cambria Math" w:cs="Cambria Math"/>
+        </w:rPr>
+        <w:t>𝑖</w:t>
+      </w:r>
+      <w:r>
+        <w:rPr>
+          <w:rFonts w:ascii="Arial" w:hAnsi="Arial" w:cs="Arial"/>
+        </w:rPr>
+        <w:t xml:space="preserve"> tiene</w:t>
+      </w:r>
+    </w:p>
+    <w:p>
+      <w:pPr>
+        <w:numPr>
+          <w:ilvl w:val="0"/>
+          <w:numId w:val="5"/>
+        </w:numPr>
+        <w:tabs>
+          <w:tab w:val="num" w:pos="720"/>
+        </w:tabs>
+        <w:jc w:val="both"/>
+        <w:rPr>
+          <w:rFonts w:ascii="Arial" w:hAnsi="Arial" w:cs="Arial"/>
+        </w:rPr>
+      </w:pPr>
+      <w:r>
+        <w:rPr>
+          <w:rFonts w:ascii="Arial" w:hAnsi="Arial" w:cs="Arial"/>
+        </w:rPr>
+        <w:t xml:space="preserve">precio total </w:t>
+      </w:r>
+      <w:r>
+        <w:rPr>
+          <w:rFonts w:ascii="Cambria Math" w:hAnsi="Cambria Math" w:cs="Cambria Math"/>
+        </w:rPr>
+        <w:t>𝑝𝑖</w:t>
+      </w:r>
+      <w:r>
+        <w:rPr>
+          <w:rFonts w:ascii="Arial" w:hAnsi="Arial" w:cs="Arial"/>
+        </w:rPr>
+        <w:t xml:space="preserve"> </w:t>
+      </w:r>
+    </w:p>
+    <w:p>
+      <w:pPr>
+        <w:numPr>
+          <w:ilvl w:val="0"/>
+          <w:numId w:val="5"/>
+        </w:numPr>
+        <w:tabs>
+          <w:tab w:val="num" w:pos="720"/>
+        </w:tabs>
+        <w:jc w:val="both"/>
+        <w:rPr>
+          <w:rFonts w:ascii="Arial" w:hAnsi="Arial" w:cs="Arial"/>
+        </w:rPr>
+      </w:pPr>
+      <w:r>
+        <w:rPr>
+          <w:rFonts w:ascii="Arial" w:hAnsi="Arial" w:cs="Arial"/>
+        </w:rPr>
+        <w:t xml:space="preserve">cantidad disponible </w:t>
+      </w:r>
+      <w:r>
+        <w:rPr>
+          <w:rFonts w:ascii="Cambria Math" w:hAnsi="Cambria Math" w:cs="Cambria Math"/>
+        </w:rPr>
+        <w:t>𝑤𝑖</w:t>
+      </w:r>
+      <w:r>
+        <w:rPr>
+          <w:rFonts w:ascii="Arial" w:hAnsi="Arial" w:cs="Arial"/>
+        </w:rPr>
+        <w:t xml:space="preserve"> </w:t>
+      </w:r>
+    </w:p>
+    <w:p>
+      <w:pPr>
+        <w:numPr>
+          <w:ilvl w:val="0"/>
+          <w:numId w:val="5"/>
+        </w:numPr>
+        <w:tabs>
+          <w:tab w:val="num" w:pos="720"/>
+        </w:tabs>
+        <w:jc w:val="both"/>
+        <w:rPr>
+          <w:rFonts w:ascii="Arial" w:hAnsi="Arial" w:cs="Arial"/>
+        </w:rPr>
+      </w:pPr>
+      <w:r>
+        <w:rPr>
+          <w:rFonts w:ascii="Arial" w:hAnsi="Arial" w:cs="Arial"/>
+        </w:rPr>
+        <w:t xml:space="preserve">valor por unidad: </w:t>
+      </w:r>
+    </w:p>
+    <w:p>
+      <w:pPr>
+        <w:ind w:left="708"/>
+        <w:jc w:val="both"/>
+        <w:rPr>
+          <w:rFonts w:ascii="Arial" w:hAnsi="Arial" w:cs="Arial"/>
+        </w:rPr>
+      </w:pPr>
+      <m:oMathPara>
+        <m:oMath>
+          <m:sSub>
+            <m:sSubPr>
+              <m:ctrlPr>
+                <w:rPr>
+                  <w:rFonts w:ascii="Cambria Math" w:hAnsi="Cambria Math" w:cs="Arial"/>
+                </w:rPr>
+              </m:ctrlPr>
+            </m:sSubPr>
+            <m:e>
+              <m:r>
+                <w:rPr>
+                  <w:rFonts w:ascii="Cambria Math" w:hAnsi="Cambria Math" w:cs="Arial"/>
+                </w:rPr>
+                <m:t>ρ</m:t>
+              </m:r>
+            </m:e>
+            <m:sub>
+              <m:r>
+                <w:rPr>
+                  <w:rFonts w:ascii="Cambria Math" w:hAnsi="Cambria Math" w:cs="Arial"/>
+                </w:rPr>
+                <m:t>i</m:t>
+              </m:r>
+            </m:sub>
+          </m:sSub>
+          <m:r>
+            <w:rPr>
+              <w:rFonts w:ascii="Cambria Math" w:hAnsi="Cambria Math" w:cs="Arial"/>
+            </w:rPr>
+            <m:t>=</m:t>
+          </m:r>
+          <m:f>
+            <m:fPr>
+              <m:ctrlPr>
+                <w:rPr>
+                  <w:rFonts w:ascii="Cambria Math" w:hAnsi="Cambria Math" w:cs="Arial"/>
+                </w:rPr>
+              </m:ctrlPr>
+            </m:fPr>
+            <m:num>
+              <m:sSub>
+                <m:sSubPr>
+                  <m:ctrlPr>
+                    <w:rPr>
+                      <w:rFonts w:ascii="Cambria Math" w:hAnsi="Cambria Math" w:cs="Arial"/>
+                    </w:rPr>
+                  </m:ctrlPr>
+                </m:sSubPr>
+                <m:e>
+                  <m:r>
+                    <w:rPr>
+                      <w:rFonts w:ascii="Cambria Math" w:hAnsi="Cambria Math" w:cs="Arial"/>
+                    </w:rPr>
+                    <m:t>p</m:t>
+                  </m:r>
+                </m:e>
+                <m:sub>
+                  <m:r>
+                    <w:rPr>
+                      <w:rFonts w:ascii="Cambria Math" w:hAnsi="Cambria Math" w:cs="Arial"/>
+                    </w:rPr>
+                    <m:t>i</m:t>
+                  </m:r>
+                </m:sub>
+              </m:sSub>
+            </m:num>
+            <m:den>
+              <m:sSub>
+                <m:sSubPr>
+                  <m:ctrlPr>
+                    <w:rPr>
+                      <w:rFonts w:ascii="Cambria Math" w:hAnsi="Cambria Math" w:cs="Arial"/>
+                    </w:rPr>
+                  </m:ctrlPr>
+                </m:sSubPr>
+                <m:e>
+                  <m:r>
+                    <w:rPr>
+                      <w:rFonts w:ascii="Cambria Math" w:hAnsi="Cambria Math" w:cs="Arial"/>
+                    </w:rPr>
+                    <m:t>w</m:t>
+                  </m:r>
+                </m:e>
+                <m:sub>
+                  <m:r>
+                    <w:rPr>
+                      <w:rFonts w:ascii="Cambria Math" w:hAnsi="Cambria Math" w:cs="Arial"/>
+                    </w:rPr>
+                    <m:t>i</m:t>
+                  </m:r>
+                </m:sub>
+              </m:sSub>
+            </m:den>
+          </m:f>
+          <m:r>
+            <w:rPr>
+              <w:rFonts w:ascii="Arial" w:hAnsi="Arial" w:cs="Arial"/>
+            </w:rPr>
+            <w:br/>
+          </m:r>
+        </m:oMath>
+      </m:oMathPara>
+    </w:p>
+    <w:p>
+      <w:pPr>
+        <w:ind w:left="708"/>
+        <w:jc w:val="both"/>
+        <w:rPr>
+          <w:rFonts w:ascii="Arial" w:hAnsi="Arial" w:cs="Arial"/>
+        </w:rPr>
+      </w:pPr>
+      <w:r>
+        <w:rPr>
+          <w:rFonts w:ascii="Arial" w:hAnsi="Arial" w:cs="Arial"/>
+        </w:rPr>
+        <w:t>Decisión</w:t>
+      </w:r>
+      <w:r>
+        <w:rPr>
+          <w:rFonts w:ascii="Arial" w:hAnsi="Arial" w:cs="Arial"/>
+        </w:rPr>
+        <w:t>:</w:t>
+      </w:r>
+      <w:r>
+        <w:rPr>
+          <w:rFonts w:ascii="Arial" w:hAnsi="Arial" w:cs="Arial"/>
+        </w:rPr>
+        <w:br/>
+        <w:t>En cada paso decidimos cuánto tomar de algún artículo</w:t>
+      </w:r>
+      <w:r>
+        <w:rPr>
+          <w:rFonts w:ascii="Arial" w:hAnsi="Arial" w:cs="Arial"/>
+        </w:rPr>
+        <w:t xml:space="preserve">, </w:t>
+      </w:r>
+      <w:r>
+        <w:rPr>
+          <w:rFonts w:ascii="Arial" w:hAnsi="Arial" w:cs="Arial"/>
+        </w:rPr>
+        <w:t xml:space="preserve">para cada artículo </w:t>
+      </w:r>
+      <w:r>
+        <w:rPr>
+          <w:rFonts w:ascii="Cambria Math" w:hAnsi="Cambria Math" w:cs="Cambria Math"/>
+        </w:rPr>
+        <w:t>𝑖</w:t>
+      </w:r>
+      <w:r>
+        <w:rPr>
+          <w:rFonts w:ascii="Arial" w:hAnsi="Arial" w:cs="Arial"/>
+        </w:rPr>
+        <w:t xml:space="preserve"> </w:t>
+      </w:r>
+      <w:r>
+        <w:rPr>
+          <w:rFonts w:ascii="Arial" w:hAnsi="Arial" w:cs="Arial"/>
+        </w:rPr>
+        <w:t>decidimos una cantidad:</w:t>
+      </w:r>
+    </w:p>
+    <w:p>
+      <w:pPr>
+        <w:ind w:left="708"/>
+        <w:jc w:val="both"/>
+        <w:rPr>
+          <w:rFonts w:ascii="Arial" w:hAnsi="Arial" w:cs="Arial"/>
+        </w:rPr>
+      </w:pPr>
+      <m:oMathPara>
+        <m:oMath>
+          <m:r>
+            <w:rPr>
+              <w:rFonts w:ascii="Cambria Math" w:hAnsi="Cambria Math" w:cs="Arial"/>
+            </w:rPr>
+            <m:t>0≤</m:t>
+          </m:r>
+          <m:sSub>
+            <m:sSubPr>
+              <m:ctrlPr>
+                <w:rPr>
+                  <w:rFonts w:ascii="Cambria Math" w:hAnsi="Cambria Math" w:cs="Arial"/>
+                </w:rPr>
+              </m:ctrlPr>
+            </m:sSubPr>
+            <m:e>
+              <m:r>
+                <w:rPr>
+                  <w:rFonts w:ascii="Cambria Math" w:hAnsi="Cambria Math" w:cs="Arial"/>
+                </w:rPr>
+                <m:t>c</m:t>
+              </m:r>
+            </m:e>
+            <m:sub>
+              <m:r>
+                <w:rPr>
+                  <w:rFonts w:ascii="Cambria Math" w:hAnsi="Cambria Math" w:cs="Arial"/>
+                </w:rPr>
+                <m:t>i</m:t>
+              </m:r>
+            </m:sub>
+          </m:sSub>
+          <m:r>
+            <w:rPr>
+              <w:rFonts w:ascii="Cambria Math" w:hAnsi="Cambria Math" w:cs="Arial"/>
+            </w:rPr>
+            <m:t>≤</m:t>
+          </m:r>
+          <m:sSub>
+            <m:sSubPr>
+              <m:ctrlPr>
+                <w:rPr>
+                  <w:rFonts w:ascii="Cambria Math" w:hAnsi="Cambria Math" w:cs="Arial"/>
+                </w:rPr>
+              </m:ctrlPr>
+            </m:sSubPr>
+            <m:e>
+              <m:r>
+                <w:rPr>
+                  <w:rFonts w:ascii="Cambria Math" w:hAnsi="Cambria Math" w:cs="Arial"/>
+                </w:rPr>
+                <m:t>w</m:t>
+              </m:r>
+            </m:e>
+            <m:sub>
+              <m:r>
+                <w:rPr>
+                  <w:rFonts w:ascii="Cambria Math" w:hAnsi="Cambria Math" w:cs="Arial"/>
+                </w:rPr>
+                <m:t>i</m:t>
+              </m:r>
+            </m:sub>
+          </m:sSub>
+          <m:r>
+            <w:rPr>
+              <w:rFonts w:ascii="Arial" w:hAnsi="Arial" w:cs="Arial"/>
+            </w:rPr>
+            <w:br/>
+          </m:r>
+        </m:oMath>
+      </m:oMathPara>
+    </w:p>
+    <w:p>
+      <w:pPr>
+        <w:ind w:left="708"/>
+        <w:jc w:val="both"/>
+        <w:rPr>
+          <w:rFonts w:ascii="Arial" w:hAnsi="Arial" w:cs="Arial"/>
+        </w:rPr>
+      </w:pPr>
+      <w:r>
+        <w:rPr>
+          <w:rFonts w:ascii="Arial" w:hAnsi="Arial" w:cs="Arial"/>
+        </w:rPr>
+        <w:t>respetando que:</w:t>
+      </w:r>
+    </w:p>
+    <w:p>
+      <w:pPr>
+        <w:ind w:left="708"/>
+        <w:jc w:val="both"/>
+        <w:rPr>
+          <w:rFonts w:ascii="Arial" w:hAnsi="Arial" w:cs="Arial"/>
+        </w:rPr>
+      </w:pPr>
+      <m:oMathPara>
+        <m:oMath>
+          <m:nary>
+            <m:naryPr>
+              <m:chr m:val="∑"/>
+              <m:limLoc m:val="undOvr"/>
+              <m:grow m:val="1"/>
+              <m:supHide m:val="1"/>
+              <m:ctrlPr>
+                <w:rPr>
+                  <w:rFonts w:ascii="Cambria Math" w:hAnsi="Cambria Math" w:cs="Arial"/>
+                </w:rPr>
+              </m:ctrlPr>
+            </m:naryPr>
+            <m:sub>
+              <m:r>
+                <w:rPr>
+                  <w:rFonts w:ascii="Cambria Math" w:hAnsi="Cambria Math" w:cs="Arial"/>
+                </w:rPr>
+                <m:t>i</m:t>
+              </m:r>
+            </m:sub>
+            <m:sup/>
+            <m:e>
+              <m:sSub>
+                <m:sSubPr>
+                  <m:ctrlPr>
+                    <w:rPr>
+                      <w:rFonts w:ascii="Cambria Math" w:hAnsi="Cambria Math" w:cs="Arial"/>
+                    </w:rPr>
+                  </m:ctrlPr>
+                </m:sSubPr>
+                <m:e>
+                  <m:r>
+                    <w:rPr>
+                      <w:rFonts w:ascii="Cambria Math" w:hAnsi="Cambria Math" w:cs="Arial"/>
+                    </w:rPr>
+                    <m:t>c</m:t>
+                  </m:r>
+                </m:e>
+                <m:sub>
+                  <m:r>
+                    <w:rPr>
+                      <w:rFonts w:ascii="Cambria Math" w:hAnsi="Cambria Math" w:cs="Arial"/>
+                    </w:rPr>
+                    <m:t>i</m:t>
+                  </m:r>
+                </m:sub>
+              </m:sSub>
+            </m:e>
+          </m:nary>
+          <m:r>
+            <w:rPr>
+              <w:rFonts w:ascii="Cambria Math" w:hAnsi="Cambria Math" w:cs="Arial"/>
+            </w:rPr>
+            <m:t>≤W</m:t>
+          </m:r>
+          <m:r>
+            <w:rPr>
+              <w:rFonts w:ascii="Arial" w:hAnsi="Arial" w:cs="Arial"/>
+              <w:i/>
+            </w:rPr>
+            <w:br/>
+          </m:r>
+          <m:r>
+            <w:rPr>
+              <w:rFonts w:ascii="Arial" w:hAnsi="Arial" w:cs="Arial"/>
+            </w:rPr>
+            <w:br/>
+            <w:t>Una solución puede escribirse como:</w:t>
+          </m:r>
+        </m:oMath>
+      </m:oMathPara>
+    </w:p>
+    <w:p>
+      <w:pPr>
+        <w:ind w:left="708"/>
+        <w:jc w:val="both"/>
+        <w:rPr>
+          <w:rFonts w:ascii="Arial" w:hAnsi="Arial" w:cs="Arial"/>
+        </w:rPr>
+      </w:pPr>
+      <m:oMathPara>
+        <m:oMath>
+          <m:d>
+            <m:dPr>
+              <m:ctrlPr>
+                <w:rPr>
+                  <w:rFonts w:ascii="Cambria Math" w:hAnsi="Cambria Math" w:cs="Arial"/>
+                </w:rPr>
+              </m:ctrlPr>
+            </m:dPr>
+            <m:e>
+              <m:sSub>
+                <m:sSubPr>
+                  <m:ctrlPr>
+                    <w:rPr>
+                      <w:rFonts w:ascii="Cambria Math" w:hAnsi="Cambria Math" w:cs="Arial"/>
+                    </w:rPr>
+                  </m:ctrlPr>
+                </m:sSubPr>
+                <m:e>
+                  <m:r>
+                    <w:rPr>
+                      <w:rFonts w:ascii="Cambria Math" w:hAnsi="Cambria Math" w:cs="Arial"/>
+                    </w:rPr>
+                    <m:t>c</m:t>
+                  </m:r>
+                </m:e>
+                <m:sub>
+                  <m:r>
+                    <w:rPr>
+                      <w:rFonts w:ascii="Cambria Math" w:hAnsi="Cambria Math" w:cs="Arial"/>
+                    </w:rPr>
+                    <m:t>1</m:t>
+                  </m:r>
+                </m:sub>
+              </m:sSub>
+              <m:r>
+                <w:rPr>
+                  <w:rFonts w:ascii="Cambria Math" w:hAnsi="Cambria Math" w:cs="Arial"/>
+                </w:rPr>
+                <m:t>,</m:t>
+              </m:r>
+              <m:sSub>
+                <m:sSubPr>
+                  <m:ctrlPr>
+                    <w:rPr>
+                      <w:rFonts w:ascii="Cambria Math" w:hAnsi="Cambria Math" w:cs="Arial"/>
+                    </w:rPr>
+                  </m:ctrlPr>
+                </m:sSubPr>
+                <m:e>
+                  <m:r>
+                    <w:rPr>
+                      <w:rFonts w:ascii="Cambria Math" w:hAnsi="Cambria Math" w:cs="Arial"/>
+                    </w:rPr>
+                    <m:t>c</m:t>
+                  </m:r>
+                </m:e>
+                <m:sub>
+                  <m:r>
+                    <w:rPr>
+                      <w:rFonts w:ascii="Cambria Math" w:hAnsi="Cambria Math" w:cs="Arial"/>
+                    </w:rPr>
+                    <m:t>2</m:t>
+                  </m:r>
+                </m:sub>
+              </m:sSub>
+              <m:r>
+                <w:rPr>
+                  <w:rFonts w:ascii="Cambria Math" w:hAnsi="Cambria Math" w:cs="Arial"/>
+                </w:rPr>
+                <m:t>,…,</m:t>
+              </m:r>
+              <m:sSub>
+                <m:sSubPr>
+                  <m:ctrlPr>
+                    <w:rPr>
+                      <w:rFonts w:ascii="Cambria Math" w:hAnsi="Cambria Math" w:cs="Arial"/>
+                    </w:rPr>
+                  </m:ctrlPr>
+                </m:sSubPr>
+                <m:e>
+                  <m:r>
+                    <w:rPr>
+                      <w:rFonts w:ascii="Cambria Math" w:hAnsi="Cambria Math" w:cs="Arial"/>
+                    </w:rPr>
+                    <m:t>c</m:t>
+                  </m:r>
+                </m:e>
+                <m:sub>
+                  <m:r>
+                    <w:rPr>
+                      <w:rFonts w:ascii="Cambria Math" w:hAnsi="Cambria Math" w:cs="Arial"/>
+                    </w:rPr>
+                    <m:t>n</m:t>
+                  </m:r>
+                </m:sub>
+              </m:sSub>
+            </m:e>
+          </m:d>
+          <m:r>
+            <w:rPr>
+              <w:rFonts w:ascii="Arial" w:hAnsi="Arial" w:cs="Arial"/>
+            </w:rPr>
+            <w:br/>
+          </m:r>
+        </m:oMath>
+      </m:oMathPara>
+    </w:p>
+    <w:p>
+      <w:pPr>
+        <w:ind w:left="708"/>
+        <w:jc w:val="both"/>
+        <w:rPr>
+          <w:rFonts w:ascii="Arial" w:hAnsi="Arial" w:cs="Arial"/>
+        </w:rPr>
+      </w:pPr>
+      <w:r>
+        <w:rPr>
+          <w:rFonts w:ascii="Arial" w:hAnsi="Arial" w:cs="Arial"/>
+        </w:rPr>
+        <w:t xml:space="preserve">donde </w:t>
+      </w:r>
+      <m:oMath>
+        <m:sSub>
+          <m:sSubPr>
+            <m:ctrlPr>
+              <w:rPr>
+                <w:rFonts w:ascii="Cambria Math" w:hAnsi="Cambria Math" w:cs="Arial"/>
+              </w:rPr>
+            </m:ctrlPr>
+          </m:sSubPr>
+          <m:e>
+            <m:r>
+              <w:rPr>
+                <w:rFonts w:ascii="Cambria Math" w:hAnsi="Cambria Math" w:cs="Arial"/>
+              </w:rPr>
+              <m:t>c</m:t>
+            </m:r>
+          </m:e>
+          <m:sub>
+            <m:r>
+              <w:rPr>
+                <w:rFonts w:ascii="Cambria Math" w:hAnsi="Cambria Math" w:cs="Arial"/>
+              </w:rPr>
+              <m:t>i</m:t>
+            </m:r>
+          </m:sub>
+        </m:sSub>
+      </m:oMath>
+      <w:r>
+        <w:rPr>
+          <w:rFonts w:ascii="Arial" w:eastAsiaTheme="minorEastAsia" w:hAnsi="Arial" w:cs="Arial"/>
+        </w:rPr>
+        <w:t xml:space="preserve"> </w:t>
+      </w:r>
+      <w:r>
+        <w:rPr>
+          <w:rFonts w:ascii="Arial" w:hAnsi="Arial" w:cs="Arial"/>
+        </w:rPr>
+        <w:t xml:space="preserve">representa cuántas unidades se toman del artículo </w:t>
+      </w:r>
+      <w:r>
+        <w:rPr>
+          <w:rFonts w:ascii="Cambria Math" w:hAnsi="Cambria Math" w:cs="Cambria Math"/>
+        </w:rPr>
+        <w:t>𝑖</w:t>
+      </w:r>
+      <w:r>
+        <w:rPr>
+          <w:rFonts w:ascii="Arial" w:hAnsi="Arial" w:cs="Arial"/>
+        </w:rPr>
+        <w:t>.</w:t>
+      </w:r>
+    </w:p>
+    <w:p>
+      <w:pPr>
+        <w:ind w:left="708"/>
+        <w:jc w:val="both"/>
+        <w:rPr>
+          <w:rFonts w:ascii="Arial" w:hAnsi="Arial" w:cs="Arial"/>
+        </w:rPr>
+      </w:pPr>
+    </w:p>
+    <w:p>
+      <w:pPr>
+        <w:ind w:left="708"/>
+        <w:jc w:val="both"/>
+        <w:rPr>
+          <w:rFonts w:ascii="Arial" w:hAnsi="Arial" w:cs="Arial"/>
+        </w:rPr>
+      </w:pPr>
+      <w:r>
+        <w:rPr>
+          <w:rFonts w:ascii="Arial" w:hAnsi="Arial" w:cs="Arial"/>
+        </w:rPr>
+        <w:lastRenderedPageBreak/>
+        <w:t>El valor total de la solución es:</w:t>
+      </w:r>
+    </w:p>
+    <w:p>
+      <w:pPr>
+        <w:ind w:left="708"/>
+        <w:jc w:val="both"/>
+        <w:rPr>
+          <w:rFonts w:ascii="Arial" w:hAnsi="Arial" w:cs="Arial"/>
+        </w:rPr>
+      </w:pPr>
+      <m:oMathPara>
+        <m:oMath>
+          <m:nary>
+            <m:naryPr>
+              <m:chr m:val="∑"/>
+              <m:limLoc m:val="undOvr"/>
+              <m:grow m:val="1"/>
+              <m:supHide m:val="1"/>
+              <m:ctrlPr>
+                <w:rPr>
+                  <w:rFonts w:ascii="Cambria Math" w:hAnsi="Cambria Math" w:cs="Arial"/>
+                </w:rPr>
+              </m:ctrlPr>
+            </m:naryPr>
+            <m:sub>
+              <m:r>
+                <w:rPr>
+                  <w:rFonts w:ascii="Cambria Math" w:hAnsi="Cambria Math" w:cs="Arial"/>
+                </w:rPr>
+                <m:t>i</m:t>
+              </m:r>
+            </m:sub>
+            <m:sup/>
+            <m:e>
+              <m:sSub>
+                <m:sSubPr>
+                  <m:ctrlPr>
+                    <w:rPr>
+                      <w:rFonts w:ascii="Cambria Math" w:hAnsi="Cambria Math" w:cs="Arial"/>
+                    </w:rPr>
+                  </m:ctrlPr>
+                </m:sSubPr>
+                <m:e>
+                  <m:r>
+                    <w:rPr>
+                      <w:rFonts w:ascii="Cambria Math" w:hAnsi="Cambria Math" w:cs="Arial"/>
+                    </w:rPr>
+                    <m:t>c</m:t>
+                  </m:r>
+                </m:e>
+                <m:sub>
+                  <m:r>
+                    <w:rPr>
+                      <w:rFonts w:ascii="Cambria Math" w:hAnsi="Cambria Math" w:cs="Arial"/>
+                    </w:rPr>
+                    <m:t>i</m:t>
+                  </m:r>
+                </m:sub>
+              </m:sSub>
+            </m:e>
+          </m:nary>
+          <m:r>
+            <w:rPr>
+              <w:rFonts w:ascii="Cambria Math" w:hAnsi="Cambria Math" w:cs="Arial"/>
+            </w:rPr>
+            <m:t>⋅</m:t>
+          </m:r>
+          <m:f>
+            <m:fPr>
+              <m:ctrlPr>
+                <w:rPr>
+                  <w:rFonts w:ascii="Cambria Math" w:hAnsi="Cambria Math" w:cs="Arial"/>
+                </w:rPr>
+              </m:ctrlPr>
+            </m:fPr>
+            <m:num>
+              <m:sSub>
+                <m:sSubPr>
+                  <m:ctrlPr>
+                    <w:rPr>
+                      <w:rFonts w:ascii="Cambria Math" w:hAnsi="Cambria Math" w:cs="Arial"/>
+                    </w:rPr>
+                  </m:ctrlPr>
+                </m:sSubPr>
+                <m:e>
+                  <m:r>
+                    <w:rPr>
+                      <w:rFonts w:ascii="Cambria Math" w:hAnsi="Cambria Math" w:cs="Arial"/>
+                    </w:rPr>
+                    <m:t>p</m:t>
+                  </m:r>
+                </m:e>
+                <m:sub>
+                  <m:r>
+                    <w:rPr>
+                      <w:rFonts w:ascii="Cambria Math" w:hAnsi="Cambria Math" w:cs="Arial"/>
+                    </w:rPr>
+                    <m:t>i</m:t>
+                  </m:r>
+                </m:sub>
+              </m:sSub>
+            </m:num>
+            <m:den>
+              <m:sSub>
+                <m:sSubPr>
+                  <m:ctrlPr>
+                    <w:rPr>
+                      <w:rFonts w:ascii="Cambria Math" w:hAnsi="Cambria Math" w:cs="Arial"/>
+                    </w:rPr>
+                  </m:ctrlPr>
+                </m:sSubPr>
+                <m:e>
+                  <m:r>
+                    <w:rPr>
+                      <w:rFonts w:ascii="Cambria Math" w:hAnsi="Cambria Math" w:cs="Arial"/>
+                    </w:rPr>
+                    <m:t>w</m:t>
+                  </m:r>
+                </m:e>
+                <m:sub>
+                  <m:r>
+                    <w:rPr>
+                      <w:rFonts w:ascii="Cambria Math" w:hAnsi="Cambria Math" w:cs="Arial"/>
+                    </w:rPr>
+                    <m:t>i</m:t>
+                  </m:r>
+                </m:sub>
+              </m:sSub>
+            </m:den>
+          </m:f>
+          <m:r>
+            <w:rPr>
+              <w:rFonts w:ascii="Arial" w:hAnsi="Arial" w:cs="Arial"/>
+            </w:rPr>
+            <w:br/>
+          </m:r>
+        </m:oMath>
+      </m:oMathPara>
+    </w:p>
+    <w:p>
+      <w:pPr>
+        <w:ind w:left="708"/>
+        <w:jc w:val="both"/>
+        <w:rPr>
+          <w:rFonts w:ascii="Arial" w:hAnsi="Arial" w:cs="Arial"/>
+        </w:rPr>
+      </w:pPr>
+      <w:r>
+        <w:rPr>
+          <w:rFonts w:ascii="Arial" w:hAnsi="Arial" w:cs="Arial"/>
+        </w:rPr>
+        <w:t>Subproblema generado</w:t>
+      </w:r>
+      <w:r>
+        <w:rPr>
+          <w:rFonts w:ascii="Arial" w:hAnsi="Arial" w:cs="Arial"/>
+        </w:rPr>
+        <w:t>:</w:t>
+      </w:r>
+      <w:r>
+        <w:rPr>
+          <w:rFonts w:ascii="Arial" w:hAnsi="Arial" w:cs="Arial"/>
+        </w:rPr>
+        <w:tab/>
+      </w:r>
+      <w:r>
+        <w:rPr>
+          <w:rFonts w:ascii="Arial" w:hAnsi="Arial" w:cs="Arial"/>
+        </w:rPr>
+        <w:br/>
+      </w:r>
+      <w:r>
+        <w:rPr>
+          <w:rFonts w:ascii="Arial" w:hAnsi="Arial" w:cs="Arial"/>
+        </w:rPr>
+        <w:t>Suponiendo</w:t>
+      </w:r>
+      <w:r>
+        <w:rPr>
+          <w:rFonts w:ascii="Arial" w:hAnsi="Arial" w:cs="Arial"/>
+        </w:rPr>
+        <w:t xml:space="preserve"> que en una solución óptima decidimos tomar </w:t>
+      </w:r>
+      <m:oMath>
+        <m:sSub>
+          <m:sSubPr>
+            <m:ctrlPr>
+              <w:rPr>
+                <w:rFonts w:ascii="Cambria Math" w:hAnsi="Cambria Math" w:cs="Arial"/>
+              </w:rPr>
+            </m:ctrlPr>
+          </m:sSubPr>
+          <m:e>
+            <m:r>
+              <w:rPr>
+                <w:rFonts w:ascii="Cambria Math" w:hAnsi="Cambria Math" w:cs="Arial"/>
+              </w:rPr>
+              <m:t>c</m:t>
+            </m:r>
+          </m:e>
+          <m:sub>
+            <m:r>
+              <w:rPr>
+                <w:rFonts w:ascii="Cambria Math" w:hAnsi="Cambria Math" w:cs="Arial"/>
+              </w:rPr>
+              <m:t>j</m:t>
+            </m:r>
+          </m:sub>
+        </m:sSub>
+      </m:oMath>
+      <w:r>
+        <w:rPr>
+          <w:rFonts w:ascii="Arial" w:hAnsi="Arial" w:cs="Arial"/>
+        </w:rPr>
+        <w:t xml:space="preserve"> unidades del artículo </w:t>
+      </w:r>
+      <m:oMath>
+        <m:r>
+          <w:rPr>
+            <w:rFonts w:ascii="Cambria Math" w:hAnsi="Cambria Math" w:cs="Arial"/>
+          </w:rPr>
+          <m:t>j</m:t>
+        </m:r>
+      </m:oMath>
+      <w:r>
+        <w:rPr>
+          <w:rFonts w:ascii="Arial" w:hAnsi="Arial" w:cs="Arial"/>
+        </w:rPr>
+        <w:t>.</w:t>
+      </w:r>
+    </w:p>
+    <w:p>
+      <w:pPr>
+        <w:ind w:left="708"/>
+        <w:jc w:val="both"/>
+        <w:rPr>
+          <w:rFonts w:ascii="Arial" w:hAnsi="Arial" w:cs="Arial"/>
+        </w:rPr>
+      </w:pPr>
+      <w:r>
+        <w:rPr>
+          <w:rFonts w:ascii="Arial" w:hAnsi="Arial" w:cs="Arial"/>
+        </w:rPr>
+        <w:t>Entonces queda una mochila con capacidad:</w:t>
+      </w:r>
+    </w:p>
+    <w:p>
+      <w:pPr>
+        <w:ind w:left="708"/>
+        <w:jc w:val="both"/>
+        <w:rPr>
+          <w:rFonts w:ascii="Arial" w:hAnsi="Arial" w:cs="Arial"/>
+        </w:rPr>
+      </w:pPr>
+      <m:oMathPara>
+        <m:oMath>
+          <m:r>
+            <w:rPr>
+              <w:rFonts w:ascii="Cambria Math" w:hAnsi="Cambria Math" w:cs="Arial"/>
+            </w:rPr>
+            <m:t>W-</m:t>
+          </m:r>
+          <m:sSub>
+            <m:sSubPr>
+              <m:ctrlPr>
+                <w:rPr>
+                  <w:rFonts w:ascii="Cambria Math" w:hAnsi="Cambria Math" w:cs="Arial"/>
+                </w:rPr>
+              </m:ctrlPr>
+            </m:sSubPr>
+            <m:e>
+              <m:r>
+                <w:rPr>
+                  <w:rFonts w:ascii="Cambria Math" w:hAnsi="Cambria Math" w:cs="Arial"/>
+                </w:rPr>
+                <m:t>c</m:t>
+              </m:r>
+            </m:e>
+            <m:sub>
+              <m:r>
+                <w:rPr>
+                  <w:rFonts w:ascii="Cambria Math" w:hAnsi="Cambria Math" w:cs="Arial"/>
+                </w:rPr>
+                <m:t>j</m:t>
+              </m:r>
+            </m:sub>
+          </m:sSub>
+          <m:r>
+            <w:rPr>
+              <w:rFonts w:ascii="Arial" w:hAnsi="Arial" w:cs="Arial"/>
+            </w:rPr>
+            <w:br/>
+          </m:r>
+        </m:oMath>
+      </m:oMathPara>
+    </w:p>
+    <w:p>
+      <w:pPr>
+        <w:ind w:left="708"/>
+        <w:jc w:val="both"/>
+        <w:rPr>
+          <w:rFonts w:ascii="Arial" w:hAnsi="Arial" w:cs="Arial"/>
+        </w:rPr>
+      </w:pPr>
+      <w:r>
+        <w:rPr>
+          <w:rFonts w:ascii="Arial" w:hAnsi="Arial" w:cs="Arial"/>
+        </w:rPr>
+        <w:t>y queda el problema de llenar esa capacidad restante usando las unidades que todavía no han sido tomadas.</w:t>
+      </w:r>
+    </w:p>
+    <w:p>
+      <w:pPr>
+        <w:ind w:left="708"/>
+        <w:jc w:val="both"/>
+        <w:rPr>
+          <w:rFonts w:ascii="Arial" w:hAnsi="Arial" w:cs="Arial"/>
+        </w:rPr>
+      </w:pPr>
+    </w:p>
+    <w:p>
+      <w:pPr>
+        <w:ind w:left="708"/>
+        <w:jc w:val="both"/>
+        <w:rPr>
+          <w:rFonts w:ascii="Arial" w:hAnsi="Arial" w:cs="Arial"/>
+        </w:rPr>
+      </w:pPr>
+      <w:r>
+        <w:rPr>
+          <w:rFonts w:ascii="Arial" w:hAnsi="Arial" w:cs="Arial"/>
+        </w:rPr>
+        <w:t>Necesaria optimalidad</w:t>
+      </w:r>
+      <w:r>
+        <w:rPr>
+          <w:rFonts w:ascii="Arial" w:hAnsi="Arial" w:cs="Arial"/>
+        </w:rPr>
+        <w:t>:</w:t>
+      </w:r>
+      <w:r>
+        <w:rPr>
+          <w:rFonts w:ascii="Arial" w:hAnsi="Arial" w:cs="Arial"/>
+        </w:rPr>
+        <w:tab/>
+      </w:r>
+      <w:r>
+        <w:rPr>
+          <w:rFonts w:ascii="Arial" w:hAnsi="Arial" w:cs="Arial"/>
+        </w:rPr>
+        <w:br/>
+      </w:r>
+      <w:r>
+        <w:rPr>
+          <w:rFonts w:ascii="Arial" w:hAnsi="Arial" w:cs="Arial"/>
+        </w:rPr>
+        <w:t>Suponiendo</w:t>
+      </w:r>
+      <w:r>
+        <w:rPr>
+          <w:rFonts w:ascii="Arial" w:hAnsi="Arial" w:cs="Arial"/>
+        </w:rPr>
+        <w:t xml:space="preserve"> que una solución óptima toma cierta cantidad </w:t>
+      </w:r>
+      <m:oMath>
+        <m:sSub>
+          <m:sSubPr>
+            <m:ctrlPr>
+              <w:rPr>
+                <w:rFonts w:ascii="Cambria Math" w:hAnsi="Cambria Math" w:cs="Arial"/>
+              </w:rPr>
+            </m:ctrlPr>
+          </m:sSubPr>
+          <m:e>
+            <m:r>
+              <w:rPr>
+                <w:rFonts w:ascii="Cambria Math" w:hAnsi="Cambria Math" w:cs="Arial"/>
+              </w:rPr>
+              <m:t>c</m:t>
+            </m:r>
+          </m:e>
+          <m:sub>
+            <m:r>
+              <w:rPr>
+                <w:rFonts w:ascii="Cambria Math" w:hAnsi="Cambria Math" w:cs="Arial"/>
+              </w:rPr>
+              <m:t>j</m:t>
+            </m:r>
+          </m:sub>
+        </m:sSub>
+      </m:oMath>
+      <w:r>
+        <w:rPr>
+          <w:rFonts w:ascii="Arial" w:hAnsi="Arial" w:cs="Arial"/>
+        </w:rPr>
+        <w:t xml:space="preserve"> del artículo</w:t>
+      </w:r>
+      <w:r>
+        <w:rPr>
+          <w:rFonts w:ascii="Arial" w:hAnsi="Arial" w:cs="Arial"/>
+        </w:rPr>
+        <w:t xml:space="preserve"> </w:t>
+      </w:r>
+      <m:oMath>
+        <m:r>
+          <w:rPr>
+            <w:rFonts w:ascii="Cambria Math" w:hAnsi="Cambria Math" w:cs="Arial"/>
+          </w:rPr>
+          <m:t>j</m:t>
+        </m:r>
+      </m:oMath>
+      <w:r>
+        <w:rPr>
+          <w:rFonts w:ascii="Arial" w:hAnsi="Arial" w:cs="Arial"/>
+        </w:rPr>
+        <w:t>, pero el resto de la mochila no está llenado de forma óptima.</w:t>
+      </w:r>
+    </w:p>
+    <w:p>
+      <w:pPr>
+        <w:ind w:left="708"/>
+        <w:jc w:val="both"/>
+        <w:rPr>
+          <w:rFonts w:ascii="Arial" w:hAnsi="Arial" w:cs="Arial"/>
+        </w:rPr>
+      </w:pPr>
+      <w:r>
+        <w:rPr>
+          <w:rFonts w:ascii="Arial" w:hAnsi="Arial" w:cs="Arial"/>
+        </w:rPr>
+        <w:t xml:space="preserve">Entonces existe otra combinación de artículos para llenar la capacidad restante </w:t>
+      </w:r>
+      <m:oMath>
+        <m:r>
+          <w:rPr>
+            <w:rFonts w:ascii="Cambria Math" w:hAnsi="Cambria Math" w:cs="Arial"/>
+          </w:rPr>
+          <m:t>W-</m:t>
+        </m:r>
+        <m:sSub>
+          <m:sSubPr>
+            <m:ctrlPr>
+              <w:rPr>
+                <w:rFonts w:ascii="Cambria Math" w:hAnsi="Cambria Math" w:cs="Arial"/>
+              </w:rPr>
+            </m:ctrlPr>
+          </m:sSubPr>
+          <m:e>
+            <m:r>
+              <w:rPr>
+                <w:rFonts w:ascii="Cambria Math" w:hAnsi="Cambria Math" w:cs="Arial"/>
+              </w:rPr>
+              <m:t>c</m:t>
+            </m:r>
+          </m:e>
+          <m:sub>
+            <m:r>
+              <w:rPr>
+                <w:rFonts w:ascii="Cambria Math" w:hAnsi="Cambria Math" w:cs="Arial"/>
+              </w:rPr>
+              <m:t>j</m:t>
+            </m:r>
+          </m:sub>
+        </m:sSub>
+        <m:r>
+          <w:rPr>
+            <w:rFonts w:ascii="Cambria Math" w:hAnsi="Cambria Math" w:cs="Arial"/>
+          </w:rPr>
+          <m:t xml:space="preserve"> </m:t>
+        </m:r>
+      </m:oMath>
+      <w:r>
+        <w:rPr>
+          <w:rFonts w:ascii="Arial" w:hAnsi="Arial" w:cs="Arial"/>
+        </w:rPr>
+        <w:t>con mayor valor.</w:t>
+      </w:r>
+    </w:p>
+    <w:p>
+      <w:pPr>
+        <w:ind w:left="708"/>
+        <w:jc w:val="both"/>
+        <w:rPr>
+          <w:rFonts w:ascii="Arial" w:hAnsi="Arial" w:cs="Arial"/>
+        </w:rPr>
+      </w:pPr>
+      <w:r>
+        <w:rPr>
+          <w:rFonts w:ascii="Arial" w:hAnsi="Arial" w:cs="Arial"/>
+        </w:rPr>
+        <w:t>Si reemplazamos el resto subóptimo por ese resto óptimo obtenemos una solución total con mayor valor que la supuesta solución óptima original.</w:t>
+      </w:r>
+    </w:p>
+    <w:p>
+      <w:pPr>
+        <w:ind w:left="708"/>
+        <w:jc w:val="both"/>
+        <w:rPr>
+          <w:rFonts w:ascii="Arial" w:hAnsi="Arial" w:cs="Arial"/>
+        </w:rPr>
+      </w:pPr>
+      <w:r>
+        <w:rPr>
+          <w:rFonts w:ascii="Arial" w:hAnsi="Arial" w:cs="Arial"/>
+        </w:rPr>
+        <w:t>Es</w:t>
+      </w:r>
+      <w:r>
+        <w:rPr>
+          <w:rFonts w:ascii="Arial" w:hAnsi="Arial" w:cs="Arial"/>
+        </w:rPr>
+        <w:t>t</w:t>
+      </w:r>
+      <w:r>
+        <w:rPr>
+          <w:rFonts w:ascii="Arial" w:hAnsi="Arial" w:cs="Arial"/>
+        </w:rPr>
+        <w:t>o es una contradicción</w:t>
+      </w:r>
+      <w:r>
+        <w:rPr>
+          <w:rFonts w:ascii="Arial" w:hAnsi="Arial" w:cs="Arial"/>
+        </w:rPr>
+        <w:t>,</w:t>
+      </w:r>
+      <w:r>
+        <w:rPr>
+          <w:rFonts w:ascii="Arial" w:hAnsi="Arial" w:cs="Arial"/>
+        </w:rPr>
+        <w:t xml:space="preserve"> </w:t>
+      </w:r>
+      <w:r>
+        <w:rPr>
+          <w:rFonts w:ascii="Arial" w:hAnsi="Arial" w:cs="Arial"/>
+        </w:rPr>
+        <w:t>por lo que</w:t>
+      </w:r>
+      <w:r>
+        <w:rPr>
+          <w:rFonts w:ascii="Arial" w:hAnsi="Arial" w:cs="Arial"/>
+        </w:rPr>
+        <w:t xml:space="preserve"> después de cualquier decisión que pertenezca a una solución óptima, el subproblema restante también debe resolverse óptimamente.</w:t>
+      </w:r>
+    </w:p>
+    <w:p>
+      <w:pPr>
+        <w:ind w:left="708"/>
+        <w:jc w:val="both"/>
+        <w:rPr>
+          <w:rFonts w:ascii="Arial" w:hAnsi="Arial" w:cs="Arial"/>
+        </w:rPr>
+      </w:pPr>
+      <w:r>
+        <w:rPr>
+          <w:rFonts w:ascii="Arial" w:hAnsi="Arial" w:cs="Arial"/>
+        </w:rPr>
+        <w:t>Esto demuestra</w:t>
+      </w:r>
+      <w:r>
+        <w:rPr>
+          <w:rFonts w:ascii="Arial" w:hAnsi="Arial" w:cs="Arial"/>
+        </w:rPr>
+        <w:t xml:space="preserve"> la</w:t>
+      </w:r>
+      <w:r>
+        <w:rPr>
+          <w:rFonts w:ascii="Arial" w:hAnsi="Arial" w:cs="Arial"/>
+        </w:rPr>
+        <w:t xml:space="preserve"> subestructura óptima.</w:t>
+      </w:r>
+    </w:p>
+    <w:p>
+      <w:pPr>
+        <w:ind w:left="708"/>
+        <w:jc w:val="both"/>
+        <w:rPr>
+          <w:rFonts w:ascii="Arial" w:hAnsi="Arial" w:cs="Arial"/>
+          <w:lang w:val="es-US"/>
+        </w:rPr>
+      </w:pPr>
+    </w:p>
+    <w:p>
+      <w:pPr>
+        <w:ind w:firstLine="708"/>
+        <w:jc w:val="both"/>
+        <w:rPr>
+          <w:rFonts w:ascii="Arial" w:hAnsi="Arial" w:cs="Arial"/>
+          <w:lang w:val="es-US"/>
+        </w:rPr>
+      </w:pPr>
+      <w:r>
+        <w:rPr>
+          <w:rFonts w:ascii="Arial" w:hAnsi="Arial" w:cs="Arial"/>
+          <w:lang w:val="es-US"/>
+        </w:rPr>
+        <w:t>Greedy-</w:t>
+      </w:r>
+      <w:proofErr w:type="spellStart"/>
+      <w:r>
+        <w:rPr>
+          <w:rFonts w:ascii="Arial" w:hAnsi="Arial" w:cs="Arial"/>
+          <w:lang w:val="es-US"/>
+        </w:rPr>
+        <w:t>choice</w:t>
+      </w:r>
+      <w:proofErr w:type="spellEnd"/>
+      <w:r>
+        <w:rPr>
+          <w:rFonts w:ascii="Arial" w:hAnsi="Arial" w:cs="Arial"/>
+          <w:lang w:val="es-US"/>
+        </w:rPr>
+        <w:t xml:space="preserve"> </w:t>
+      </w:r>
+      <w:proofErr w:type="spellStart"/>
+      <w:r>
+        <w:rPr>
+          <w:rFonts w:ascii="Arial" w:hAnsi="Arial" w:cs="Arial"/>
+          <w:lang w:val="es-US"/>
+        </w:rPr>
+        <w:t>property</w:t>
+      </w:r>
+      <w:proofErr w:type="spellEnd"/>
+      <w:r>
+        <w:rPr>
+          <w:rFonts w:ascii="Arial" w:hAnsi="Arial" w:cs="Arial"/>
+          <w:lang w:val="es-US"/>
+        </w:rPr>
+        <w:t>:</w:t>
+      </w:r>
+    </w:p>
+    <w:p>
+      <w:pPr>
+        <w:ind w:left="708"/>
+        <w:jc w:val="both"/>
+        <w:rPr>
+          <w:rFonts w:ascii="Arial" w:hAnsi="Arial" w:cs="Arial"/>
+        </w:rPr>
+      </w:pPr>
+      <w:r>
+        <w:rPr>
+          <w:rFonts w:ascii="Arial" w:hAnsi="Arial" w:cs="Arial"/>
+        </w:rPr>
+        <w:t xml:space="preserve">La decisión </w:t>
+      </w:r>
+      <w:proofErr w:type="spellStart"/>
+      <w:r>
+        <w:rPr>
+          <w:rFonts w:ascii="Arial" w:hAnsi="Arial" w:cs="Arial"/>
+        </w:rPr>
+        <w:t>greedy</w:t>
+      </w:r>
+      <w:proofErr w:type="spellEnd"/>
+      <w:r>
+        <w:rPr>
+          <w:rFonts w:ascii="Arial" w:hAnsi="Arial" w:cs="Arial"/>
+        </w:rPr>
+        <w:t xml:space="preserve"> es tomar primero la mayor cantidad posible del artículo con mayor valor por unidad.</w:t>
+      </w:r>
+    </w:p>
+    <w:p>
+      <w:pPr>
+        <w:ind w:left="708"/>
+        <w:jc w:val="both"/>
+        <w:rPr>
+          <w:rFonts w:ascii="Arial" w:hAnsi="Arial" w:cs="Arial"/>
+        </w:rPr>
+      </w:pPr>
+      <w:r>
+        <w:rPr>
+          <w:rFonts w:ascii="Arial" w:hAnsi="Arial" w:cs="Arial"/>
+        </w:rPr>
+        <w:t xml:space="preserve">Sea g el artículo con mayor </w:t>
+      </w:r>
+      <w:r>
+        <w:rPr>
+          <w:rFonts w:ascii="Arial" w:hAnsi="Arial" w:cs="Arial"/>
+        </w:rPr>
+        <w:t>valor</w:t>
+      </w:r>
+      <w:r>
+        <w:rPr>
+          <w:rFonts w:ascii="Arial" w:hAnsi="Arial" w:cs="Arial"/>
+        </w:rPr>
+        <w:t>:</w:t>
+      </w:r>
+    </w:p>
+    <w:p>
+      <w:pPr>
+        <w:ind w:left="708"/>
+        <w:jc w:val="both"/>
+        <w:rPr>
+          <w:rFonts w:ascii="Arial" w:hAnsi="Arial" w:cs="Arial"/>
+        </w:rPr>
+      </w:pPr>
+      <m:oMathPara>
+        <m:oMath>
+          <m:sSub>
+            <m:sSubPr>
+              <m:ctrlPr>
+                <w:rPr>
+                  <w:rFonts w:ascii="Cambria Math" w:hAnsi="Cambria Math" w:cs="Arial"/>
+                </w:rPr>
+              </m:ctrlPr>
+            </m:sSubPr>
+            <m:e>
+              <m:r>
+                <w:rPr>
+                  <w:rFonts w:ascii="Cambria Math" w:hAnsi="Cambria Math" w:cs="Arial"/>
+                </w:rPr>
+                <m:t>ρ</m:t>
+              </m:r>
+            </m:e>
+            <m:sub>
+              <m:r>
+                <w:rPr>
+                  <w:rFonts w:ascii="Cambria Math" w:hAnsi="Cambria Math" w:cs="Arial"/>
+                </w:rPr>
+                <m:t>g</m:t>
+              </m:r>
+            </m:sub>
+          </m:sSub>
+          <m:r>
+            <w:rPr>
+              <w:rFonts w:ascii="Cambria Math" w:hAnsi="Cambria Math" w:cs="Arial"/>
+            </w:rPr>
+            <m:t>=</m:t>
+          </m:r>
+          <m:f>
+            <m:fPr>
+              <m:ctrlPr>
+                <w:rPr>
+                  <w:rFonts w:ascii="Cambria Math" w:hAnsi="Cambria Math" w:cs="Arial"/>
+                </w:rPr>
+              </m:ctrlPr>
+            </m:fPr>
+            <m:num>
+              <m:sSub>
+                <m:sSubPr>
+                  <m:ctrlPr>
+                    <w:rPr>
+                      <w:rFonts w:ascii="Cambria Math" w:hAnsi="Cambria Math" w:cs="Arial"/>
+                    </w:rPr>
+                  </m:ctrlPr>
+                </m:sSubPr>
+                <m:e>
+                  <m:r>
+                    <w:rPr>
+                      <w:rFonts w:ascii="Cambria Math" w:hAnsi="Cambria Math" w:cs="Arial"/>
+                    </w:rPr>
+                    <m:t>p</m:t>
+                  </m:r>
+                </m:e>
+                <m:sub>
+                  <m:r>
+                    <w:rPr>
+                      <w:rFonts w:ascii="Cambria Math" w:hAnsi="Cambria Math" w:cs="Arial"/>
+                    </w:rPr>
+                    <m:t>g</m:t>
+                  </m:r>
+                </m:sub>
+              </m:sSub>
+            </m:num>
+            <m:den>
+              <m:sSub>
+                <m:sSubPr>
+                  <m:ctrlPr>
+                    <w:rPr>
+                      <w:rFonts w:ascii="Cambria Math" w:hAnsi="Cambria Math" w:cs="Arial"/>
+                    </w:rPr>
+                  </m:ctrlPr>
+                </m:sSubPr>
+                <m:e>
+                  <m:r>
+                    <w:rPr>
+                      <w:rFonts w:ascii="Cambria Math" w:hAnsi="Cambria Math" w:cs="Arial"/>
+                    </w:rPr>
+                    <m:t>w</m:t>
+                  </m:r>
+                </m:e>
+                <m:sub>
+                  <m:r>
+                    <w:rPr>
+                      <w:rFonts w:ascii="Cambria Math" w:hAnsi="Cambria Math" w:cs="Arial"/>
+                    </w:rPr>
+                    <m:t>g</m:t>
+                  </m:r>
+                </m:sub>
+              </m:sSub>
+            </m:den>
+          </m:f>
+          <m:r>
+            <w:rPr>
+              <w:rFonts w:ascii="Arial" w:hAnsi="Arial" w:cs="Arial"/>
+            </w:rPr>
+            <w:br/>
+          </m:r>
+        </m:oMath>
+      </m:oMathPara>
+    </w:p>
+    <w:p>
+      <w:pPr>
+        <w:ind w:left="708"/>
+        <w:jc w:val="both"/>
+        <w:rPr>
+          <w:rFonts w:ascii="Arial" w:hAnsi="Arial" w:cs="Arial"/>
+        </w:rPr>
+      </w:pPr>
+      <w:r>
+        <w:rPr>
+          <w:rFonts w:ascii="Arial" w:hAnsi="Arial" w:cs="Arial"/>
+        </w:rPr>
+        <w:lastRenderedPageBreak/>
+        <w:t>Entonces para cualquier otro artículo j:</w:t>
+      </w:r>
+    </w:p>
+    <w:p>
+      <w:pPr>
+        <w:ind w:left="708"/>
+        <w:jc w:val="both"/>
+        <w:rPr>
+          <w:rFonts w:ascii="Arial" w:hAnsi="Arial" w:cs="Arial"/>
+        </w:rPr>
+      </w:pPr>
+      <m:oMathPara>
+        <m:oMath>
+          <m:sSub>
+            <m:sSubPr>
+              <m:ctrlPr>
+                <w:rPr>
+                  <w:rFonts w:ascii="Cambria Math" w:hAnsi="Cambria Math" w:cs="Arial"/>
+                </w:rPr>
+              </m:ctrlPr>
+            </m:sSubPr>
+            <m:e>
+              <m:r>
+                <w:rPr>
+                  <w:rFonts w:ascii="Cambria Math" w:hAnsi="Cambria Math" w:cs="Arial"/>
+                </w:rPr>
+                <m:t>ρ</m:t>
+              </m:r>
+            </m:e>
+            <m:sub>
+              <m:r>
+                <w:rPr>
+                  <w:rFonts w:ascii="Cambria Math" w:hAnsi="Cambria Math" w:cs="Arial"/>
+                </w:rPr>
+                <m:t>g</m:t>
+              </m:r>
+            </m:sub>
+          </m:sSub>
+          <m:r>
+            <w:rPr>
+              <w:rFonts w:ascii="Cambria Math" w:hAnsi="Cambria Math" w:cs="Arial"/>
+            </w:rPr>
+            <m:t>≥</m:t>
+          </m:r>
+          <m:sSub>
+            <m:sSubPr>
+              <m:ctrlPr>
+                <w:rPr>
+                  <w:rFonts w:ascii="Cambria Math" w:hAnsi="Cambria Math" w:cs="Arial"/>
+                </w:rPr>
+              </m:ctrlPr>
+            </m:sSubPr>
+            <m:e>
+              <m:r>
+                <w:rPr>
+                  <w:rFonts w:ascii="Cambria Math" w:hAnsi="Cambria Math" w:cs="Arial"/>
+                </w:rPr>
+                <m:t>ρ</m:t>
+              </m:r>
+            </m:e>
+            <m:sub>
+              <m:r>
+                <w:rPr>
+                  <w:rFonts w:ascii="Cambria Math" w:hAnsi="Cambria Math" w:cs="Arial"/>
+                </w:rPr>
+                <m:t>j</m:t>
+              </m:r>
+            </m:sub>
+          </m:sSub>
+          <m:r>
+            <w:rPr>
+              <w:rFonts w:ascii="Arial" w:hAnsi="Arial" w:cs="Arial"/>
+            </w:rPr>
+            <w:br/>
+          </m:r>
+        </m:oMath>
+      </m:oMathPara>
+    </w:p>
+    <w:p>
+      <w:pPr>
+        <w:ind w:left="708"/>
+        <w:jc w:val="both"/>
+        <w:rPr>
+          <w:rFonts w:ascii="Arial" w:hAnsi="Arial" w:cs="Arial"/>
+        </w:rPr>
+      </w:pPr>
+      <w:r>
+        <w:rPr>
+          <w:rFonts w:ascii="Arial" w:hAnsi="Arial" w:cs="Arial"/>
+        </w:rPr>
+        <w:t xml:space="preserve">Supongamos que existe una solución óptima </w:t>
+      </w:r>
+      <m:oMath>
+        <m:r>
+          <w:rPr>
+            <w:rFonts w:ascii="Cambria Math" w:hAnsi="Cambria Math" w:cs="Arial"/>
+          </w:rPr>
+          <m:t>O</m:t>
+        </m:r>
+      </m:oMath>
+      <w:r>
+        <w:rPr>
+          <w:rFonts w:ascii="Arial" w:hAnsi="Arial" w:cs="Arial"/>
+        </w:rPr>
+        <w:t xml:space="preserve"> que no toma todo lo posible del artículo </w:t>
+      </w:r>
+      <m:oMath>
+        <m:r>
+          <w:rPr>
+            <w:rFonts w:ascii="Cambria Math" w:hAnsi="Cambria Math" w:cs="Arial"/>
+          </w:rPr>
+          <m:t>g</m:t>
+        </m:r>
+      </m:oMath>
+      <w:r>
+        <w:rPr>
+          <w:rFonts w:ascii="Arial" w:hAnsi="Arial" w:cs="Arial"/>
+        </w:rPr>
+        <w:t>.</w:t>
+      </w:r>
+    </w:p>
+    <w:p>
+      <w:pPr>
+        <w:ind w:left="708"/>
+        <w:jc w:val="both"/>
+        <w:rPr>
+          <w:rFonts w:ascii="Arial" w:hAnsi="Arial" w:cs="Arial"/>
+        </w:rPr>
+      </w:pPr>
+      <w:r>
+        <w:rPr>
+          <w:rFonts w:ascii="Arial" w:hAnsi="Arial" w:cs="Arial"/>
+        </w:rPr>
+        <w:t xml:space="preserve">Eso significa que en </w:t>
+      </w:r>
+      <m:oMath>
+        <m:r>
+          <w:rPr>
+            <w:rFonts w:ascii="Cambria Math" w:hAnsi="Cambria Math" w:cs="Arial"/>
+          </w:rPr>
+          <m:t>O</m:t>
+        </m:r>
+      </m:oMath>
+      <w:r>
+        <w:rPr>
+          <w:rFonts w:ascii="Arial" w:hAnsi="Arial" w:cs="Arial"/>
+        </w:rPr>
+        <w:t xml:space="preserve"> queda alguna cantidad disponible del artículo </w:t>
+      </w:r>
+      <m:oMath>
+        <m:r>
+          <w:rPr>
+            <w:rFonts w:ascii="Cambria Math" w:hAnsi="Cambria Math" w:cs="Arial"/>
+          </w:rPr>
+          <m:t>g</m:t>
+        </m:r>
+      </m:oMath>
+      <w:r>
+        <w:rPr>
+          <w:rFonts w:ascii="Arial" w:hAnsi="Arial" w:cs="Arial"/>
+        </w:rPr>
+        <w:t xml:space="preserve">, pero se tomó una cantidad positiva de otro artículo </w:t>
+      </w:r>
+      <m:oMath>
+        <m:r>
+          <w:rPr>
+            <w:rFonts w:ascii="Cambria Math" w:hAnsi="Cambria Math" w:cs="Arial"/>
+          </w:rPr>
+          <m:t>j</m:t>
+        </m:r>
+      </m:oMath>
+      <w:r>
+        <w:rPr>
+          <w:rFonts w:ascii="Arial" w:hAnsi="Arial" w:cs="Arial"/>
+        </w:rPr>
+        <w:t xml:space="preserve"> con </w:t>
+      </w:r>
+      <w:r>
+        <w:rPr>
+          <w:rFonts w:ascii="Arial" w:hAnsi="Arial" w:cs="Arial"/>
+        </w:rPr>
+        <w:t>valor</w:t>
+      </w:r>
+      <w:r>
+        <w:rPr>
+          <w:rFonts w:ascii="Arial" w:hAnsi="Arial" w:cs="Arial"/>
+        </w:rPr>
+        <w:t xml:space="preserve"> menor o igual.</w:t>
+      </w:r>
+    </w:p>
+    <w:p>
+      <w:pPr>
+        <w:ind w:left="708"/>
+        <w:jc w:val="both"/>
+        <w:rPr>
+          <w:rFonts w:ascii="Arial" w:hAnsi="Arial" w:cs="Arial"/>
+        </w:rPr>
+      </w:pPr>
+      <w:r>
+        <w:rPr>
+          <w:rFonts w:ascii="Arial" w:hAnsi="Arial" w:cs="Arial"/>
+        </w:rPr>
+        <w:t>Si se toma</w:t>
+      </w:r>
+      <w:r>
+        <w:rPr>
+          <w:rFonts w:ascii="Arial" w:hAnsi="Arial" w:cs="Arial"/>
+        </w:rPr>
+        <w:t xml:space="preserve"> una pequeña cantidad </w:t>
+      </w:r>
+      <m:oMath>
+        <m:r>
+          <w:rPr>
+            <w:rFonts w:ascii="Cambria Math" w:hAnsi="Cambria Math" w:cs="Arial"/>
+          </w:rPr>
+          <m:t>µ</m:t>
+        </m:r>
+      </m:oMath>
+      <w:r>
+        <w:rPr>
+          <w:rFonts w:ascii="Arial" w:hAnsi="Arial" w:cs="Arial"/>
+        </w:rPr>
+        <w:t xml:space="preserve"> </w:t>
+      </w:r>
+      <w:r>
+        <w:rPr>
+          <w:rFonts w:ascii="Arial" w:hAnsi="Arial" w:cs="Arial"/>
+        </w:rPr>
+        <w:t xml:space="preserve">del artículo </w:t>
+      </w:r>
+      <m:oMath>
+        <m:r>
+          <w:rPr>
+            <w:rFonts w:ascii="Cambria Math" w:hAnsi="Cambria Math" w:cs="Arial"/>
+          </w:rPr>
+          <m:t>j</m:t>
+        </m:r>
+      </m:oMath>
+      <w:r>
+        <w:rPr>
+          <w:rFonts w:ascii="Arial" w:hAnsi="Arial" w:cs="Arial"/>
+        </w:rPr>
+        <w:t xml:space="preserve"> </w:t>
+      </w:r>
+      <w:r>
+        <w:rPr>
+          <w:rFonts w:ascii="Arial" w:hAnsi="Arial" w:cs="Arial"/>
+        </w:rPr>
+        <w:t xml:space="preserve">y </w:t>
+      </w:r>
+      <w:r>
+        <w:rPr>
+          <w:rFonts w:ascii="Arial" w:hAnsi="Arial" w:cs="Arial"/>
+        </w:rPr>
+        <w:t>se reemplaza</w:t>
+      </w:r>
+      <w:r>
+        <w:rPr>
+          <w:rFonts w:ascii="Arial" w:hAnsi="Arial" w:cs="Arial"/>
+        </w:rPr>
+        <w:t xml:space="preserve"> por la misma cantidad </w:t>
+      </w:r>
+      <m:oMath>
+        <m:r>
+          <w:rPr>
+            <w:rFonts w:ascii="Cambria Math" w:hAnsi="Cambria Math" w:cs="Arial"/>
+          </w:rPr>
+          <m:t>µ</m:t>
+        </m:r>
+      </m:oMath>
+      <w:r>
+        <w:rPr>
+          <w:rFonts w:ascii="Arial" w:hAnsi="Arial" w:cs="Arial"/>
+        </w:rPr>
+        <w:t xml:space="preserve"> del artículo </w:t>
+      </w:r>
+      <m:oMath>
+        <m:r>
+          <w:rPr>
+            <w:rFonts w:ascii="Cambria Math" w:hAnsi="Cambria Math" w:cs="Arial"/>
+          </w:rPr>
+          <m:t>g</m:t>
+        </m:r>
+      </m:oMath>
+      <w:r>
+        <w:rPr>
+          <w:rFonts w:ascii="Arial" w:hAnsi="Arial" w:cs="Arial"/>
+        </w:rPr>
+        <w:t>, e</w:t>
+      </w:r>
+      <w:r>
+        <w:rPr>
+          <w:rFonts w:ascii="Arial" w:hAnsi="Arial" w:cs="Arial"/>
+        </w:rPr>
+        <w:t xml:space="preserve">l peso total de la mochila no cambia, porque quitamos </w:t>
+      </w:r>
+      <m:oMath>
+        <m:r>
+          <w:rPr>
+            <w:rFonts w:ascii="Cambria Math" w:hAnsi="Cambria Math" w:cs="Arial"/>
+          </w:rPr>
+          <m:t>µ</m:t>
+        </m:r>
+      </m:oMath>
+      <w:r>
+        <w:rPr>
+          <w:rFonts w:ascii="Arial" w:hAnsi="Arial" w:cs="Arial"/>
+        </w:rPr>
+        <w:t xml:space="preserve"> </w:t>
+      </w:r>
+      <w:r>
+        <w:rPr>
+          <w:rFonts w:ascii="Arial" w:hAnsi="Arial" w:cs="Arial"/>
+        </w:rPr>
+        <w:t xml:space="preserve">unidades y agregamos </w:t>
+      </w:r>
+      <m:oMath>
+        <m:r>
+          <w:rPr>
+            <w:rFonts w:ascii="Cambria Math" w:hAnsi="Cambria Math" w:cs="Arial"/>
+          </w:rPr>
+          <m:t>µ</m:t>
+        </m:r>
+      </m:oMath>
+      <w:r>
+        <w:rPr>
+          <w:rFonts w:ascii="Arial" w:hAnsi="Arial" w:cs="Arial"/>
+        </w:rPr>
+        <w:t xml:space="preserve"> </w:t>
+      </w:r>
+      <w:r>
+        <w:rPr>
+          <w:rFonts w:ascii="Arial" w:hAnsi="Arial" w:cs="Arial"/>
+        </w:rPr>
+        <w:t>unidades.</w:t>
+      </w:r>
+    </w:p>
+    <w:p>
+      <w:pPr>
+        <w:ind w:left="708"/>
+        <w:jc w:val="both"/>
+        <w:rPr>
+          <w:rFonts w:ascii="Arial" w:hAnsi="Arial" w:cs="Arial"/>
+        </w:rPr>
+      </w:pPr>
+      <w:r>
+        <w:rPr>
+          <w:rFonts w:ascii="Arial" w:hAnsi="Arial" w:cs="Arial"/>
+        </w:rPr>
+        <w:t>Pero el valor cambia así:</w:t>
+      </w:r>
+    </w:p>
+    <w:p>
+      <w:pPr>
+        <w:ind w:left="708"/>
+        <w:jc w:val="both"/>
+        <w:rPr>
+          <w:rFonts w:ascii="Arial" w:hAnsi="Arial" w:cs="Arial"/>
+        </w:rPr>
+      </w:pPr>
+      <m:oMathPara>
+        <m:oMath>
+          <m:r>
+            <w:rPr>
+              <w:rFonts w:ascii="Cambria Math" w:hAnsi="Cambria Math" w:cs="Arial"/>
+            </w:rPr>
+            <m:t>µ</m:t>
+          </m:r>
+          <m:sSub>
+            <m:sSubPr>
+              <m:ctrlPr>
+                <w:rPr>
+                  <w:rFonts w:ascii="Cambria Math" w:hAnsi="Cambria Math" w:cs="Arial"/>
+                </w:rPr>
+              </m:ctrlPr>
+            </m:sSubPr>
+            <m:e>
+              <m:r>
+                <w:rPr>
+                  <w:rFonts w:ascii="Cambria Math" w:hAnsi="Cambria Math" w:cs="Arial"/>
+                </w:rPr>
+                <m:t>ρ</m:t>
+              </m:r>
+            </m:e>
+            <m:sub>
+              <m:r>
+                <w:rPr>
+                  <w:rFonts w:ascii="Cambria Math" w:hAnsi="Cambria Math" w:cs="Arial"/>
+                </w:rPr>
+                <m:t>g</m:t>
+              </m:r>
+            </m:sub>
+          </m:sSub>
+          <m:r>
+            <w:rPr>
+              <w:rFonts w:ascii="Cambria Math" w:hAnsi="Cambria Math" w:cs="Arial"/>
+            </w:rPr>
+            <m:t>-</m:t>
+          </m:r>
+          <m:r>
+            <m:rPr>
+              <m:sty m:val="p"/>
+            </m:rPr>
+            <w:rPr>
+              <w:rFonts w:ascii="Cambria Math" w:hAnsi="Cambria Math" w:cs="Arial"/>
+            </w:rPr>
+            <m:t>µ</m:t>
+          </m:r>
+          <m:sSub>
+            <m:sSubPr>
+              <m:ctrlPr>
+                <w:rPr>
+                  <w:rFonts w:ascii="Cambria Math" w:hAnsi="Cambria Math" w:cs="Arial"/>
+                </w:rPr>
+              </m:ctrlPr>
+            </m:sSubPr>
+            <m:e>
+              <m:r>
+                <w:rPr>
+                  <w:rFonts w:ascii="Cambria Math" w:hAnsi="Cambria Math" w:cs="Arial"/>
+                </w:rPr>
+                <m:t>ρ</m:t>
+              </m:r>
+            </m:e>
+            <m:sub>
+              <m:r>
+                <w:rPr>
+                  <w:rFonts w:ascii="Cambria Math" w:hAnsi="Cambria Math" w:cs="Arial"/>
+                </w:rPr>
+                <m:t>j</m:t>
+              </m:r>
+            </m:sub>
+          </m:sSub>
+          <m:r>
+            <w:rPr>
+              <w:rFonts w:ascii="Arial" w:hAnsi="Arial" w:cs="Arial"/>
+            </w:rPr>
+            <w:br/>
+          </m:r>
+        </m:oMath>
+      </m:oMathPara>
+    </w:p>
+    <w:p>
+      <w:pPr>
+        <w:ind w:left="708"/>
+        <w:jc w:val="both"/>
+        <w:rPr>
+          <w:rFonts w:ascii="Arial" w:hAnsi="Arial" w:cs="Arial"/>
+        </w:rPr>
+      </w:pPr>
+      <w:r>
+        <w:rPr>
+          <w:rFonts w:ascii="Arial" w:hAnsi="Arial" w:cs="Arial"/>
+        </w:rPr>
+        <w:t>Como:</w:t>
+      </w:r>
+    </w:p>
+    <w:p>
+      <w:pPr>
+        <w:ind w:left="708"/>
+        <w:jc w:val="both"/>
+        <w:rPr>
+          <w:rFonts w:ascii="Arial" w:hAnsi="Arial" w:cs="Arial"/>
+        </w:rPr>
+      </w:pPr>
+      <m:oMathPara>
+        <m:oMath>
+          <m:sSub>
+            <m:sSubPr>
+              <m:ctrlPr>
+                <w:rPr>
+                  <w:rFonts w:ascii="Cambria Math" w:hAnsi="Cambria Math" w:cs="Arial"/>
+                </w:rPr>
+              </m:ctrlPr>
+            </m:sSubPr>
+            <m:e>
+              <m:r>
+                <w:rPr>
+                  <w:rFonts w:ascii="Cambria Math" w:hAnsi="Cambria Math" w:cs="Arial"/>
+                </w:rPr>
+                <m:t>ρ</m:t>
+              </m:r>
+            </m:e>
+            <m:sub>
+              <m:r>
+                <w:rPr>
+                  <w:rFonts w:ascii="Cambria Math" w:hAnsi="Cambria Math" w:cs="Arial"/>
+                </w:rPr>
+                <m:t>g</m:t>
+              </m:r>
+            </m:sub>
+          </m:sSub>
+          <m:r>
+            <w:rPr>
+              <w:rFonts w:ascii="Cambria Math" w:hAnsi="Cambria Math" w:cs="Arial"/>
+            </w:rPr>
+            <m:t>≥</m:t>
+          </m:r>
+          <m:sSub>
+            <m:sSubPr>
+              <m:ctrlPr>
+                <w:rPr>
+                  <w:rFonts w:ascii="Cambria Math" w:hAnsi="Cambria Math" w:cs="Arial"/>
+                </w:rPr>
+              </m:ctrlPr>
+            </m:sSubPr>
+            <m:e>
+              <m:r>
+                <w:rPr>
+                  <w:rFonts w:ascii="Cambria Math" w:hAnsi="Cambria Math" w:cs="Arial"/>
+                </w:rPr>
+                <m:t>ρ</m:t>
+              </m:r>
+            </m:e>
+            <m:sub>
+              <m:r>
+                <w:rPr>
+                  <w:rFonts w:ascii="Cambria Math" w:hAnsi="Cambria Math" w:cs="Arial"/>
+                </w:rPr>
+                <m:t>j</m:t>
+              </m:r>
+            </m:sub>
+          </m:sSub>
+          <m:r>
+            <w:rPr>
+              <w:rFonts w:ascii="Arial" w:hAnsi="Arial" w:cs="Arial"/>
+            </w:rPr>
+            <w:br/>
+          </m:r>
+        </m:oMath>
+      </m:oMathPara>
+    </w:p>
+    <w:p>
+      <w:pPr>
+        <w:ind w:left="708"/>
+        <w:jc w:val="both"/>
+        <w:rPr>
+          <w:rFonts w:ascii="Arial" w:hAnsi="Arial" w:cs="Arial"/>
+        </w:rPr>
+      </w:pPr>
+      <w:r>
+        <w:rPr>
+          <w:rFonts w:ascii="Arial" w:hAnsi="Arial" w:cs="Arial"/>
+        </w:rPr>
+        <w:t>el valor no disminuye. Si la desigualdad es estricta, el valor aumenta.</w:t>
+      </w:r>
+    </w:p>
+    <w:p>
+      <w:pPr>
+        <w:ind w:left="708"/>
+        <w:jc w:val="both"/>
+        <w:rPr>
+          <w:rFonts w:ascii="Arial" w:hAnsi="Arial" w:cs="Arial"/>
+        </w:rPr>
+      </w:pPr>
+      <w:r>
+        <w:rPr>
+          <w:rFonts w:ascii="Arial" w:hAnsi="Arial" w:cs="Arial"/>
+        </w:rPr>
+        <w:t>Por tanto, cualquier solución óptima que no tome el artículo de mayor densidad puede transformarse en otra solución igual o mejor que sí toma ese artículo.</w:t>
+      </w:r>
+    </w:p>
+    <w:p>
+      <w:pPr>
+        <w:ind w:left="708"/>
+        <w:jc w:val="both"/>
+        <w:rPr>
+          <w:rFonts w:ascii="Arial" w:hAnsi="Arial" w:cs="Arial"/>
+        </w:rPr>
+      </w:pPr>
+      <w:r>
+        <w:rPr>
+          <w:rFonts w:ascii="Arial" w:hAnsi="Arial" w:cs="Arial"/>
+        </w:rPr>
+        <w:t xml:space="preserve">Eso demuestra que existe una solución óptima que contiene la decisión </w:t>
+      </w:r>
+      <w:proofErr w:type="spellStart"/>
+      <w:r>
+        <w:rPr>
+          <w:rFonts w:ascii="Arial" w:hAnsi="Arial" w:cs="Arial"/>
+        </w:rPr>
+        <w:t>greedy</w:t>
+      </w:r>
+      <w:proofErr w:type="spellEnd"/>
+      <w:r>
+        <w:rPr>
+          <w:rFonts w:ascii="Arial" w:hAnsi="Arial" w:cs="Arial"/>
+        </w:rPr>
+        <w:t>. Después de tomar esa decisión, queda un subproblema de la misma forma</w:t>
+      </w:r>
+      <w:r>
+        <w:rPr>
+          <w:rFonts w:ascii="Arial" w:hAnsi="Arial" w:cs="Arial"/>
+        </w:rPr>
+        <w:t xml:space="preserve">, </w:t>
+      </w:r>
+      <w:r>
+        <w:rPr>
+          <w:rFonts w:ascii="Arial" w:hAnsi="Arial" w:cs="Arial"/>
+        </w:rPr>
+        <w:t>llenar la capacidad restante con los artículos restantes. Por subestructura óptima resolver ese subproblema óptimamente completa una solución óptima global.</w:t>
+      </w:r>
+    </w:p>
+    <w:p>
+      <w:pPr>
+        <w:ind w:left="708"/>
+        <w:jc w:val="both"/>
+        <w:rPr>
+          <w:rFonts w:ascii="Arial" w:hAnsi="Arial" w:cs="Arial"/>
+        </w:rPr>
+      </w:pPr>
+      <w:r>
+        <w:rPr>
+          <w:rFonts w:ascii="Arial" w:hAnsi="Arial" w:cs="Arial"/>
+        </w:rPr>
+        <w:t xml:space="preserve">Por eso el </w:t>
+      </w:r>
+      <w:proofErr w:type="spellStart"/>
+      <w:r>
+        <w:rPr>
+          <w:rFonts w:ascii="Arial" w:hAnsi="Arial" w:cs="Arial"/>
+        </w:rPr>
+        <w:t>knapsack</w:t>
+      </w:r>
+      <w:proofErr w:type="spellEnd"/>
+      <w:r>
+        <w:rPr>
+          <w:rFonts w:ascii="Arial" w:hAnsi="Arial" w:cs="Arial"/>
+        </w:rPr>
+        <w:t xml:space="preserve"> fraccionado tiene </w:t>
+      </w:r>
+      <w:proofErr w:type="spellStart"/>
+      <w:r>
+        <w:rPr>
+          <w:rFonts w:ascii="Arial" w:hAnsi="Arial" w:cs="Arial"/>
+        </w:rPr>
+        <w:t>greedy-choice</w:t>
+      </w:r>
+      <w:proofErr w:type="spellEnd"/>
+      <w:r>
+        <w:rPr>
+          <w:rFonts w:ascii="Arial" w:hAnsi="Arial" w:cs="Arial"/>
+        </w:rPr>
+        <w:t xml:space="preserve"> </w:t>
+      </w:r>
+      <w:proofErr w:type="spellStart"/>
+      <w:r>
+        <w:rPr>
+          <w:rFonts w:ascii="Arial" w:hAnsi="Arial" w:cs="Arial"/>
+        </w:rPr>
+        <w:t>property</w:t>
+      </w:r>
+      <w:proofErr w:type="spellEnd"/>
+      <w:r>
+        <w:rPr>
+          <w:rFonts w:ascii="Arial" w:hAnsi="Arial" w:cs="Arial"/>
+        </w:rPr>
+        <w:t>.</w:t>
+      </w:r>
+    </w:p>
+    <w:p>
+      <w:pPr>
+        <w:jc w:val="both"/>
+        <w:rPr>
+          <w:rFonts w:ascii="Arial" w:hAnsi="Arial" w:cs="Arial"/>
+        </w:rPr>
+      </w:pPr>
+    </w:p>
+    <w:p>
+      <w:pPr>
+        <w:ind w:left="708"/>
+        <w:jc w:val="both"/>
+        <w:rPr>
+          <w:rFonts w:ascii="Arial" w:hAnsi="Arial" w:cs="Arial"/>
+          <w:lang w:val="es-US"/>
+        </w:rPr>
+      </w:pPr>
+    </w:p>
+    <w:p>
+      <w:pPr>
+        <w:jc w:val="both"/>
+        <w:rPr>
+          <w:rFonts w:ascii="Arial" w:hAnsi="Arial" w:cs="Arial"/>
+          <w:lang w:val="es-US"/>
+        </w:rPr>
+      </w:pPr>
+    </w:p>
+    <w:p>
+      <w:pPr>
+        <w:pStyle w:val="ListParagraph"/>
+        <w:numPr>
+          <w:ilvl w:val="0"/>
+          <w:numId w:val="1"/>
+        </w:numPr>
         <w:jc w:val="both"/>
         <w:rPr>
           <w:rFonts w:ascii="Arial" w:hAnsi="Arial" w:cs="Arial"/>
@@ -3095,6 +5574,155 @@
     </w:lvl>
   </w:abstractNum>
   <w:abstractNum w:abstractNumId="3" w15:restartNumberingAfterBreak="0">
+    <w:nsid w:val="6C9C5FA5"/>
+    <w:multiLevelType w:val="multilevel"/>
+    <w:tmpl w:val="FCF6F2A0"/>
+    <w:lvl w:ilvl="0">
+      <w:start w:val="1"/>
+      <w:numFmt w:val="bullet"/>
+      <w:lvlText w:val=""/>
+      <w:lvlJc w:val="left"/>
+      <w:pPr>
+        <w:tabs>
+          <w:tab w:val="num" w:pos="1428"/>
+        </w:tabs>
+        <w:ind w:left="1428" w:hanging="360"/>
+      </w:pPr>
+      <w:rPr>
+        <w:rFonts w:ascii="Symbol" w:hAnsi="Symbol" w:hint="default"/>
+        <w:sz w:val="20"/>
+      </w:rPr>
+    </w:lvl>
+    <w:lvl w:ilvl="1" w:tentative="1">
+      <w:start w:val="1"/>
+      <w:numFmt w:val="bullet"/>
+      <w:lvlText w:val="o"/>
+      <w:lvlJc w:val="left"/>
+      <w:pPr>
+        <w:tabs>
+          <w:tab w:val="num" w:pos="2148"/>
+        </w:tabs>
+        <w:ind w:left="2148" w:hanging="360"/>
+      </w:pPr>
+      <w:rPr>
+        <w:rFonts w:ascii="Courier New" w:hAnsi="Courier New" w:hint="default"/>
+        <w:sz w:val="20"/>
+      </w:rPr>
+    </w:lvl>
+    <w:lvl w:ilvl="2" w:tentative="1">
+      <w:start w:val="1"/>
+      <w:numFmt w:val="bullet"/>
+      <w:lvlText w:val=""/>
+      <w:lvlJc w:val="left"/>
+      <w:pPr>
+        <w:tabs>
+          <w:tab w:val="num" w:pos="2868"/>
+        </w:tabs>
+        <w:ind w:left="2868" w:hanging="360"/>
+      </w:pPr>
+      <w:rPr>
+        <w:rFonts w:ascii="Wingdings" w:hAnsi="Wingdings" w:hint="default"/>
+        <w:sz w:val="20"/>
+      </w:rPr>
+    </w:lvl>
+    <w:lvl w:ilvl="3" w:tentative="1">
+      <w:start w:val="1"/>
+      <w:numFmt w:val="bullet"/>
+      <w:lvlText w:val=""/>
+      <w:lvlJc w:val="left"/>
+      <w:pPr>
+        <w:tabs>
+          <w:tab w:val="num" w:pos="3588"/>
+        </w:tabs>
+        <w:ind w:left="3588" w:hanging="360"/>
+      </w:pPr>
+      <w:rPr>
+        <w:rFonts w:ascii="Wingdings" w:hAnsi="Wingdings" w:hint="default"/>
+        <w:sz w:val="20"/>
+      </w:rPr>
+    </w:lvl>
+    <w:lvl w:ilvl="4" w:tentative="1">
+      <w:start w:val="1"/>
+      <w:numFmt w:val="bullet"/>
+      <w:lvlText w:val=""/>
+      <w:lvlJc w:val="left"/>
+      <w:pPr>
+        <w:tabs>
+          <w:tab w:val="num" w:pos="4308"/>
+        </w:tabs>
+        <w:ind w:left="4308" w:hanging="360"/>
+      </w:pPr>
+      <w:rPr>
+        <w:rFonts w:ascii="Wingdings" w:hAnsi="Wingdings" w:hint="default"/>
+        <w:sz w:val="20"/>
+      </w:rPr>
+    </w:lvl>
+    <w:lvl w:ilvl="5" w:tentative="1">
+      <w:start w:val="1"/>
+      <w:numFmt w:val="bullet"/>
+      <w:lvlText w:val=""/>
+      <w:lvlJc w:val="left"/>
+      <w:pPr>
+        <w:tabs>
+          <w:tab w:val="num" w:pos="5028"/>
+        </w:tabs>
+        <w:ind w:left="5028" w:hanging="360"/>
+      </w:pPr>
+      <w:rPr>
+        <w:rFonts w:ascii="Wingdings" w:hAnsi="Wingdings" w:hint="default"/>
+        <w:sz w:val="20"/>
+      </w:rPr>
+    </w:lvl>
+    <w:lvl w:ilvl="6" w:tentative="1">
+      <w:start w:val="1"/>
+      <w:numFmt w:val="bullet"/>
+      <w:lvlText w:val=""/>
+      <w:lvlJc w:val="left"/>
+      <w:pPr>
+        <w:tabs>
+          <w:tab w:val="num" w:pos="5748"/>
+        </w:tabs>
+        <w:ind w:left="5748" w:hanging="360"/>
+      </w:pPr>
+      <w:rPr>
+        <w:rFonts w:ascii="Wingdings" w:hAnsi="Wingdings" w:hint="default"/>
+        <w:sz w:val="20"/>
+      </w:rPr>
+    </w:lvl>
+    <w:lvl w:ilvl="7" w:tentative="1">
+      <w:start w:val="1"/>
+      <w:numFmt w:val="bullet"/>
+      <w:lvlText w:val=""/>
+      <w:lvlJc w:val="left"/>
+      <w:pPr>
+        <w:tabs>
+          <w:tab w:val="num" w:pos="6468"/>
+        </w:tabs>
+        <w:ind w:left="6468" w:hanging="360"/>
+      </w:pPr>
+      <w:rPr>
+        <w:rFonts w:ascii="Wingdings" w:hAnsi="Wingdings" w:hint="default"/>
+        <w:sz w:val="20"/>
+      </w:rPr>
+    </w:lvl>
+    <w:lvl w:ilvl="8" w:tentative="1">
+      <w:start w:val="1"/>
+      <w:numFmt w:val="bullet"/>
+      <w:lvlText w:val=""/>
+      <w:lvlJc w:val="left"/>
+      <w:pPr>
+        <w:tabs>
+          <w:tab w:val="num" w:pos="7188"/>
+        </w:tabs>
+        <w:ind w:left="7188" w:hanging="360"/>
+      </w:pPr>
+      <w:rPr>
+        <w:rFonts w:ascii="Wingdings" w:hAnsi="Wingdings" w:hint="default"/>
+        <w:sz w:val="20"/>
+      </w:rPr>
+    </w:lvl>
+  </w:abstractNum>
+  <w:abstractNum w:abstractNumId="4" w15:restartNumberingAfterBreak="0">
     <w:nsid w:val="77537F20"/>
     <w:multiLevelType w:val="multilevel"/>
     <w:tmpl w:val="981E46F6"/>
@@ -3253,6 +5881,9 @@
     <w:abstractNumId w:val="0"/>
   </w:num>
   <w:num w:numId="4" w16cid:durableId="1906526246">
+    <w:abstractNumId w:val="4"/>
+  </w:num>
+  <w:num w:numId="5" w16cid:durableId="1191917490">
     <w:abstractNumId w:val="3"/>
   </w:num>
 </w:numbering>
@@ -4185,6 +6816,16 @@
       <w:rFonts w:ascii="Times New Roman" w:hAnsi="Times New Roman" w:cs="Times New Roman"/>
     </w:rPr>
   </w:style>
+  <w:style w:type="character" w:styleId="PlaceholderText">
+    <w:name w:val="Placeholder Text"/>
+    <w:basedOn w:val="DefaultParagraphFont"/>
+    <w:uiPriority w:val="99"/>
+    <w:semiHidden/>
+    <w:rsid w:val="00703C1B"/>
+    <w:rPr>
+      <w:color w:val="666666"/>
+    </w:rPr>
+  </w:style>
 </w:styles>
 </file>
 

</xml_diff>

<commit_message>
feat: knapsack como matroide ponderada
</commit_message>
<xml_diff>
--- a/Examen Parcial No 2.docx
+++ b/Examen Parcial No 2.docx
@@ -67,49 +67,7 @@
           <w:rFonts w:ascii="Arial" w:hAnsi="Arial" w:cs="Arial"/>
           <w:lang w:val="es-US"/>
         </w:rPr>
-        <w:t>, buscamos alcanzar dicho</w:t>
-      </w:r>
-      <w:r>
-        <w:rPr>
-          <w:rFonts w:ascii="Arial" w:hAnsi="Arial" w:cs="Arial"/>
-          <w:lang w:val="es-US"/>
-        </w:rPr>
-        <w:t xml:space="preserve"> </w:t>
-      </w:r>
-      <w:r>
-        <w:rPr>
-          <w:rFonts w:ascii="Arial" w:hAnsi="Arial" w:cs="Arial"/>
-          <w:lang w:val="es-US"/>
-        </w:rPr>
-        <w:t>monto con la menor cantidad de monedas posible. Las monedas tienen las siguientes</w:t>
-      </w:r>
-      <w:r>
-        <w:rPr>
-          <w:rFonts w:ascii="Arial" w:hAnsi="Arial" w:cs="Arial"/>
-          <w:lang w:val="es-US"/>
-        </w:rPr>
-        <w:t xml:space="preserve"> </w:t>
-      </w:r>
-      <w:r>
-        <w:rPr>
-          <w:rFonts w:ascii="Arial" w:hAnsi="Arial" w:cs="Arial"/>
-          <w:lang w:val="es-US"/>
-        </w:rPr>
-        <w:t>denominaciones: {1,5,10,25}. Podemos tomar todas las monedas que necesitemos de cada</w:t>
-      </w:r>
-      <w:r>
-        <w:rPr>
-          <w:rFonts w:ascii="Arial" w:hAnsi="Arial" w:cs="Arial"/>
-          <w:lang w:val="es-US"/>
-        </w:rPr>
-        <w:t xml:space="preserve"> </w:t>
-      </w:r>
-      <w:r>
-        <w:rPr>
-          <w:rFonts w:ascii="Arial" w:hAnsi="Arial" w:cs="Arial"/>
-          <w:lang w:val="es-US"/>
-        </w:rPr>
-        <w:t>denominación.</w:t>
+        <w:t>, buscamos alcanzar dicho monto con la menor cantidad de monedas posible. Las monedas tienen las siguientes denominaciones: {1,5,10,25}. Podemos tomar todas las monedas que necesitemos de cada denominación.</w:t>
       </w:r>
       <w:r>
         <w:rPr>
@@ -312,13 +270,7 @@
         <w:rPr>
           <w:rFonts w:ascii="Arial" w:hAnsi="Arial" w:cs="Arial"/>
         </w:rPr>
-        <w:t>Decisión</w:t>
-      </w:r>
-      <w:r>
-        <w:rPr>
-          <w:rFonts w:ascii="Arial" w:hAnsi="Arial" w:cs="Arial"/>
-        </w:rPr>
-        <w:t>:</w:t>
+        <w:t>Decisión:</w:t>
       </w:r>
       <w:r>
         <w:rPr>
@@ -382,8 +334,7 @@
           </m:r>
           <m:r>
             <w:rPr>
-              <w:rFonts w:ascii="Arial" w:hAnsi="Arial" w:cs="Arial"/>
-              <w:i/>
+              <w:rFonts w:ascii="Cambria Math" w:hAnsi="Cambria Math" w:cs="Arial"/>
             </w:rPr>
             <w:br/>
           </m:r>
@@ -453,13 +404,7 @@
         <w:rPr>
           <w:rFonts w:ascii="Arial" w:hAnsi="Arial" w:cs="Arial"/>
         </w:rPr>
-        <w:t>Subproblema generado</w:t>
-      </w:r>
-      <w:r>
-        <w:rPr>
-          <w:rFonts w:ascii="Arial" w:hAnsi="Arial" w:cs="Arial"/>
-        </w:rPr>
-        <w:t>:</w:t>
+        <w:t>Subproblema generado:</w:t>
       </w:r>
       <w:r>
         <w:rPr>
@@ -486,19 +431,7 @@
         <w:rPr>
           <w:rFonts w:ascii="Arial" w:hAnsi="Arial" w:cs="Arial"/>
         </w:rPr>
-        <w:t xml:space="preserve">, </w:t>
-      </w:r>
-      <w:r>
-        <w:rPr>
-          <w:rFonts w:ascii="Arial" w:hAnsi="Arial" w:cs="Arial"/>
-        </w:rPr>
-        <w:t>hay que completar el monto restante</w:t>
-      </w:r>
-      <w:r>
-        <w:rPr>
-          <w:rFonts w:ascii="Arial" w:hAnsi="Arial" w:cs="Arial"/>
-        </w:rPr>
-        <w:t>:</w:t>
+        <w:t>, hay que completar el monto restante:</w:t>
       </w:r>
     </w:p>
     <w:p>
@@ -519,8 +452,7 @@
           </m:r>
           <m:r>
             <w:rPr>
-              <w:rFonts w:ascii="Arial" w:hAnsi="Arial" w:cs="Arial"/>
-              <w:i/>
+              <w:rFonts w:ascii="Cambria Math" w:hAnsi="Cambria Math" w:cs="Arial"/>
             </w:rPr>
             <w:br/>
           </m:r>
@@ -563,13 +495,7 @@
         <w:rPr>
           <w:rFonts w:ascii="Arial" w:hAnsi="Arial" w:cs="Arial"/>
         </w:rPr>
-        <w:t>Necesaria optimalidad</w:t>
-      </w:r>
-      <w:r>
-        <w:rPr>
-          <w:rFonts w:ascii="Arial" w:hAnsi="Arial" w:cs="Arial"/>
-        </w:rPr>
-        <w:t>:</w:t>
+        <w:t>Necesaria optimalidad:</w:t>
       </w:r>
       <w:r>
         <w:rPr>
@@ -582,18 +508,7 @@
           <w:rFonts w:ascii="Arial" w:hAnsi="Arial" w:cs="Arial"/>
         </w:rPr>
         <w:br/>
-      </w:r>
-      <w:r>
-        <w:rPr>
-          <w:rFonts w:ascii="Arial" w:hAnsi="Arial" w:cs="Arial"/>
-        </w:rPr>
-        <w:t>U</w:t>
-      </w:r>
-      <w:r>
-        <w:rPr>
-          <w:rFonts w:ascii="Arial" w:hAnsi="Arial" w:cs="Arial"/>
-        </w:rPr>
-        <w:t xml:space="preserve">na solución óptima para </w:t>
+        <w:t xml:space="preserve">Una solución óptima para </w:t>
       </w:r>
       <m:oMath>
         <m:r>
@@ -664,13 +579,7 @@
           <w:rFonts w:ascii="Arial" w:hAnsi="Arial" w:cs="Arial"/>
         </w:rPr>
         <w:lastRenderedPageBreak/>
-        <w:t>P</w:t>
-      </w:r>
-      <w:r>
-        <w:rPr>
-          <w:rFonts w:ascii="Arial" w:hAnsi="Arial" w:cs="Arial"/>
-        </w:rPr>
-        <w:t xml:space="preserve">ara buscar contradicción, que el conjunto de monedas usado para formar </w:t>
+        <w:t xml:space="preserve">Para buscar contradicción, que el conjunto de monedas usado para formar </w:t>
       </w:r>
       <m:oMath>
         <m:r>
@@ -690,31 +599,7 @@
         <w:rPr>
           <w:rFonts w:ascii="Arial" w:hAnsi="Arial" w:cs="Arial"/>
         </w:rPr>
-        <w:t>no es óptimo</w:t>
-      </w:r>
-      <w:r>
-        <w:rPr>
-          <w:rFonts w:ascii="Arial" w:hAnsi="Arial" w:cs="Arial"/>
-        </w:rPr>
-        <w:t>,</w:t>
-      </w:r>
-      <w:r>
-        <w:rPr>
-          <w:rFonts w:ascii="Arial" w:hAnsi="Arial" w:cs="Arial"/>
-        </w:rPr>
-        <w:t xml:space="preserve"> </w:t>
-      </w:r>
-      <w:r>
-        <w:rPr>
-          <w:rFonts w:ascii="Arial" w:hAnsi="Arial" w:cs="Arial"/>
-        </w:rPr>
-        <w:t xml:space="preserve">debe de existir </w:t>
-      </w:r>
-      <w:r>
-        <w:rPr>
-          <w:rFonts w:ascii="Arial" w:hAnsi="Arial" w:cs="Arial"/>
-        </w:rPr>
-        <w:t xml:space="preserve">otra forma de formar </w:t>
+        <w:t xml:space="preserve">no es óptimo, debe de existir otra forma de formar </w:t>
       </w:r>
       <m:oMath>
         <m:r>
@@ -752,13 +637,7 @@
         <w:rPr>
           <w:rFonts w:ascii="Arial" w:hAnsi="Arial" w:cs="Arial"/>
         </w:rPr>
-        <w:t xml:space="preserve">Al probar la </w:t>
-      </w:r>
-      <w:r>
-        <w:rPr>
-          <w:rFonts w:ascii="Arial" w:hAnsi="Arial" w:cs="Arial"/>
-        </w:rPr>
-        <w:t xml:space="preserve">misma moneda inicial </w:t>
+        <w:t xml:space="preserve">Al probar la misma moneda inicial </w:t>
       </w:r>
       <m:oMath>
         <m:r>
@@ -772,19 +651,7 @@
         <w:rPr>
           <w:rFonts w:ascii="Arial" w:hAnsi="Arial" w:cs="Arial"/>
         </w:rPr>
-        <w:t xml:space="preserve">, pero </w:t>
-      </w:r>
-      <w:r>
-        <w:rPr>
-          <w:rFonts w:ascii="Arial" w:hAnsi="Arial" w:cs="Arial"/>
-        </w:rPr>
-        <w:t xml:space="preserve">reemplazando </w:t>
-      </w:r>
-      <w:r>
-        <w:rPr>
-          <w:rFonts w:ascii="Arial" w:hAnsi="Arial" w:cs="Arial"/>
-        </w:rPr>
-        <w:t xml:space="preserve">la solución subóptima de </w:t>
+        <w:t xml:space="preserve">, pero reemplazando la solución subóptima de </w:t>
       </w:r>
       <m:oMath>
         <m:r>
@@ -874,19 +741,7 @@
         <w:rPr>
           <w:rFonts w:ascii="Arial" w:hAnsi="Arial" w:cs="Arial"/>
         </w:rPr>
-        <w:t>Es</w:t>
-      </w:r>
-      <w:r>
-        <w:rPr>
-          <w:rFonts w:ascii="Arial" w:hAnsi="Arial" w:cs="Arial"/>
-        </w:rPr>
-        <w:t>t</w:t>
-      </w:r>
-      <w:r>
-        <w:rPr>
-          <w:rFonts w:ascii="Arial" w:hAnsi="Arial" w:cs="Arial"/>
-        </w:rPr>
-        <w:t xml:space="preserve">o contradice que la solución original era óptima. Por tanto, si una solución óptima para </w:t>
+        <w:t xml:space="preserve">Esto contradice que la solución original era óptima. Por tanto, si una solución óptima para </w:t>
       </w:r>
       <m:oMath>
         <m:r>
@@ -900,13 +755,7 @@
         <w:rPr>
           <w:rFonts w:ascii="Arial" w:hAnsi="Arial" w:cs="Arial"/>
         </w:rPr>
-        <w:t xml:space="preserve"> </w:t>
-      </w:r>
-      <w:r>
-        <w:rPr>
-          <w:rFonts w:ascii="Arial" w:hAnsi="Arial" w:cs="Arial"/>
-        </w:rPr>
-        <w:t xml:space="preserve">empieza tomando una moneda </w:t>
+        <w:t xml:space="preserve"> empieza tomando una moneda </w:t>
       </w:r>
       <m:oMath>
         <m:r>
@@ -958,31 +807,7 @@
         <w:rPr>
           <w:rFonts w:ascii="Arial" w:hAnsi="Arial" w:cs="Arial"/>
         </w:rPr>
-        <w:t xml:space="preserve">La </w:t>
-      </w:r>
-      <w:r>
-        <w:rPr>
-          <w:rFonts w:ascii="Arial" w:hAnsi="Arial" w:cs="Arial"/>
-        </w:rPr>
-        <w:t xml:space="preserve">función de </w:t>
-      </w:r>
-      <w:r>
-        <w:rPr>
-          <w:rFonts w:ascii="Arial" w:hAnsi="Arial" w:cs="Arial"/>
-        </w:rPr>
-        <w:t>recurrencia</w:t>
-      </w:r>
-      <w:r>
-        <w:rPr>
-          <w:rFonts w:ascii="Arial" w:hAnsi="Arial" w:cs="Arial"/>
-        </w:rPr>
-        <w:t xml:space="preserve"> sería la siguiente</w:t>
-      </w:r>
-      <w:r>
-        <w:rPr>
-          <w:rFonts w:ascii="Arial" w:hAnsi="Arial" w:cs="Arial"/>
-        </w:rPr>
-        <w:t>:</w:t>
+        <w:t>La función de recurrencia sería la siguiente:</w:t>
       </w:r>
     </w:p>
     <w:p>
@@ -1058,8 +883,7 @@
           </m:r>
           <m:r>
             <w:rPr>
-              <w:rFonts w:ascii="Arial" w:hAnsi="Arial" w:cs="Arial"/>
-              <w:i/>
+              <w:rFonts w:ascii="Cambria Math" w:hAnsi="Cambria Math" w:cs="Arial"/>
             </w:rPr>
             <w:br/>
           </m:r>
@@ -1099,8 +923,7 @@
           </m:r>
           <m:r>
             <w:rPr>
-              <w:rFonts w:ascii="Arial" w:hAnsi="Arial" w:cs="Arial"/>
-              <w:i/>
+              <w:rFonts w:ascii="Cambria Math" w:hAnsi="Cambria Math" w:cs="Arial"/>
             </w:rPr>
             <w:br/>
           </m:r>
@@ -1163,42 +986,23 @@
           <w:rFonts w:ascii="Arial" w:hAnsi="Arial" w:cs="Arial"/>
           <w:lang w:val="es-US"/>
         </w:rPr>
-        <w:t>Subproblemas traslapados</w:t>
-      </w:r>
-      <w:r>
-        <w:rPr>
-          <w:rFonts w:ascii="Arial" w:hAnsi="Arial" w:cs="Arial"/>
-          <w:lang w:val="es-US"/>
-        </w:rPr>
-        <w:t>:</w:t>
-      </w:r>
-    </w:p>
-    <w:p>
-      <w:pPr>
-        <w:pStyle w:val="ListParagraph"/>
-        <w:ind w:left="708"/>
-        <w:jc w:val="both"/>
-        <w:rPr>
-          <w:rFonts w:ascii="Arial" w:hAnsi="Arial" w:cs="Arial"/>
-        </w:rPr>
-      </w:pPr>
-      <w:r>
-        <w:rPr>
-          <w:rFonts w:ascii="Arial" w:hAnsi="Arial" w:cs="Arial"/>
-        </w:rPr>
-        <w:t xml:space="preserve">Si resolvemos el problema recursivamente usando la recurrencia anterior, aparecen montos repetidos </w:t>
-      </w:r>
-      <w:r>
-        <w:rPr>
-          <w:rFonts w:ascii="Arial" w:hAnsi="Arial" w:cs="Arial"/>
-        </w:rPr>
-        <w:t>varias</w:t>
-      </w:r>
-      <w:r>
-        <w:rPr>
-          <w:rFonts w:ascii="Arial" w:hAnsi="Arial" w:cs="Arial"/>
-        </w:rPr>
-        <w:t xml:space="preserve"> veces.</w:t>
+        <w:t>Subproblemas traslapados:</w:t>
+      </w:r>
+    </w:p>
+    <w:p>
+      <w:pPr>
+        <w:pStyle w:val="ListParagraph"/>
+        <w:ind w:left="708"/>
+        <w:jc w:val="both"/>
+        <w:rPr>
+          <w:rFonts w:ascii="Arial" w:hAnsi="Arial" w:cs="Arial"/>
+        </w:rPr>
+      </w:pPr>
+      <w:r>
+        <w:rPr>
+          <w:rFonts w:ascii="Arial" w:hAnsi="Arial" w:cs="Arial"/>
+        </w:rPr>
+        <w:t>Si resolvemos el problema recursivamente usando la recurrencia anterior, aparecen montos repetidos varias veces.</w:t>
       </w:r>
     </w:p>
     <w:p>
@@ -1270,8 +1074,7 @@
           </m:r>
           <m:r>
             <w:rPr>
-              <w:rFonts w:ascii="Arial" w:hAnsi="Arial" w:cs="Arial"/>
-              <w:i/>
+              <w:rFonts w:ascii="Cambria Math" w:hAnsi="Cambria Math" w:cs="Arial"/>
             </w:rPr>
             <w:br/>
           </m:r>
@@ -1451,8 +1254,7 @@
           </m:r>
           <m:r>
             <w:rPr>
-              <w:rFonts w:ascii="Arial" w:hAnsi="Arial" w:cs="Arial"/>
-              <w:i/>
+              <w:rFonts w:ascii="Cambria Math" w:hAnsi="Cambria Math" w:cs="Arial"/>
             </w:rPr>
             <w:br/>
           </m:r>
@@ -1656,55 +1458,7 @@
         <w:rPr>
           <w:rFonts w:ascii="Arial" w:hAnsi="Arial" w:cs="Arial"/>
         </w:rPr>
-        <w:t xml:space="preserve"> tomaría siempre la moneda de mayor denominación que no exceda el monto restante.</w:t>
-      </w:r>
-      <w:r>
-        <w:rPr>
-          <w:rFonts w:ascii="Arial" w:hAnsi="Arial" w:cs="Arial"/>
-        </w:rPr>
-        <w:t xml:space="preserve"> Se busca</w:t>
-      </w:r>
-      <w:r>
-        <w:rPr>
-          <w:rFonts w:ascii="Arial" w:hAnsi="Arial" w:cs="Arial"/>
-        </w:rPr>
-        <w:t xml:space="preserve"> demostrar que esa decisión local pertenece a alguna solución óptima.</w:t>
-      </w:r>
-      <w:r>
-        <w:rPr>
-          <w:rFonts w:ascii="Arial" w:hAnsi="Arial" w:cs="Arial"/>
-        </w:rPr>
-        <w:t xml:space="preserve"> </w:t>
-      </w:r>
-      <w:r>
-        <w:rPr>
-          <w:rFonts w:ascii="Arial" w:hAnsi="Arial" w:cs="Arial"/>
-        </w:rPr>
-        <w:t>Para estas monedas, analizamos por rangos</w:t>
-      </w:r>
-      <w:r>
-        <w:rPr>
-          <w:rFonts w:ascii="Arial" w:hAnsi="Arial" w:cs="Arial"/>
-        </w:rPr>
-        <w:t>, p</w:t>
-      </w:r>
-      <w:r>
-        <w:rPr>
-          <w:rFonts w:ascii="Arial" w:hAnsi="Arial" w:cs="Arial"/>
-        </w:rPr>
-        <w:t>rimer</w:t>
-      </w:r>
-      <w:r>
-        <w:rPr>
-          <w:rFonts w:ascii="Arial" w:hAnsi="Arial" w:cs="Arial"/>
-        </w:rPr>
-        <w:t>o</w:t>
-      </w:r>
-      <w:r>
-        <w:rPr>
-          <w:rFonts w:ascii="Arial" w:hAnsi="Arial" w:cs="Arial"/>
-        </w:rPr>
-        <w:t xml:space="preserve"> en una solución óptima:</w:t>
+        <w:t xml:space="preserve"> tomaría siempre la moneda de mayor denominación que no exceda el monto restante. Se busca demostrar que esa decisión local pertenece a alguna solución óptima. Para estas monedas, analizamos por rangos, primero en una solución óptima:</w:t>
       </w:r>
     </w:p>
     <w:p>
@@ -1816,13 +1570,7 @@
         <w:rPr>
           <w:rFonts w:ascii="Arial" w:hAnsi="Arial" w:cs="Arial"/>
         </w:rPr>
-        <w:t>Consideramos</w:t>
-      </w:r>
-      <w:r>
-        <w:rPr>
-          <w:rFonts w:ascii="Arial" w:hAnsi="Arial" w:cs="Arial"/>
-        </w:rPr>
-        <w:t xml:space="preserve"> un monto </w:t>
+        <w:t xml:space="preserve">Consideramos un monto </w:t>
       </w:r>
       <m:oMath>
         <m:r>
@@ -1836,19 +1584,7 @@
         <w:rPr>
           <w:rFonts w:ascii="Arial" w:hAnsi="Arial" w:cs="Arial"/>
         </w:rPr>
-        <w:t xml:space="preserve"> ≥ 25</w:t>
-      </w:r>
-      <w:r>
-        <w:rPr>
-          <w:rFonts w:ascii="Arial" w:hAnsi="Arial" w:cs="Arial"/>
-        </w:rPr>
-        <w:t xml:space="preserve">, suponiendo </w:t>
-      </w:r>
-      <w:r>
-        <w:rPr>
-          <w:rFonts w:ascii="Arial" w:hAnsi="Arial" w:cs="Arial"/>
-        </w:rPr>
-        <w:t>que una solución óptima para m no usa ninguna moneda de 25. Entonces solo usa monedas de 1, 5 y 10.</w:t>
+        <w:t xml:space="preserve"> ≥ 25, suponiendo que una solución óptima para m no usa ninguna moneda de 25. Entonces solo usa monedas de 1, 5 y 10.</w:t>
       </w:r>
     </w:p>
     <w:p>
@@ -2394,7 +2130,95 @@
         <w:rPr>
           <w:rFonts w:ascii="Arial" w:hAnsi="Arial" w:cs="Arial"/>
         </w:rPr>
-        <w:t xml:space="preserve">    </w:t>
+        <w:t xml:space="preserve">    resultado = {}</w:t>
+      </w:r>
+    </w:p>
+    <w:p>
+      <w:pPr>
+        <w:pStyle w:val="ListParagraph"/>
+        <w:ind w:left="708"/>
+        <w:jc w:val="both"/>
+        <w:rPr>
+          <w:rFonts w:ascii="Arial" w:hAnsi="Arial" w:cs="Arial"/>
+        </w:rPr>
+      </w:pPr>
+    </w:p>
+    <w:p>
+      <w:pPr>
+        <w:pStyle w:val="ListParagraph"/>
+        <w:ind w:left="708"/>
+        <w:jc w:val="both"/>
+        <w:rPr>
+          <w:rFonts w:ascii="Arial" w:hAnsi="Arial" w:cs="Arial"/>
+        </w:rPr>
+      </w:pPr>
+      <w:r>
+        <w:rPr>
+          <w:rFonts w:ascii="Arial" w:hAnsi="Arial" w:cs="Arial"/>
+        </w:rPr>
+        <w:t xml:space="preserve">    para cada </w:t>
+      </w:r>
+      <w:r>
+        <w:rPr>
+          <w:rFonts w:ascii="Arial" w:hAnsi="Arial" w:cs="Arial"/>
+        </w:rPr>
+        <w:t>moneda en</w:t>
+      </w:r>
+      <w:r>
+        <w:rPr>
+          <w:rFonts w:ascii="Arial" w:hAnsi="Arial" w:cs="Arial"/>
+        </w:rPr>
+        <w:t xml:space="preserve"> monedas:</w:t>
+      </w:r>
+    </w:p>
+    <w:p>
+      <w:pPr>
+        <w:pStyle w:val="ListParagraph"/>
+        <w:ind w:left="708"/>
+        <w:jc w:val="both"/>
+        <w:rPr>
+          <w:rFonts w:ascii="Arial" w:hAnsi="Arial" w:cs="Arial"/>
+        </w:rPr>
+      </w:pPr>
+      <w:r>
+        <w:rPr>
+          <w:rFonts w:ascii="Arial" w:hAnsi="Arial" w:cs="Arial"/>
+        </w:rPr>
+        <w:t xml:space="preserve">        cantidad = m</w:t>
+      </w:r>
+      <w:r>
+        <w:rPr>
+          <w:rFonts w:ascii="Arial" w:hAnsi="Arial" w:cs="Arial"/>
+        </w:rPr>
+        <w:t>onto</w:t>
+      </w:r>
+      <w:r>
+        <w:rPr>
+          <w:rFonts w:ascii="Arial" w:hAnsi="Arial" w:cs="Arial"/>
+        </w:rPr>
+        <w:t xml:space="preserve"> // </w:t>
+      </w:r>
+      <w:r>
+        <w:rPr>
+          <w:rFonts w:ascii="Arial" w:hAnsi="Arial" w:cs="Arial"/>
+        </w:rPr>
+        <w:t>moneda</w:t>
+      </w:r>
+    </w:p>
+    <w:p>
+      <w:pPr>
+        <w:pStyle w:val="ListParagraph"/>
+        <w:ind w:left="708"/>
+        <w:jc w:val="both"/>
+        <w:rPr>
+          <w:rFonts w:ascii="Arial" w:hAnsi="Arial" w:cs="Arial"/>
+        </w:rPr>
+      </w:pPr>
+      <w:r>
+        <w:rPr>
+          <w:rFonts w:ascii="Arial" w:hAnsi="Arial" w:cs="Arial"/>
+        </w:rPr>
+        <w:t xml:space="preserve">        </w:t>
       </w:r>
       <w:r>
         <w:rPr>
@@ -2406,61 +2230,35 @@
         <w:rPr>
           <w:rFonts w:ascii="Arial" w:hAnsi="Arial" w:cs="Arial"/>
         </w:rPr>
-        <w:t xml:space="preserve"> = {}</w:t>
-      </w:r>
-    </w:p>
-    <w:p>
-      <w:pPr>
-        <w:pStyle w:val="ListParagraph"/>
-        <w:ind w:left="708"/>
-        <w:jc w:val="both"/>
-        <w:rPr>
-          <w:rFonts w:ascii="Arial" w:hAnsi="Arial" w:cs="Arial"/>
-        </w:rPr>
-      </w:pPr>
-    </w:p>
-    <w:p>
-      <w:pPr>
-        <w:pStyle w:val="ListParagraph"/>
-        <w:ind w:left="708"/>
-        <w:jc w:val="both"/>
-        <w:rPr>
-          <w:rFonts w:ascii="Arial" w:hAnsi="Arial" w:cs="Arial"/>
-        </w:rPr>
-      </w:pPr>
-      <w:r>
-        <w:rPr>
-          <w:rFonts w:ascii="Arial" w:hAnsi="Arial" w:cs="Arial"/>
-        </w:rPr>
-        <w:t xml:space="preserve">    para cada </w:t>
-      </w:r>
-      <w:r>
-        <w:rPr>
-          <w:rFonts w:ascii="Arial" w:hAnsi="Arial" w:cs="Arial"/>
-        </w:rPr>
-        <w:t>moneda en</w:t>
-      </w:r>
-      <w:r>
-        <w:rPr>
-          <w:rFonts w:ascii="Arial" w:hAnsi="Arial" w:cs="Arial"/>
-        </w:rPr>
-        <w:t xml:space="preserve"> monedas:</w:t>
-      </w:r>
-    </w:p>
-    <w:p>
-      <w:pPr>
-        <w:pStyle w:val="ListParagraph"/>
-        <w:ind w:left="708"/>
-        <w:jc w:val="both"/>
-        <w:rPr>
-          <w:rFonts w:ascii="Arial" w:hAnsi="Arial" w:cs="Arial"/>
-        </w:rPr>
-      </w:pPr>
-      <w:r>
-        <w:rPr>
-          <w:rFonts w:ascii="Arial" w:hAnsi="Arial" w:cs="Arial"/>
-        </w:rPr>
-        <w:t xml:space="preserve">        cantidad = m</w:t>
+        <w:t>[</w:t>
+      </w:r>
+      <w:r>
+        <w:rPr>
+          <w:rFonts w:ascii="Arial" w:hAnsi="Arial" w:cs="Arial"/>
+        </w:rPr>
+        <w:t>moneda</w:t>
+      </w:r>
+      <w:r>
+        <w:rPr>
+          <w:rFonts w:ascii="Arial" w:hAnsi="Arial" w:cs="Arial"/>
+        </w:rPr>
+        <w:t>] = cantidad</w:t>
+      </w:r>
+    </w:p>
+    <w:p>
+      <w:pPr>
+        <w:pStyle w:val="ListParagraph"/>
+        <w:ind w:left="708"/>
+        <w:jc w:val="both"/>
+        <w:rPr>
+          <w:rFonts w:ascii="Arial" w:hAnsi="Arial" w:cs="Arial"/>
+        </w:rPr>
+      </w:pPr>
+      <w:r>
+        <w:rPr>
+          <w:rFonts w:ascii="Arial" w:hAnsi="Arial" w:cs="Arial"/>
+        </w:rPr>
+        <w:t xml:space="preserve">        m</w:t>
       </w:r>
       <w:r>
         <w:rPr>
@@ -2472,7 +2270,19 @@
         <w:rPr>
           <w:rFonts w:ascii="Arial" w:hAnsi="Arial" w:cs="Arial"/>
         </w:rPr>
-        <w:t xml:space="preserve"> // </w:t>
+        <w:t xml:space="preserve"> = m</w:t>
+      </w:r>
+      <w:r>
+        <w:rPr>
+          <w:rFonts w:ascii="Arial" w:hAnsi="Arial" w:cs="Arial"/>
+        </w:rPr>
+        <w:t>onto</w:t>
+      </w:r>
+      <w:r>
+        <w:rPr>
+          <w:rFonts w:ascii="Arial" w:hAnsi="Arial" w:cs="Arial"/>
+        </w:rPr>
+        <w:t xml:space="preserve"> % </w:t>
       </w:r>
       <w:r>
         <w:rPr>
@@ -2490,11 +2300,21 @@
           <w:rFonts w:ascii="Arial" w:hAnsi="Arial" w:cs="Arial"/>
         </w:rPr>
       </w:pPr>
-      <w:r>
-        <w:rPr>
-          <w:rFonts w:ascii="Arial" w:hAnsi="Arial" w:cs="Arial"/>
-        </w:rPr>
-        <w:t xml:space="preserve">        </w:t>
+    </w:p>
+    <w:p>
+      <w:pPr>
+        <w:pStyle w:val="ListParagraph"/>
+        <w:ind w:left="708"/>
+        <w:jc w:val="both"/>
+        <w:rPr>
+          <w:rFonts w:ascii="Arial" w:hAnsi="Arial" w:cs="Arial"/>
+        </w:rPr>
+      </w:pPr>
+      <w:r>
+        <w:rPr>
+          <w:rFonts w:ascii="Arial" w:hAnsi="Arial" w:cs="Arial"/>
+        </w:rPr>
+        <w:t xml:space="preserve">    retornar </w:t>
       </w:r>
       <w:r>
         <w:rPr>
@@ -2502,102 +2322,6 @@
         </w:rPr>
         <w:t>resultado</w:t>
       </w:r>
-      <w:r>
-        <w:rPr>
-          <w:rFonts w:ascii="Arial" w:hAnsi="Arial" w:cs="Arial"/>
-        </w:rPr>
-        <w:t>[</w:t>
-      </w:r>
-      <w:r>
-        <w:rPr>
-          <w:rFonts w:ascii="Arial" w:hAnsi="Arial" w:cs="Arial"/>
-        </w:rPr>
-        <w:t>moneda</w:t>
-      </w:r>
-      <w:r>
-        <w:rPr>
-          <w:rFonts w:ascii="Arial" w:hAnsi="Arial" w:cs="Arial"/>
-        </w:rPr>
-        <w:t>] = cantidad</w:t>
-      </w:r>
-    </w:p>
-    <w:p>
-      <w:pPr>
-        <w:pStyle w:val="ListParagraph"/>
-        <w:ind w:left="708"/>
-        <w:jc w:val="both"/>
-        <w:rPr>
-          <w:rFonts w:ascii="Arial" w:hAnsi="Arial" w:cs="Arial"/>
-        </w:rPr>
-      </w:pPr>
-      <w:r>
-        <w:rPr>
-          <w:rFonts w:ascii="Arial" w:hAnsi="Arial" w:cs="Arial"/>
-        </w:rPr>
-        <w:t xml:space="preserve">        m</w:t>
-      </w:r>
-      <w:r>
-        <w:rPr>
-          <w:rFonts w:ascii="Arial" w:hAnsi="Arial" w:cs="Arial"/>
-        </w:rPr>
-        <w:t>onto</w:t>
-      </w:r>
-      <w:r>
-        <w:rPr>
-          <w:rFonts w:ascii="Arial" w:hAnsi="Arial" w:cs="Arial"/>
-        </w:rPr>
-        <w:t xml:space="preserve"> = m</w:t>
-      </w:r>
-      <w:r>
-        <w:rPr>
-          <w:rFonts w:ascii="Arial" w:hAnsi="Arial" w:cs="Arial"/>
-        </w:rPr>
-        <w:t>onto</w:t>
-      </w:r>
-      <w:r>
-        <w:rPr>
-          <w:rFonts w:ascii="Arial" w:hAnsi="Arial" w:cs="Arial"/>
-        </w:rPr>
-        <w:t xml:space="preserve"> % </w:t>
-      </w:r>
-      <w:r>
-        <w:rPr>
-          <w:rFonts w:ascii="Arial" w:hAnsi="Arial" w:cs="Arial"/>
-        </w:rPr>
-        <w:t>moneda</w:t>
-      </w:r>
-    </w:p>
-    <w:p>
-      <w:pPr>
-        <w:pStyle w:val="ListParagraph"/>
-        <w:ind w:left="708"/>
-        <w:jc w:val="both"/>
-        <w:rPr>
-          <w:rFonts w:ascii="Arial" w:hAnsi="Arial" w:cs="Arial"/>
-        </w:rPr>
-      </w:pPr>
-    </w:p>
-    <w:p>
-      <w:pPr>
-        <w:pStyle w:val="ListParagraph"/>
-        <w:ind w:left="708"/>
-        <w:jc w:val="both"/>
-        <w:rPr>
-          <w:rFonts w:ascii="Arial" w:hAnsi="Arial" w:cs="Arial"/>
-        </w:rPr>
-      </w:pPr>
-      <w:r>
-        <w:rPr>
-          <w:rFonts w:ascii="Arial" w:hAnsi="Arial" w:cs="Arial"/>
-        </w:rPr>
-        <w:t xml:space="preserve">    retornar </w:t>
-      </w:r>
-      <w:r>
-        <w:rPr>
-          <w:rFonts w:ascii="Arial" w:hAnsi="Arial" w:cs="Arial"/>
-        </w:rPr>
-        <w:t>resultado</w:t>
-      </w:r>
     </w:p>
     <w:p>
       <w:pPr>
@@ -2637,6 +2361,7 @@
       <w:r>
         <w:rPr>
           <w:rFonts w:ascii="Arial" w:hAnsi="Arial" w:cs="Arial"/>
+          <w:noProof/>
         </w:rPr>
         <w:drawing>
           <wp:inline distT="0" distB="0" distL="0" distR="0" wp14:anchorId="21A556CF" wp14:editId="5F1436DB">
@@ -2825,13 +2550,7 @@
         <w:rPr>
           <w:rFonts w:ascii="Arial" w:hAnsi="Arial" w:cs="Arial"/>
         </w:rPr>
-        <w:t>’s)</w:t>
-      </w:r>
-      <w:r>
-        <w:rPr>
-          <w:rFonts w:ascii="Arial" w:hAnsi="Arial" w:cs="Arial"/>
-        </w:rPr>
-        <w:t>.</w:t>
+        <w:t>’s).</w:t>
       </w:r>
       <w:r>
         <w:rPr>
@@ -3209,8 +2928,11 @@
             </m:den>
           </m:f>
           <m:r>
-            <w:rPr>
-              <w:rFonts w:ascii="Arial" w:hAnsi="Arial" w:cs="Arial"/>
+            <m:rPr>
+              <m:sty m:val="p"/>
+            </m:rPr>
+            <w:rPr>
+              <w:rFonts w:ascii="Cambria Math" w:hAnsi="Cambria Math" w:cs="Arial"/>
             </w:rPr>
             <w:br/>
           </m:r>
@@ -3348,8 +3070,11 @@
             </m:sub>
           </m:sSub>
           <m:r>
-            <w:rPr>
-              <w:rFonts w:ascii="Arial" w:hAnsi="Arial" w:cs="Arial"/>
+            <m:rPr>
+              <m:sty m:val="p"/>
+            </m:rPr>
+            <w:rPr>
+              <w:rFonts w:ascii="Cambria Math" w:hAnsi="Cambria Math" w:cs="Arial"/>
             </w:rPr>
             <w:br/>
           </m:r>
@@ -3438,17 +3163,31 @@
           </m:r>
           <m:r>
             <w:rPr>
-              <w:rFonts w:ascii="Arial" w:hAnsi="Arial" w:cs="Arial"/>
-              <w:i/>
+              <w:rFonts w:ascii="Cambria Math" w:hAnsi="Cambria Math" w:cs="Arial"/>
             </w:rPr>
             <w:br/>
           </m:r>
-          <m:r>
-            <w:rPr>
-              <w:rFonts w:ascii="Arial" w:hAnsi="Arial" w:cs="Arial"/>
+        </m:oMath>
+        <m:oMath>
+          <m:r>
+            <m:rPr>
+              <m:sty m:val="p"/>
+            </m:rPr>
+            <w:rPr>
+              <w:rFonts w:ascii="Cambria Math" w:hAnsi="Cambria Math" w:cs="Arial"/>
             </w:rPr>
             <w:br/>
-            <w:t>Una solución puede escribirse como:</w:t>
+          </m:r>
+        </m:oMath>
+        <m:oMath>
+          <m:r>
+            <m:rPr>
+              <m:sty m:val="p"/>
+            </m:rPr>
+            <w:rPr>
+              <w:rFonts w:ascii="Cambria Math" w:hAnsi="Cambria Math" w:cs="Arial"/>
+            </w:rPr>
+            <m:t>Una solución puede escribirse como:</m:t>
           </m:r>
         </m:oMath>
       </m:oMathPara>
@@ -3562,8 +3301,11 @@
             </m:e>
           </m:d>
           <m:r>
-            <w:rPr>
-              <w:rFonts w:ascii="Arial" w:hAnsi="Arial" w:cs="Arial"/>
+            <m:rPr>
+              <m:sty m:val="p"/>
+            </m:rPr>
+            <w:rPr>
+              <w:rFonts w:ascii="Cambria Math" w:hAnsi="Cambria Math" w:cs="Arial"/>
             </w:rPr>
             <w:br/>
           </m:r>
@@ -3790,8 +3532,11 @@
             </m:den>
           </m:f>
           <m:r>
-            <w:rPr>
-              <w:rFonts w:ascii="Arial" w:hAnsi="Arial" w:cs="Arial"/>
+            <m:rPr>
+              <m:sty m:val="p"/>
+            </m:rPr>
+            <w:rPr>
+              <w:rFonts w:ascii="Cambria Math" w:hAnsi="Cambria Math" w:cs="Arial"/>
             </w:rPr>
             <w:br/>
           </m:r>
@@ -3947,8 +3692,11 @@
             </m:sub>
           </m:sSub>
           <m:r>
-            <w:rPr>
-              <w:rFonts w:ascii="Arial" w:hAnsi="Arial" w:cs="Arial"/>
+            <m:rPr>
+              <m:sty m:val="p"/>
+            </m:rPr>
+            <w:rPr>
+              <w:rFonts w:ascii="Cambria Math" w:hAnsi="Cambria Math" w:cs="Arial"/>
             </w:rPr>
             <w:br/>
           </m:r>
@@ -4215,19 +3963,7 @@
         <w:rPr>
           <w:rFonts w:ascii="Arial" w:hAnsi="Arial" w:cs="Arial"/>
         </w:rPr>
-        <w:t>Esto demuestra</w:t>
-      </w:r>
-      <w:r>
-        <w:rPr>
-          <w:rFonts w:ascii="Arial" w:hAnsi="Arial" w:cs="Arial"/>
-        </w:rPr>
-        <w:t xml:space="preserve"> la</w:t>
-      </w:r>
-      <w:r>
-        <w:rPr>
-          <w:rFonts w:ascii="Arial" w:hAnsi="Arial" w:cs="Arial"/>
-        </w:rPr>
-        <w:t xml:space="preserve"> subestructura óptima.</w:t>
+        <w:t>Esto demuestra la subestructura óptima.</w:t>
       </w:r>
     </w:p>
     <w:p>
@@ -4330,19 +4066,7 @@
         <w:rPr>
           <w:rFonts w:ascii="Arial" w:hAnsi="Arial" w:cs="Arial"/>
         </w:rPr>
-        <w:t xml:space="preserve">Sea g el artículo con mayor </w:t>
-      </w:r>
-      <w:r>
-        <w:rPr>
-          <w:rFonts w:ascii="Arial" w:hAnsi="Arial" w:cs="Arial"/>
-        </w:rPr>
-        <w:t>valor</w:t>
-      </w:r>
-      <w:r>
-        <w:rPr>
-          <w:rFonts w:ascii="Arial" w:hAnsi="Arial" w:cs="Arial"/>
-        </w:rPr>
-        <w:t>:</w:t>
+        <w:t>Sea g el artículo con mayor valor:</w:t>
       </w:r>
     </w:p>
     <w:p>
@@ -4450,8 +4174,11 @@
             </m:den>
           </m:f>
           <m:r>
-            <w:rPr>
-              <w:rFonts w:ascii="Arial" w:hAnsi="Arial" w:cs="Arial"/>
+            <m:rPr>
+              <m:sty m:val="p"/>
+            </m:rPr>
+            <w:rPr>
+              <w:rFonts w:ascii="Cambria Math" w:hAnsi="Cambria Math" w:cs="Arial"/>
             </w:rPr>
             <w:br/>
           </m:r>
@@ -4541,8 +4268,11 @@
             </m:sub>
           </m:sSub>
           <m:r>
-            <w:rPr>
-              <w:rFonts w:ascii="Arial" w:hAnsi="Arial" w:cs="Arial"/>
+            <m:rPr>
+              <m:sty m:val="p"/>
+            </m:rPr>
+            <w:rPr>
+              <w:rFonts w:ascii="Cambria Math" w:hAnsi="Cambria Math" w:cs="Arial"/>
             </w:rPr>
             <w:br/>
           </m:r>
@@ -4646,19 +4376,7 @@
         <w:rPr>
           <w:rFonts w:ascii="Arial" w:hAnsi="Arial" w:cs="Arial"/>
         </w:rPr>
-        <w:t xml:space="preserve"> con </w:t>
-      </w:r>
-      <w:r>
-        <w:rPr>
-          <w:rFonts w:ascii="Arial" w:hAnsi="Arial" w:cs="Arial"/>
-        </w:rPr>
-        <w:t>valor</w:t>
-      </w:r>
-      <w:r>
-        <w:rPr>
-          <w:rFonts w:ascii="Arial" w:hAnsi="Arial" w:cs="Arial"/>
-        </w:rPr>
-        <w:t xml:space="preserve"> menor o igual.</w:t>
+        <w:t xml:space="preserve"> con valor menor o igual.</w:t>
       </w:r>
     </w:p>
     <w:p>
@@ -4905,8 +4623,11 @@
             </m:sub>
           </m:sSub>
           <m:r>
-            <w:rPr>
-              <w:rFonts w:ascii="Arial" w:hAnsi="Arial" w:cs="Arial"/>
+            <m:rPr>
+              <m:sty m:val="p"/>
+            </m:rPr>
+            <w:rPr>
+              <w:rFonts w:ascii="Cambria Math" w:hAnsi="Cambria Math" w:cs="Arial"/>
             </w:rPr>
             <w:br/>
           </m:r>
@@ -4995,8 +4716,11 @@
             </m:sub>
           </m:sSub>
           <m:r>
-            <w:rPr>
-              <w:rFonts w:ascii="Arial" w:hAnsi="Arial" w:cs="Arial"/>
+            <m:rPr>
+              <m:sty m:val="p"/>
+            </m:rPr>
+            <w:rPr>
+              <w:rFonts w:ascii="Cambria Math" w:hAnsi="Cambria Math" w:cs="Arial"/>
             </w:rPr>
             <w:br/>
           </m:r>
@@ -5130,6 +4854,1261 @@
         </w:rPr>
         <w:t>.</w:t>
       </w:r>
+    </w:p>
+    <w:p>
+      <w:pPr>
+        <w:ind w:left="708"/>
+        <w:jc w:val="both"/>
+        <w:rPr>
+          <w:rFonts w:ascii="Arial" w:hAnsi="Arial" w:cs="Arial"/>
+        </w:rPr>
+      </w:pPr>
+    </w:p>
+    <w:p>
+      <w:pPr>
+        <w:ind w:firstLine="708"/>
+        <w:jc w:val="both"/>
+        <w:rPr>
+          <w:rFonts w:ascii="Arial" w:hAnsi="Arial" w:cs="Arial"/>
+          <w:lang w:val="es-US"/>
+        </w:rPr>
+      </w:pPr>
+      <w:r>
+        <w:rPr>
+          <w:rFonts w:ascii="Arial" w:hAnsi="Arial" w:cs="Arial"/>
+          <w:lang w:val="es-US"/>
+        </w:rPr>
+        <w:t xml:space="preserve">Se puede modelar como una </w:t>
+      </w:r>
+      <w:proofErr w:type="spellStart"/>
+      <w:r>
+        <w:rPr>
+          <w:rFonts w:ascii="Arial" w:hAnsi="Arial" w:cs="Arial"/>
+          <w:lang w:val="es-US"/>
+        </w:rPr>
+        <w:t>matroide</w:t>
+      </w:r>
+      <w:proofErr w:type="spellEnd"/>
+      <w:r>
+        <w:rPr>
+          <w:rFonts w:ascii="Arial" w:hAnsi="Arial" w:cs="Arial"/>
+          <w:lang w:val="es-US"/>
+        </w:rPr>
+        <w:t xml:space="preserve"> ponderada</w:t>
+      </w:r>
+      <w:r>
+        <w:rPr>
+          <w:rFonts w:ascii="Arial" w:hAnsi="Arial" w:cs="Arial"/>
+          <w:lang w:val="es-US"/>
+        </w:rPr>
+        <w:t>:</w:t>
+      </w:r>
+    </w:p>
+    <w:p>
+      <w:pPr>
+        <w:ind w:left="708"/>
+        <w:jc w:val="both"/>
+        <w:rPr>
+          <w:rFonts w:ascii="Arial" w:hAnsi="Arial" w:cs="Arial"/>
+        </w:rPr>
+      </w:pPr>
+      <w:r>
+        <w:rPr>
+          <w:rFonts w:ascii="Arial" w:hAnsi="Arial" w:cs="Arial"/>
+        </w:rPr>
+        <w:t>Ya que se</w:t>
+      </w:r>
+      <w:r>
+        <w:rPr>
+          <w:rFonts w:ascii="Arial" w:hAnsi="Arial" w:cs="Arial"/>
+        </w:rPr>
+        <w:t xml:space="preserve"> permite tomar porciones a nivel de unidades </w:t>
+      </w:r>
+      <m:oMath>
+        <m:r>
+          <w:rPr>
+            <w:rFonts w:ascii="Cambria Math" w:hAnsi="Cambria Math" w:cs="Arial"/>
+          </w:rPr>
+          <m:t>u</m:t>
+        </m:r>
+      </m:oMath>
+      <w:r>
+        <w:rPr>
+          <w:rFonts w:ascii="Arial" w:hAnsi="Arial" w:cs="Arial"/>
+        </w:rPr>
+        <w:t xml:space="preserve">, </w:t>
+      </w:r>
+      <w:r>
+        <w:rPr>
+          <w:rFonts w:ascii="Arial" w:hAnsi="Arial" w:cs="Arial"/>
+        </w:rPr>
+        <w:t xml:space="preserve">se puede </w:t>
+      </w:r>
+      <w:r>
+        <w:rPr>
+          <w:rFonts w:ascii="Arial" w:hAnsi="Arial" w:cs="Arial"/>
+        </w:rPr>
+        <w:t>modelar cada unidad disponible como un objeto independiente.</w:t>
+      </w:r>
+    </w:p>
+    <w:p>
+      <w:pPr>
+        <w:ind w:left="708"/>
+        <w:jc w:val="both"/>
+        <w:rPr>
+          <w:rFonts w:ascii="Arial" w:hAnsi="Arial" w:cs="Arial"/>
+        </w:rPr>
+      </w:pPr>
+      <w:r>
+        <w:rPr>
+          <w:rFonts w:ascii="Arial" w:hAnsi="Arial" w:cs="Arial"/>
+        </w:rPr>
+        <w:t>Sea:</w:t>
+      </w:r>
+    </w:p>
+    <w:p>
+      <w:pPr>
+        <w:ind w:left="708"/>
+        <w:jc w:val="both"/>
+        <w:rPr>
+          <w:rFonts w:ascii="Arial" w:hAnsi="Arial" w:cs="Arial"/>
+        </w:rPr>
+      </w:pPr>
+      <m:oMathPara>
+        <m:oMath>
+          <m:r>
+            <w:rPr>
+              <w:rFonts w:ascii="Cambria Math" w:hAnsi="Cambria Math" w:cs="Arial"/>
+            </w:rPr>
+            <w:lastRenderedPageBreak/>
+            <m:t>S={</m:t>
+          </m:r>
+          <m:sSub>
+            <m:sSubPr>
+              <m:ctrlPr>
+                <w:rPr>
+                  <w:rFonts w:ascii="Cambria Math" w:hAnsi="Cambria Math" w:cs="Arial"/>
+                </w:rPr>
+              </m:ctrlPr>
+            </m:sSubPr>
+            <m:e>
+              <m:r>
+                <w:rPr>
+                  <w:rFonts w:ascii="Cambria Math" w:hAnsi="Cambria Math" w:cs="Arial"/>
+                </w:rPr>
+                <m:t>u</m:t>
+              </m:r>
+            </m:e>
+            <m:sub>
+              <m:r>
+                <w:rPr>
+                  <w:rFonts w:ascii="Cambria Math" w:hAnsi="Cambria Math" w:cs="Arial"/>
+                </w:rPr>
+                <m:t>i,k</m:t>
+              </m:r>
+            </m:sub>
+          </m:sSub>
+          <m:r>
+            <w:rPr>
+              <w:rFonts w:ascii="Cambria Math" w:hAnsi="Cambria Math" w:cs="Arial"/>
+            </w:rPr>
+            <m:t>:1≤i≤n,</m:t>
+          </m:r>
+          <m:r>
+            <m:rPr>
+              <m:sty m:val="p"/>
+            </m:rPr>
+            <w:rPr>
+              <w:rFonts w:ascii="Cambria Math" w:hAnsi="Cambria Math" w:cs="Arial"/>
+            </w:rPr>
+            <m:t> </m:t>
+          </m:r>
+          <m:r>
+            <w:rPr>
+              <w:rFonts w:ascii="Cambria Math" w:hAnsi="Cambria Math" w:cs="Arial"/>
+            </w:rPr>
+            <m:t>1≤k≤</m:t>
+          </m:r>
+          <m:sSub>
+            <m:sSubPr>
+              <m:ctrlPr>
+                <w:rPr>
+                  <w:rFonts w:ascii="Cambria Math" w:hAnsi="Cambria Math" w:cs="Arial"/>
+                </w:rPr>
+              </m:ctrlPr>
+            </m:sSubPr>
+            <m:e>
+              <m:r>
+                <w:rPr>
+                  <w:rFonts w:ascii="Cambria Math" w:hAnsi="Cambria Math" w:cs="Arial"/>
+                </w:rPr>
+                <m:t>w</m:t>
+              </m:r>
+            </m:e>
+            <m:sub>
+              <m:r>
+                <w:rPr>
+                  <w:rFonts w:ascii="Cambria Math" w:hAnsi="Cambria Math" w:cs="Arial"/>
+                </w:rPr>
+                <m:t>i</m:t>
+              </m:r>
+            </m:sub>
+          </m:sSub>
+          <m:r>
+            <w:rPr>
+              <w:rFonts w:ascii="Cambria Math" w:hAnsi="Cambria Math" w:cs="Arial"/>
+            </w:rPr>
+            <m:t>}</m:t>
+          </m:r>
+          <m:r>
+            <w:rPr>
+              <w:rFonts w:ascii="Arial" w:hAnsi="Arial" w:cs="Arial"/>
+              <w:i/>
+            </w:rPr>
+            <w:br/>
+          </m:r>
+        </m:oMath>
+      </m:oMathPara>
+    </w:p>
+    <w:p>
+      <w:pPr>
+        <w:ind w:left="708"/>
+        <w:jc w:val="both"/>
+        <w:rPr>
+          <w:rFonts w:ascii="Arial" w:hAnsi="Arial" w:cs="Arial"/>
+        </w:rPr>
+      </w:pPr>
+      <w:r>
+        <w:rPr>
+          <w:rFonts w:ascii="Arial" w:hAnsi="Arial" w:cs="Arial"/>
+        </w:rPr>
+        <w:t xml:space="preserve">donde </w:t>
+      </w:r>
+      <m:oMath>
+        <m:sSub>
+          <m:sSubPr>
+            <m:ctrlPr>
+              <w:rPr>
+                <w:rFonts w:ascii="Cambria Math" w:hAnsi="Cambria Math" w:cs="Arial"/>
+              </w:rPr>
+            </m:ctrlPr>
+          </m:sSubPr>
+          <m:e>
+            <m:r>
+              <w:rPr>
+                <w:rFonts w:ascii="Cambria Math" w:hAnsi="Cambria Math" w:cs="Arial"/>
+              </w:rPr>
+              <m:t>u</m:t>
+            </m:r>
+          </m:e>
+          <m:sub>
+            <m:r>
+              <w:rPr>
+                <w:rFonts w:ascii="Cambria Math" w:hAnsi="Cambria Math" w:cs="Arial"/>
+              </w:rPr>
+              <m:t>i,k</m:t>
+            </m:r>
+          </m:sub>
+        </m:sSub>
+      </m:oMath>
+      <w:r>
+        <w:rPr>
+          <w:rFonts w:ascii="Arial" w:hAnsi="Arial" w:cs="Arial"/>
+        </w:rPr>
+        <w:t xml:space="preserve"> representa la unidad </w:t>
+      </w:r>
+      <m:oMath>
+        <m:r>
+          <w:rPr>
+            <w:rFonts w:ascii="Cambria Math" w:hAnsi="Cambria Math" w:cs="Arial"/>
+          </w:rPr>
+          <m:t>k</m:t>
+        </m:r>
+      </m:oMath>
+      <w:r>
+        <w:rPr>
+          <w:rFonts w:ascii="Arial" w:hAnsi="Arial" w:cs="Arial"/>
+        </w:rPr>
+        <w:t xml:space="preserve"> del artículo </w:t>
+      </w:r>
+      <m:oMath>
+        <m:r>
+          <w:rPr>
+            <w:rFonts w:ascii="Cambria Math" w:hAnsi="Cambria Math" w:cs="Arial"/>
+          </w:rPr>
+          <m:t>i</m:t>
+        </m:r>
+      </m:oMath>
+      <w:r>
+        <w:rPr>
+          <w:rFonts w:ascii="Arial" w:hAnsi="Arial" w:cs="Arial"/>
+        </w:rPr>
+        <w:t>.</w:t>
+      </w:r>
+    </w:p>
+    <w:p>
+      <w:pPr>
+        <w:ind w:left="708"/>
+        <w:jc w:val="both"/>
+        <w:rPr>
+          <w:rFonts w:ascii="Arial" w:hAnsi="Arial" w:cs="Arial"/>
+        </w:rPr>
+      </w:pPr>
+      <w:r>
+        <w:rPr>
+          <w:rFonts w:ascii="Arial" w:hAnsi="Arial" w:cs="Arial"/>
+        </w:rPr>
+        <w:t>Definimos la familia de independientes:</w:t>
+      </w:r>
+    </w:p>
+    <w:p>
+      <w:pPr>
+        <w:ind w:left="708"/>
+        <w:jc w:val="both"/>
+        <w:rPr>
+          <w:rFonts w:ascii="Arial" w:hAnsi="Arial" w:cs="Arial"/>
+        </w:rPr>
+      </w:pPr>
+      <m:oMathPara>
+        <m:oMath>
+          <m:r>
+            <w:rPr>
+              <w:rFonts w:ascii="Cambria Math" w:hAnsi="Cambria Math" w:cs="Arial"/>
+            </w:rPr>
+            <m:t>I={A⊆S:</m:t>
+          </m:r>
+          <m:r>
+            <m:rPr>
+              <m:sty m:val="p"/>
+            </m:rPr>
+            <w:rPr>
+              <w:rFonts w:ascii="Cambria Math" w:hAnsi="Cambria Math" w:cs="Arial"/>
+            </w:rPr>
+            <m:t>∣</m:t>
+          </m:r>
+          <m:r>
+            <w:rPr>
+              <w:rFonts w:ascii="Cambria Math" w:hAnsi="Cambria Math" w:cs="Arial"/>
+            </w:rPr>
+            <m:t>A</m:t>
+          </m:r>
+          <m:r>
+            <m:rPr>
+              <m:sty m:val="p"/>
+            </m:rPr>
+            <w:rPr>
+              <w:rFonts w:ascii="Cambria Math" w:hAnsi="Cambria Math" w:cs="Arial"/>
+            </w:rPr>
+            <m:t>∣</m:t>
+          </m:r>
+          <m:r>
+            <w:rPr>
+              <w:rFonts w:ascii="Cambria Math" w:hAnsi="Cambria Math" w:cs="Arial"/>
+            </w:rPr>
+            <m:t>≤W}</m:t>
+          </m:r>
+          <m:r>
+            <w:rPr>
+              <w:rFonts w:ascii="Arial" w:hAnsi="Arial" w:cs="Arial"/>
+              <w:i/>
+            </w:rPr>
+            <w:br/>
+          </m:r>
+        </m:oMath>
+      </m:oMathPara>
+    </w:p>
+    <w:p>
+      <w:pPr>
+        <w:ind w:left="708"/>
+        <w:jc w:val="both"/>
+        <w:rPr>
+          <w:rFonts w:ascii="Arial" w:hAnsi="Arial" w:cs="Arial"/>
+        </w:rPr>
+      </w:pPr>
+      <w:r>
+        <w:rPr>
+          <w:rFonts w:ascii="Arial" w:hAnsi="Arial" w:cs="Arial"/>
+        </w:rPr>
+        <w:t>U</w:t>
+      </w:r>
+      <w:r>
+        <w:rPr>
+          <w:rFonts w:ascii="Arial" w:hAnsi="Arial" w:cs="Arial"/>
+        </w:rPr>
+        <w:t>n subconjunto de unidades es independiente si no excede la capacidad de la mochila.</w:t>
+      </w:r>
+    </w:p>
+    <w:p>
+      <w:pPr>
+        <w:ind w:left="708"/>
+        <w:jc w:val="both"/>
+        <w:rPr>
+          <w:rFonts w:ascii="Arial" w:hAnsi="Arial" w:cs="Arial"/>
+        </w:rPr>
+      </w:pPr>
+      <w:r>
+        <w:rPr>
+          <w:rFonts w:ascii="Arial" w:hAnsi="Arial" w:cs="Arial"/>
+        </w:rPr>
+        <w:t>Herencia</w:t>
+      </w:r>
+      <w:r>
+        <w:rPr>
+          <w:rFonts w:ascii="Arial" w:hAnsi="Arial" w:cs="Arial"/>
+        </w:rPr>
+        <w:t>:</w:t>
+      </w:r>
+      <w:r>
+        <w:rPr>
+          <w:rFonts w:ascii="Arial" w:hAnsi="Arial" w:cs="Arial"/>
+        </w:rPr>
+        <w:br/>
+        <w:t>Si:</w:t>
+      </w:r>
+    </w:p>
+    <w:p>
+      <w:pPr>
+        <w:ind w:left="708"/>
+        <w:jc w:val="both"/>
+        <w:rPr>
+          <w:rFonts w:ascii="Arial" w:hAnsi="Arial" w:cs="Arial"/>
+        </w:rPr>
+      </w:pPr>
+      <m:oMathPara>
+        <m:oMath>
+          <m:r>
+            <w:rPr>
+              <w:rFonts w:ascii="Cambria Math" w:hAnsi="Cambria Math" w:cs="Arial"/>
+            </w:rPr>
+            <m:t>A∈I</m:t>
+          </m:r>
+          <m:r>
+            <w:rPr>
+              <w:rFonts w:ascii="Arial" w:hAnsi="Arial" w:cs="Arial"/>
+              <w:i/>
+            </w:rPr>
+            <w:br/>
+          </m:r>
+        </m:oMath>
+      </m:oMathPara>
+    </w:p>
+    <w:p>
+      <w:pPr>
+        <w:ind w:left="708"/>
+        <w:jc w:val="both"/>
+        <w:rPr>
+          <w:rFonts w:ascii="Arial" w:hAnsi="Arial" w:cs="Arial"/>
+        </w:rPr>
+      </w:pPr>
+      <w:r>
+        <w:rPr>
+          <w:rFonts w:ascii="Arial" w:hAnsi="Arial" w:cs="Arial"/>
+        </w:rPr>
+        <w:t>entonces:</w:t>
+      </w:r>
+    </w:p>
+    <w:p>
+      <w:pPr>
+        <w:ind w:left="708"/>
+        <w:jc w:val="both"/>
+        <w:rPr>
+          <w:rFonts w:ascii="Arial" w:hAnsi="Arial" w:cs="Arial"/>
+        </w:rPr>
+      </w:pPr>
+      <m:oMathPara>
+        <m:oMath>
+          <m:r>
+            <m:rPr>
+              <m:sty m:val="p"/>
+            </m:rPr>
+            <w:rPr>
+              <w:rFonts w:ascii="Cambria Math" w:hAnsi="Cambria Math" w:cs="Arial"/>
+            </w:rPr>
+            <m:t>∣</m:t>
+          </m:r>
+          <m:r>
+            <w:rPr>
+              <w:rFonts w:ascii="Cambria Math" w:hAnsi="Cambria Math" w:cs="Arial"/>
+            </w:rPr>
+            <m:t>A</m:t>
+          </m:r>
+          <m:r>
+            <m:rPr>
+              <m:sty m:val="p"/>
+            </m:rPr>
+            <w:rPr>
+              <w:rFonts w:ascii="Cambria Math" w:hAnsi="Cambria Math" w:cs="Arial"/>
+            </w:rPr>
+            <m:t>∣</m:t>
+          </m:r>
+          <m:r>
+            <w:rPr>
+              <w:rFonts w:ascii="Cambria Math" w:hAnsi="Cambria Math" w:cs="Arial"/>
+            </w:rPr>
+            <m:t>≤W</m:t>
+          </m:r>
+          <m:r>
+            <w:rPr>
+              <w:rFonts w:ascii="Arial" w:hAnsi="Arial" w:cs="Arial"/>
+              <w:i/>
+            </w:rPr>
+            <w:br/>
+          </m:r>
+        </m:oMath>
+      </m:oMathPara>
+    </w:p>
+    <w:p>
+      <w:pPr>
+        <w:ind w:left="708"/>
+        <w:jc w:val="both"/>
+        <w:rPr>
+          <w:rFonts w:ascii="Arial" w:hAnsi="Arial" w:cs="Arial"/>
+        </w:rPr>
+      </w:pPr>
+      <w:r>
+        <w:rPr>
+          <w:rFonts w:ascii="Arial" w:hAnsi="Arial" w:cs="Arial"/>
+        </w:rPr>
+        <w:t xml:space="preserve">Si B </w:t>
+      </w:r>
+      <w:r>
+        <w:rPr>
+          <w:rFonts w:ascii="Cambria Math" w:hAnsi="Cambria Math" w:cs="Cambria Math"/>
+        </w:rPr>
+        <w:t>⊆</w:t>
+      </w:r>
+      <w:r>
+        <w:rPr>
+          <w:rFonts w:ascii="Arial" w:hAnsi="Arial" w:cs="Arial"/>
+        </w:rPr>
+        <w:t xml:space="preserve"> A, entonces:</w:t>
+      </w:r>
+    </w:p>
+    <w:p>
+      <w:pPr>
+        <w:ind w:left="708"/>
+        <w:jc w:val="both"/>
+        <w:rPr>
+          <w:rFonts w:ascii="Arial" w:hAnsi="Arial" w:cs="Arial"/>
+        </w:rPr>
+      </w:pPr>
+      <m:oMathPara>
+        <m:oMath>
+          <m:r>
+            <m:rPr>
+              <m:sty m:val="p"/>
+            </m:rPr>
+            <w:rPr>
+              <w:rFonts w:ascii="Cambria Math" w:hAnsi="Cambria Math" w:cs="Arial"/>
+            </w:rPr>
+            <m:t>∣</m:t>
+          </m:r>
+          <m:r>
+            <w:rPr>
+              <w:rFonts w:ascii="Cambria Math" w:hAnsi="Cambria Math" w:cs="Arial"/>
+            </w:rPr>
+            <m:t>B</m:t>
+          </m:r>
+          <m:r>
+            <m:rPr>
+              <m:sty m:val="p"/>
+            </m:rPr>
+            <w:rPr>
+              <w:rFonts w:ascii="Cambria Math" w:hAnsi="Cambria Math" w:cs="Arial"/>
+            </w:rPr>
+            <m:t>∣</m:t>
+          </m:r>
+          <m:r>
+            <w:rPr>
+              <w:rFonts w:ascii="Cambria Math" w:hAnsi="Cambria Math" w:cs="Arial"/>
+            </w:rPr>
+            <m:t>≤</m:t>
+          </m:r>
+          <m:r>
+            <m:rPr>
+              <m:sty m:val="p"/>
+            </m:rPr>
+            <w:rPr>
+              <w:rFonts w:ascii="Cambria Math" w:hAnsi="Cambria Math" w:cs="Arial"/>
+            </w:rPr>
+            <m:t>∣</m:t>
+          </m:r>
+          <m:r>
+            <w:rPr>
+              <w:rFonts w:ascii="Cambria Math" w:hAnsi="Cambria Math" w:cs="Arial"/>
+            </w:rPr>
+            <m:t>A</m:t>
+          </m:r>
+          <m:r>
+            <m:rPr>
+              <m:sty m:val="p"/>
+            </m:rPr>
+            <w:rPr>
+              <w:rFonts w:ascii="Cambria Math" w:hAnsi="Cambria Math" w:cs="Arial"/>
+            </w:rPr>
+            <m:t>∣</m:t>
+          </m:r>
+          <m:r>
+            <w:rPr>
+              <w:rFonts w:ascii="Cambria Math" w:hAnsi="Cambria Math" w:cs="Arial"/>
+            </w:rPr>
+            <m:t>≤W</m:t>
+          </m:r>
+          <m:r>
+            <w:rPr>
+              <w:rFonts w:ascii="Arial" w:hAnsi="Arial" w:cs="Arial"/>
+              <w:i/>
+            </w:rPr>
+            <w:br/>
+          </m:r>
+        </m:oMath>
+      </m:oMathPara>
+    </w:p>
+    <w:p>
+      <w:pPr>
+        <w:ind w:left="708"/>
+        <w:jc w:val="both"/>
+        <w:rPr>
+          <w:rFonts w:ascii="Arial" w:hAnsi="Arial" w:cs="Arial"/>
+        </w:rPr>
+      </w:pPr>
+      <w:r>
+        <w:rPr>
+          <w:rFonts w:ascii="Arial" w:hAnsi="Arial" w:cs="Arial"/>
+        </w:rPr>
+        <w:t>Por tanto:</w:t>
+      </w:r>
+    </w:p>
+    <w:p>
+      <w:pPr>
+        <w:ind w:left="708"/>
+        <w:jc w:val="both"/>
+        <w:rPr>
+          <w:rFonts w:ascii="Arial" w:hAnsi="Arial" w:cs="Arial"/>
+        </w:rPr>
+      </w:pPr>
+      <m:oMathPara>
+        <m:oMath>
+          <m:r>
+            <w:rPr>
+              <w:rFonts w:ascii="Cambria Math" w:hAnsi="Cambria Math" w:cs="Arial"/>
+            </w:rPr>
+            <m:t>B∈I</m:t>
+          </m:r>
+          <m:r>
+            <w:rPr>
+              <w:rFonts w:ascii="Arial" w:hAnsi="Arial" w:cs="Arial"/>
+              <w:i/>
+            </w:rPr>
+            <w:br/>
+          </m:r>
+        </m:oMath>
+      </m:oMathPara>
+    </w:p>
+    <w:p>
+      <w:pPr>
+        <w:ind w:left="708"/>
+        <w:jc w:val="both"/>
+        <w:rPr>
+          <w:rFonts w:ascii="Arial" w:hAnsi="Arial" w:cs="Arial"/>
+        </w:rPr>
+      </w:pPr>
+      <w:r>
+        <w:rPr>
+          <w:rFonts w:ascii="Arial" w:hAnsi="Arial" w:cs="Arial"/>
+        </w:rPr>
+        <w:t>Se cumple</w:t>
+      </w:r>
+      <w:r>
+        <w:rPr>
+          <w:rFonts w:ascii="Arial" w:hAnsi="Arial" w:cs="Arial"/>
+        </w:rPr>
+        <w:t xml:space="preserve"> la</w:t>
+      </w:r>
+      <w:r>
+        <w:rPr>
+          <w:rFonts w:ascii="Arial" w:hAnsi="Arial" w:cs="Arial"/>
+        </w:rPr>
+        <w:t xml:space="preserve"> herencia.</w:t>
+      </w:r>
+    </w:p>
+    <w:p>
+      <w:pPr>
+        <w:ind w:left="708"/>
+        <w:jc w:val="both"/>
+        <w:rPr>
+          <w:rFonts w:ascii="Arial" w:hAnsi="Arial" w:cs="Arial"/>
+        </w:rPr>
+      </w:pPr>
+      <w:r>
+        <w:rPr>
+          <w:rFonts w:ascii="Arial" w:hAnsi="Arial" w:cs="Arial"/>
+        </w:rPr>
+        <w:t>Intercambio</w:t>
+      </w:r>
+      <w:r>
+        <w:rPr>
+          <w:rFonts w:ascii="Arial" w:hAnsi="Arial" w:cs="Arial"/>
+        </w:rPr>
+        <w:t>:</w:t>
+      </w:r>
+      <w:r>
+        <w:rPr>
+          <w:rFonts w:ascii="Arial" w:hAnsi="Arial" w:cs="Arial"/>
+        </w:rPr>
+        <w:br/>
+        <w:t xml:space="preserve">Sean A, B </w:t>
+      </w:r>
+      <w:r>
+        <w:rPr>
+          <w:rFonts w:ascii="Cambria Math" w:hAnsi="Cambria Math" w:cs="Cambria Math"/>
+        </w:rPr>
+        <w:t>∈</w:t>
+      </w:r>
+      <w:r>
+        <w:rPr>
+          <w:rFonts w:ascii="Arial" w:hAnsi="Arial" w:cs="Arial"/>
+        </w:rPr>
+        <w:t xml:space="preserve"> I y supongamos que:</w:t>
+      </w:r>
+    </w:p>
+    <w:p>
+      <w:pPr>
+        <w:ind w:left="708"/>
+        <w:jc w:val="both"/>
+        <w:rPr>
+          <w:rFonts w:ascii="Arial" w:hAnsi="Arial" w:cs="Arial"/>
+        </w:rPr>
+      </w:pPr>
+      <m:oMathPara>
+        <m:oMath>
+          <m:r>
+            <m:rPr>
+              <m:sty m:val="p"/>
+            </m:rPr>
+            <w:rPr>
+              <w:rFonts w:ascii="Cambria Math" w:hAnsi="Cambria Math" w:cs="Arial"/>
+            </w:rPr>
+            <m:t>∣</m:t>
+          </m:r>
+          <m:r>
+            <w:rPr>
+              <w:rFonts w:ascii="Cambria Math" w:hAnsi="Cambria Math" w:cs="Arial"/>
+            </w:rPr>
+            <m:t>B</m:t>
+          </m:r>
+          <m:r>
+            <m:rPr>
+              <m:sty m:val="p"/>
+            </m:rPr>
+            <w:rPr>
+              <w:rFonts w:ascii="Cambria Math" w:hAnsi="Cambria Math" w:cs="Arial"/>
+            </w:rPr>
+            <m:t>∣</m:t>
+          </m:r>
+          <m:r>
+            <w:rPr>
+              <w:rFonts w:ascii="Cambria Math" w:hAnsi="Cambria Math" w:cs="Arial"/>
+            </w:rPr>
+            <m:t>&gt;</m:t>
+          </m:r>
+          <m:r>
+            <m:rPr>
+              <m:sty m:val="p"/>
+            </m:rPr>
+            <w:rPr>
+              <w:rFonts w:ascii="Cambria Math" w:hAnsi="Cambria Math" w:cs="Arial"/>
+            </w:rPr>
+            <m:t>∣</m:t>
+          </m:r>
+          <m:r>
+            <w:rPr>
+              <w:rFonts w:ascii="Cambria Math" w:hAnsi="Cambria Math" w:cs="Arial"/>
+            </w:rPr>
+            <m:t>A</m:t>
+          </m:r>
+          <m:r>
+            <m:rPr>
+              <m:sty m:val="p"/>
+            </m:rPr>
+            <w:rPr>
+              <w:rFonts w:ascii="Cambria Math" w:hAnsi="Cambria Math" w:cs="Arial"/>
+            </w:rPr>
+            <m:t>∣</m:t>
+          </m:r>
+          <m:r>
+            <w:rPr>
+              <w:rFonts w:ascii="Arial" w:hAnsi="Arial" w:cs="Arial"/>
+            </w:rPr>
+            <w:br/>
+          </m:r>
+        </m:oMath>
+      </m:oMathPara>
+    </w:p>
+    <w:p>
+      <w:pPr>
+        <w:ind w:left="708"/>
+        <w:jc w:val="both"/>
+        <w:rPr>
+          <w:rFonts w:ascii="Arial" w:hAnsi="Arial" w:cs="Arial"/>
+        </w:rPr>
+      </w:pPr>
+      <w:r>
+        <w:rPr>
+          <w:rFonts w:ascii="Arial" w:hAnsi="Arial" w:cs="Arial"/>
+        </w:rPr>
+        <w:t>Como B tiene más elementos que A, existe al menos un elemento:</w:t>
+      </w:r>
+    </w:p>
+    <w:p>
+      <w:pPr>
+        <w:ind w:left="708"/>
+        <w:jc w:val="both"/>
+        <w:rPr>
+          <w:rFonts w:ascii="Arial" w:hAnsi="Arial" w:cs="Arial"/>
+        </w:rPr>
+      </w:pPr>
+      <m:oMathPara>
+        <m:oMath>
+          <m:r>
+            <w:rPr>
+              <w:rFonts w:ascii="Cambria Math" w:hAnsi="Cambria Math" w:cs="Arial"/>
+            </w:rPr>
+            <m:t>x∈B-A</m:t>
+          </m:r>
+          <m:r>
+            <w:rPr>
+              <w:rFonts w:ascii="Arial" w:hAnsi="Arial" w:cs="Arial"/>
+              <w:i/>
+            </w:rPr>
+            <w:br/>
+          </m:r>
+        </m:oMath>
+      </m:oMathPara>
+    </w:p>
+    <w:p>
+      <w:pPr>
+        <w:ind w:left="708"/>
+        <w:jc w:val="both"/>
+        <w:rPr>
+          <w:rFonts w:ascii="Arial" w:hAnsi="Arial" w:cs="Arial"/>
+        </w:rPr>
+      </w:pPr>
+      <w:r>
+        <w:rPr>
+          <w:rFonts w:ascii="Arial" w:hAnsi="Arial" w:cs="Arial"/>
+        </w:rPr>
+        <w:t>Además:</w:t>
+      </w:r>
+    </w:p>
+    <w:p>
+      <w:pPr>
+        <w:ind w:left="708"/>
+        <w:jc w:val="both"/>
+        <w:rPr>
+          <w:rFonts w:ascii="Arial" w:hAnsi="Arial" w:cs="Arial"/>
+        </w:rPr>
+      </w:pPr>
+      <m:oMathPara>
+        <m:oMath>
+          <m:r>
+            <m:rPr>
+              <m:sty m:val="p"/>
+            </m:rPr>
+            <w:rPr>
+              <w:rFonts w:ascii="Cambria Math" w:hAnsi="Cambria Math" w:cs="Arial"/>
+            </w:rPr>
+            <w:lastRenderedPageBreak/>
+            <m:t>∣</m:t>
+          </m:r>
+          <m:r>
+            <w:rPr>
+              <w:rFonts w:ascii="Cambria Math" w:hAnsi="Cambria Math" w:cs="Arial"/>
+            </w:rPr>
+            <m:t>A</m:t>
+          </m:r>
+          <m:r>
+            <m:rPr>
+              <m:sty m:val="p"/>
+            </m:rPr>
+            <w:rPr>
+              <w:rFonts w:ascii="Cambria Math" w:hAnsi="Cambria Math" w:cs="Arial"/>
+            </w:rPr>
+            <m:t>∣</m:t>
+          </m:r>
+          <m:r>
+            <w:rPr>
+              <w:rFonts w:ascii="Cambria Math" w:hAnsi="Cambria Math" w:cs="Arial"/>
+            </w:rPr>
+            <m:t>+1≤</m:t>
+          </m:r>
+          <m:r>
+            <m:rPr>
+              <m:sty m:val="p"/>
+            </m:rPr>
+            <w:rPr>
+              <w:rFonts w:ascii="Cambria Math" w:hAnsi="Cambria Math" w:cs="Arial"/>
+            </w:rPr>
+            <m:t>∣</m:t>
+          </m:r>
+          <m:r>
+            <w:rPr>
+              <w:rFonts w:ascii="Cambria Math" w:hAnsi="Cambria Math" w:cs="Arial"/>
+            </w:rPr>
+            <m:t>B</m:t>
+          </m:r>
+          <m:r>
+            <m:rPr>
+              <m:sty m:val="p"/>
+            </m:rPr>
+            <w:rPr>
+              <w:rFonts w:ascii="Cambria Math" w:hAnsi="Cambria Math" w:cs="Arial"/>
+            </w:rPr>
+            <m:t>∣</m:t>
+          </m:r>
+          <m:r>
+            <w:rPr>
+              <w:rFonts w:ascii="Cambria Math" w:hAnsi="Cambria Math" w:cs="Arial"/>
+            </w:rPr>
+            <m:t>≤W</m:t>
+          </m:r>
+          <m:r>
+            <w:rPr>
+              <w:rFonts w:ascii="Arial" w:hAnsi="Arial" w:cs="Arial"/>
+              <w:i/>
+            </w:rPr>
+            <w:br/>
+          </m:r>
+        </m:oMath>
+      </m:oMathPara>
+    </w:p>
+    <w:p>
+      <w:pPr>
+        <w:ind w:left="708"/>
+        <w:jc w:val="both"/>
+        <w:rPr>
+          <w:rFonts w:ascii="Arial" w:hAnsi="Arial" w:cs="Arial"/>
+        </w:rPr>
+      </w:pPr>
+      <w:r>
+        <w:rPr>
+          <w:rFonts w:ascii="Arial" w:hAnsi="Arial" w:cs="Arial"/>
+        </w:rPr>
+        <w:t>Entonces:</w:t>
+      </w:r>
+    </w:p>
+    <w:p>
+      <w:pPr>
+        <w:ind w:left="708"/>
+        <w:jc w:val="both"/>
+        <w:rPr>
+          <w:rFonts w:ascii="Arial" w:hAnsi="Arial" w:cs="Arial"/>
+        </w:rPr>
+      </w:pPr>
+      <m:oMathPara>
+        <m:oMath>
+          <m:r>
+            <w:rPr>
+              <w:rFonts w:ascii="Cambria Math" w:hAnsi="Cambria Math" w:cs="Arial"/>
+            </w:rPr>
+            <m:t>A∪{x}∈I</m:t>
+          </m:r>
+          <m:r>
+            <w:rPr>
+              <w:rFonts w:ascii="Arial" w:hAnsi="Arial" w:cs="Arial"/>
+              <w:i/>
+            </w:rPr>
+            <w:br/>
+          </m:r>
+        </m:oMath>
+      </m:oMathPara>
+    </w:p>
+    <w:p>
+      <w:pPr>
+        <w:ind w:left="708"/>
+        <w:jc w:val="both"/>
+        <w:rPr>
+          <w:rFonts w:ascii="Arial" w:hAnsi="Arial" w:cs="Arial"/>
+        </w:rPr>
+      </w:pPr>
+      <w:r>
+        <w:rPr>
+          <w:rFonts w:ascii="Arial" w:hAnsi="Arial" w:cs="Arial"/>
+        </w:rPr>
+        <w:t xml:space="preserve">Se cumple </w:t>
+      </w:r>
+      <w:r>
+        <w:rPr>
+          <w:rFonts w:ascii="Arial" w:hAnsi="Arial" w:cs="Arial"/>
+        </w:rPr>
+        <w:t xml:space="preserve">el </w:t>
+      </w:r>
+      <w:r>
+        <w:rPr>
+          <w:rFonts w:ascii="Arial" w:hAnsi="Arial" w:cs="Arial"/>
+        </w:rPr>
+        <w:t>intercambio.</w:t>
+      </w:r>
+    </w:p>
+    <w:p>
+      <w:pPr>
+        <w:ind w:left="708"/>
+        <w:jc w:val="both"/>
+        <w:rPr>
+          <w:rFonts w:ascii="Arial" w:hAnsi="Arial" w:cs="Arial"/>
+        </w:rPr>
+      </w:pPr>
+      <w:r>
+        <w:rPr>
+          <w:rFonts w:ascii="Arial" w:hAnsi="Arial" w:cs="Arial"/>
+        </w:rPr>
+        <w:br/>
+        <w:t xml:space="preserve">A cada unidad </w:t>
+      </w:r>
+      <m:oMath>
+        <m:sSub>
+          <m:sSubPr>
+            <m:ctrlPr>
+              <w:rPr>
+                <w:rFonts w:ascii="Cambria Math" w:hAnsi="Cambria Math" w:cs="Arial"/>
+              </w:rPr>
+            </m:ctrlPr>
+          </m:sSubPr>
+          <m:e>
+            <m:r>
+              <w:rPr>
+                <w:rFonts w:ascii="Cambria Math" w:hAnsi="Cambria Math" w:cs="Arial"/>
+              </w:rPr>
+              <m:t>u</m:t>
+            </m:r>
+          </m:e>
+          <m:sub>
+            <m:r>
+              <w:rPr>
+                <w:rFonts w:ascii="Cambria Math" w:hAnsi="Cambria Math" w:cs="Arial"/>
+              </w:rPr>
+              <m:t>i,k</m:t>
+            </m:r>
+          </m:sub>
+        </m:sSub>
+      </m:oMath>
+      <w:r>
+        <w:rPr>
+          <w:rFonts w:ascii="Arial" w:eastAsiaTheme="minorEastAsia" w:hAnsi="Arial" w:cs="Arial"/>
+        </w:rPr>
+        <w:t xml:space="preserve"> </w:t>
+      </w:r>
+      <w:r>
+        <w:rPr>
+          <w:rFonts w:ascii="Arial" w:hAnsi="Arial" w:cs="Arial"/>
+        </w:rPr>
+        <w:t>le asignamos el peso:</w:t>
+      </w:r>
+    </w:p>
+    <w:p>
+      <w:pPr>
+        <w:ind w:left="708"/>
+        <w:jc w:val="both"/>
+        <w:rPr>
+          <w:rFonts w:ascii="Arial" w:hAnsi="Arial" w:cs="Arial"/>
+        </w:rPr>
+      </w:pPr>
+      <m:oMathPara>
+        <m:oMath>
+          <m:r>
+            <w:rPr>
+              <w:rFonts w:ascii="Cambria Math" w:hAnsi="Cambria Math" w:cs="Arial"/>
+            </w:rPr>
+            <m:t>w(</m:t>
+          </m:r>
+          <m:sSub>
+            <m:sSubPr>
+              <m:ctrlPr>
+                <w:rPr>
+                  <w:rFonts w:ascii="Cambria Math" w:hAnsi="Cambria Math" w:cs="Arial"/>
+                </w:rPr>
+              </m:ctrlPr>
+            </m:sSubPr>
+            <m:e>
+              <m:r>
+                <w:rPr>
+                  <w:rFonts w:ascii="Cambria Math" w:hAnsi="Cambria Math" w:cs="Arial"/>
+                </w:rPr>
+                <m:t>u</m:t>
+              </m:r>
+            </m:e>
+            <m:sub>
+              <m:r>
+                <w:rPr>
+                  <w:rFonts w:ascii="Cambria Math" w:hAnsi="Cambria Math" w:cs="Arial"/>
+                </w:rPr>
+                <m:t>i,k</m:t>
+              </m:r>
+            </m:sub>
+          </m:sSub>
+          <m:r>
+            <w:rPr>
+              <w:rFonts w:ascii="Cambria Math" w:hAnsi="Cambria Math" w:cs="Arial"/>
+            </w:rPr>
+            <m:t>)=</m:t>
+          </m:r>
+          <m:f>
+            <m:fPr>
+              <m:ctrlPr>
+                <w:rPr>
+                  <w:rFonts w:ascii="Cambria Math" w:hAnsi="Cambria Math" w:cs="Arial"/>
+                </w:rPr>
+              </m:ctrlPr>
+            </m:fPr>
+            <m:num>
+              <m:sSub>
+                <m:sSubPr>
+                  <m:ctrlPr>
+                    <w:rPr>
+                      <w:rFonts w:ascii="Cambria Math" w:hAnsi="Cambria Math" w:cs="Arial"/>
+                    </w:rPr>
+                  </m:ctrlPr>
+                </m:sSubPr>
+                <m:e>
+                  <m:r>
+                    <w:rPr>
+                      <w:rFonts w:ascii="Cambria Math" w:hAnsi="Cambria Math" w:cs="Arial"/>
+                    </w:rPr>
+                    <m:t>p</m:t>
+                  </m:r>
+                </m:e>
+                <m:sub>
+                  <m:r>
+                    <w:rPr>
+                      <w:rFonts w:ascii="Cambria Math" w:hAnsi="Cambria Math" w:cs="Arial"/>
+                    </w:rPr>
+                    <m:t>i</m:t>
+                  </m:r>
+                </m:sub>
+              </m:sSub>
+            </m:num>
+            <m:den>
+              <m:sSub>
+                <m:sSubPr>
+                  <m:ctrlPr>
+                    <w:rPr>
+                      <w:rFonts w:ascii="Cambria Math" w:hAnsi="Cambria Math" w:cs="Arial"/>
+                    </w:rPr>
+                  </m:ctrlPr>
+                </m:sSubPr>
+                <m:e>
+                  <m:r>
+                    <w:rPr>
+                      <w:rFonts w:ascii="Cambria Math" w:hAnsi="Cambria Math" w:cs="Arial"/>
+                    </w:rPr>
+                    <m:t>w</m:t>
+                  </m:r>
+                </m:e>
+                <m:sub>
+                  <m:r>
+                    <w:rPr>
+                      <w:rFonts w:ascii="Cambria Math" w:hAnsi="Cambria Math" w:cs="Arial"/>
+                    </w:rPr>
+                    <m:t>i</m:t>
+                  </m:r>
+                </m:sub>
+              </m:sSub>
+            </m:den>
+          </m:f>
+          <m:r>
+            <w:rPr>
+              <w:rFonts w:ascii="Arial" w:hAnsi="Arial" w:cs="Arial"/>
+            </w:rPr>
+            <w:br/>
+          </m:r>
+        </m:oMath>
+      </m:oMathPara>
+    </w:p>
+    <w:p>
+      <w:pPr>
+        <w:ind w:left="708"/>
+        <w:jc w:val="both"/>
+        <w:rPr>
+          <w:rFonts w:ascii="Arial" w:hAnsi="Arial" w:cs="Arial"/>
+        </w:rPr>
+      </w:pPr>
+      <w:r>
+        <w:rPr>
+          <w:rFonts w:ascii="Arial" w:hAnsi="Arial" w:cs="Arial"/>
+        </w:rPr>
+        <w:t>Así</w:t>
+      </w:r>
+      <w:r>
+        <w:rPr>
+          <w:rFonts w:ascii="Arial" w:hAnsi="Arial" w:cs="Arial"/>
+        </w:rPr>
+        <w:t xml:space="preserve"> al</w:t>
+      </w:r>
+      <w:r>
+        <w:rPr>
+          <w:rFonts w:ascii="Arial" w:hAnsi="Arial" w:cs="Arial"/>
+        </w:rPr>
+        <w:t xml:space="preserve"> seleccionar unidades de mayor peso equivale a seleccionar primero las unidades con mayor valor por unidad. Por eso el problema se puede modelar como una </w:t>
+      </w:r>
+      <w:proofErr w:type="spellStart"/>
+      <w:r>
+        <w:rPr>
+          <w:rFonts w:ascii="Arial" w:hAnsi="Arial" w:cs="Arial"/>
+        </w:rPr>
+        <w:t>matroide</w:t>
+      </w:r>
+      <w:proofErr w:type="spellEnd"/>
+      <w:r>
+        <w:rPr>
+          <w:rFonts w:ascii="Arial" w:hAnsi="Arial" w:cs="Arial"/>
+        </w:rPr>
+        <w:t xml:space="preserve"> ponderad</w:t>
+      </w:r>
+      <w:r>
+        <w:rPr>
+          <w:rFonts w:ascii="Arial" w:hAnsi="Arial" w:cs="Arial"/>
+        </w:rPr>
+        <w:t>a</w:t>
+      </w:r>
+      <w:r>
+        <w:rPr>
+          <w:rFonts w:ascii="Arial" w:hAnsi="Arial" w:cs="Arial"/>
+        </w:rPr>
+        <w:t>.</w:t>
+      </w:r>
+    </w:p>
+    <w:p>
+      <w:pPr>
+        <w:ind w:left="708"/>
+        <w:jc w:val="both"/>
+        <w:rPr>
+          <w:rFonts w:ascii="Arial" w:hAnsi="Arial" w:cs="Arial"/>
+        </w:rPr>
+      </w:pPr>
+    </w:p>
+    <w:p>
+      <w:pPr>
+        <w:ind w:left="708"/>
+        <w:jc w:val="both"/>
+        <w:rPr>
+          <w:rFonts w:ascii="Arial" w:hAnsi="Arial" w:cs="Arial"/>
+        </w:rPr>
+      </w:pPr>
+      <w:r>
+        <w:rPr>
+          <w:rFonts w:ascii="Arial" w:hAnsi="Arial" w:cs="Arial"/>
+        </w:rPr>
+        <w:t>Pseudocódigo:</w:t>
+      </w:r>
+    </w:p>
+    <w:p>
+      <w:pPr>
+        <w:ind w:left="708"/>
+        <w:jc w:val="both"/>
+        <w:rPr>
+          <w:rFonts w:ascii="Arial" w:hAnsi="Arial" w:cs="Arial"/>
+        </w:rPr>
+      </w:pPr>
     </w:p>
     <w:p>
       <w:pPr>

</xml_diff>